<commit_message>
feat: redesign document workflow and harden artifact generation
</commit_message>
<xml_diff>
--- a/templates/wfi-pus-template.docx
+++ b/templates/wfi-pus-template.docx
@@ -1,6 +1,6 @@
 
 <file path=word/document.xml><?xml version="1.0" encoding="utf-8"?>
-<w:document xmlns:wpc="http://schemas.microsoft.com/office/word/2010/wordprocessingCanvas" xmlns:mc="http://schemas.openxmlformats.org/markup-compatibility/2006" xmlns:o="urn:schemas-microsoft-com:office:office" xmlns:r="http://schemas.openxmlformats.org/officeDocument/2006/relationships" xmlns:m="http://schemas.openxmlformats.org/officeDocument/2006/math" xmlns:v="urn:schemas-microsoft-com:vml" xmlns:wp14="http://schemas.microsoft.com/office/word/2010/wordprocessingDrawing" xmlns:wp="http://schemas.openxmlformats.org/drawingml/2006/wordprocessingDrawing" xmlns:w10="urn:schemas-microsoft-com:office:word" xmlns:w="http://schemas.openxmlformats.org/wordprocessingml/2006/main" xmlns:w14="http://schemas.microsoft.com/office/word/2010/wordml" xmlns:w15="http://schemas.microsoft.com/office/word/2012/wordml" xmlns:wpg="http://schemas.microsoft.com/office/word/2010/wordprocessingGroup" xmlns:wpi="http://schemas.microsoft.com/office/word/2010/wordprocessingInk" xmlns:wne="http://schemas.microsoft.com/office/word/2006/wordml" xmlns:wps="http://schemas.microsoft.com/office/word/2010/wordprocessingShape" mc:Ignorable="w14 w15 wp14">
+<w:document xmlns:wpc="http://schemas.microsoft.com/office/word/2010/wordprocessingCanvas" xmlns:cx="http://schemas.microsoft.com/office/drawing/2014/chartex" xmlns:cx1="http://schemas.microsoft.com/office/drawing/2015/9/8/chartex" xmlns:cx2="http://schemas.microsoft.com/office/drawing/2015/10/21/chartex" xmlns:cx3="http://schemas.microsoft.com/office/drawing/2016/5/9/chartex" xmlns:cx4="http://schemas.microsoft.com/office/drawing/2016/5/10/chartex" xmlns:cx5="http://schemas.microsoft.com/office/drawing/2016/5/11/chartex" xmlns:cx6="http://schemas.microsoft.com/office/drawing/2016/5/12/chartex" xmlns:cx7="http://schemas.microsoft.com/office/drawing/2016/5/13/chartex" xmlns:cx8="http://schemas.microsoft.com/office/drawing/2016/5/14/chartex" xmlns:mc="http://schemas.openxmlformats.org/markup-compatibility/2006" xmlns:aink="http://schemas.microsoft.com/office/drawing/2016/ink" xmlns:am3d="http://schemas.microsoft.com/office/drawing/2017/model3d" xmlns:o="urn:schemas-microsoft-com:office:office" xmlns:r="http://schemas.openxmlformats.org/officeDocument/2006/relationships" xmlns:m="http://schemas.openxmlformats.org/officeDocument/2006/math" xmlns:v="urn:schemas-microsoft-com:vml" xmlns:wp14="http://schemas.microsoft.com/office/word/2010/wordprocessingDrawing" xmlns:wp="http://schemas.openxmlformats.org/drawingml/2006/wordprocessingDrawing" xmlns:w10="urn:schemas-microsoft-com:office:word" xmlns:w="http://schemas.openxmlformats.org/wordprocessingml/2006/main" xmlns:w14="http://schemas.microsoft.com/office/word/2010/wordml" xmlns:w15="http://schemas.microsoft.com/office/word/2012/wordml" xmlns:w16cex="http://schemas.microsoft.com/office/word/2018/wordml/cex" xmlns:w16cid="http://schemas.microsoft.com/office/word/2016/wordml/cid" xmlns:w16="http://schemas.microsoft.com/office/word/2018/wordml" xmlns:w16sdtdh="http://schemas.microsoft.com/office/word/2020/wordml/sdtdatahash" xmlns:w16se="http://schemas.microsoft.com/office/word/2015/wordml/symex" xmlns:wpg="http://schemas.microsoft.com/office/word/2010/wordprocessingGroup" xmlns:wpi="http://schemas.microsoft.com/office/word/2010/wordprocessingInk" xmlns:wne="http://schemas.microsoft.com/office/word/2006/wordml" xmlns:wps="http://schemas.microsoft.com/office/word/2010/wordprocessingShape" mc:Ignorable="w14 w15 w16se w16cid w16 w16cex w16sdtdh wp14">
   <w:body>
     <w:p>
       <w:r>
@@ -118,7 +118,7 @@
                 <v:stroke joinstyle="miter"/>
                 <v:path gradientshapeok="t" o:connecttype="rect"/>
               </v:shapetype>
-              <v:shape id="Text Box 2" o:spid="_x0000_s1026" type="#_x0000_t202" style="position:absolute;margin-left:145.9pt;margin-top:787.4pt;width:92.05pt;height:27.8pt;z-index:251617280;visibility:visible;mso-wrap-style:square;mso-wrap-distance-left:9pt;mso-wrap-distance-top:0;mso-wrap-distance-right:9pt;mso-wrap-distance-bottom:0;mso-position-horizontal:absolute;mso-position-horizontal-relative:text;mso-position-vertical:absolute;mso-position-vertical-relative:text;v-text-anchor:top" o:gfxdata="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" filled="f" stroked="f">
+              <v:shape id="Text Box 2" o:spid="_x0000_s1026" type="#_x0000_t202" style="position:absolute;margin-left:145.9pt;margin-top:787.4pt;width:92.05pt;height:27.8pt;z-index:251617280;visibility:visible;mso-wrap-style:square;mso-wrap-distance-left:9pt;mso-wrap-distance-top:0;mso-wrap-distance-right:9pt;mso-wrap-distance-bottom:0;mso-position-horizontal:absolute;mso-position-horizontal-relative:text;mso-position-vertical:absolute;mso-position-vertical-relative:text;v-text-anchor:top" o:gfxdata="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" filled="f" stroked="f">
                 <v:textbox>
                   <w:txbxContent>
                     <w:p>
@@ -290,7 +290,7 @@
           </mc:Choice>
           <mc:Fallback>
             <w:pict>
-              <v:shape w14:anchorId="4864592A" id="_x0000_s1027" type="#_x0000_t202" style="position:absolute;margin-left:145.9pt;margin-top:767.15pt;width:92.05pt;height:27.8pt;z-index:251613184;visibility:visible;mso-wrap-style:square;mso-wrap-distance-left:9pt;mso-wrap-distance-top:0;mso-wrap-distance-right:9pt;mso-wrap-distance-bottom:0;mso-position-horizontal:absolute;mso-position-horizontal-relative:text;mso-position-vertical:absolute;mso-position-vertical-relative:text;v-text-anchor:top" o:gfxdata="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" filled="f" stroked="f">
+              <v:shape w14:anchorId="4864592A" id="_x0000_s1027" type="#_x0000_t202" style="position:absolute;margin-left:145.9pt;margin-top:767.15pt;width:92.05pt;height:27.8pt;z-index:251613184;visibility:visible;mso-wrap-style:square;mso-wrap-distance-left:9pt;mso-wrap-distance-top:0;mso-wrap-distance-right:9pt;mso-wrap-distance-bottom:0;mso-position-horizontal:absolute;mso-position-horizontal-relative:text;mso-position-vertical:absolute;mso-position-vertical-relative:text;v-text-anchor:top" o:gfxdata="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" filled="f" stroked="f">
                 <v:textbox>
                   <w:txbxContent>
                     <w:p>
@@ -462,7 +462,7 @@
           </mc:Choice>
           <mc:Fallback>
             <w:pict>
-              <v:shape w14:anchorId="1AD81025" id="_x0000_s1028" type="#_x0000_t202" style="position:absolute;margin-left:145.9pt;margin-top:749.15pt;width:92.05pt;height:27.8pt;z-index:251609088;visibility:visible;mso-wrap-style:square;mso-wrap-distance-left:9pt;mso-wrap-distance-top:0;mso-wrap-distance-right:9pt;mso-wrap-distance-bottom:0;mso-position-horizontal:absolute;mso-position-horizontal-relative:text;mso-position-vertical:absolute;mso-position-vertical-relative:text;v-text-anchor:top" o:gfxdata="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" filled="f" stroked="f">
+              <v:shape w14:anchorId="1AD81025" id="_x0000_s1028" type="#_x0000_t202" style="position:absolute;margin-left:145.9pt;margin-top:749.15pt;width:92.05pt;height:27.8pt;z-index:251609088;visibility:visible;mso-wrap-style:square;mso-wrap-distance-left:9pt;mso-wrap-distance-top:0;mso-wrap-distance-right:9pt;mso-wrap-distance-bottom:0;mso-position-horizontal:absolute;mso-position-horizontal-relative:text;mso-position-vertical:absolute;mso-position-vertical-relative:text;v-text-anchor:top" o:gfxdata="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" filled="f" stroked="f">
                 <v:textbox>
                   <w:txbxContent>
                     <w:p>
@@ -634,7 +634,7 @@
           </mc:Choice>
           <mc:Fallback>
             <w:pict>
-              <v:shape w14:anchorId="2BC934BA" id="_x0000_s1029" type="#_x0000_t202" style="position:absolute;margin-left:145.9pt;margin-top:729.3pt;width:92.05pt;height:27.8pt;z-index:251604992;visibility:visible;mso-wrap-style:square;mso-wrap-distance-left:9pt;mso-wrap-distance-top:0;mso-wrap-distance-right:9pt;mso-wrap-distance-bottom:0;mso-position-horizontal:absolute;mso-position-horizontal-relative:text;mso-position-vertical:absolute;mso-position-vertical-relative:text;v-text-anchor:top" o:gfxdata="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" filled="f" stroked="f">
+              <v:shape w14:anchorId="2BC934BA" id="_x0000_s1029" type="#_x0000_t202" style="position:absolute;margin-left:145.9pt;margin-top:729.3pt;width:92.05pt;height:27.8pt;z-index:251604992;visibility:visible;mso-wrap-style:square;mso-wrap-distance-left:9pt;mso-wrap-distance-top:0;mso-wrap-distance-right:9pt;mso-wrap-distance-bottom:0;mso-position-horizontal:absolute;mso-position-horizontal-relative:text;mso-position-vertical:absolute;mso-position-vertical-relative:text;v-text-anchor:top" o:gfxdata="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" filled="f" stroked="f">
                 <v:textbox>
                   <w:txbxContent>
                     <w:p>
@@ -806,7 +806,7 @@
           </mc:Choice>
           <mc:Fallback>
             <w:pict>
-              <v:shape w14:anchorId="4A0208C0" id="_x0000_s1030" type="#_x0000_t202" style="position:absolute;margin-left:145.9pt;margin-top:710.9pt;width:92.05pt;height:27.8pt;z-index:251600896;visibility:visible;mso-wrap-style:square;mso-wrap-distance-left:9pt;mso-wrap-distance-top:0;mso-wrap-distance-right:9pt;mso-wrap-distance-bottom:0;mso-position-horizontal:absolute;mso-position-horizontal-relative:text;mso-position-vertical:absolute;mso-position-vertical-relative:text;v-text-anchor:top" o:gfxdata="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" filled="f" stroked="f">
+              <v:shape w14:anchorId="4A0208C0" id="_x0000_s1030" type="#_x0000_t202" style="position:absolute;margin-left:145.9pt;margin-top:710.9pt;width:92.05pt;height:27.8pt;z-index:251600896;visibility:visible;mso-wrap-style:square;mso-wrap-distance-left:9pt;mso-wrap-distance-top:0;mso-wrap-distance-right:9pt;mso-wrap-distance-bottom:0;mso-position-horizontal:absolute;mso-position-horizontal-relative:text;mso-position-vertical:absolute;mso-position-vertical-relative:text;v-text-anchor:top" o:gfxdata="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" filled="f" stroked="f">
                 <v:textbox>
                   <w:txbxContent>
                     <w:p>
@@ -978,7 +978,7 @@
           </mc:Choice>
           <mc:Fallback>
             <w:pict>
-              <v:shape w14:anchorId="525988E3" id="_x0000_s1031" type="#_x0000_t202" style="position:absolute;margin-left:145.9pt;margin-top:691.05pt;width:92.05pt;height:27.8pt;z-index:251596800;visibility:visible;mso-wrap-style:square;mso-wrap-distance-left:9pt;mso-wrap-distance-top:0;mso-wrap-distance-right:9pt;mso-wrap-distance-bottom:0;mso-position-horizontal:absolute;mso-position-horizontal-relative:text;mso-position-vertical:absolute;mso-position-vertical-relative:text;v-text-anchor:top" o:gfxdata="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" filled="f" stroked="f">
+              <v:shape w14:anchorId="525988E3" id="_x0000_s1031" type="#_x0000_t202" style="position:absolute;margin-left:145.9pt;margin-top:691.05pt;width:92.05pt;height:27.8pt;z-index:251596800;visibility:visible;mso-wrap-style:square;mso-wrap-distance-left:9pt;mso-wrap-distance-top:0;mso-wrap-distance-right:9pt;mso-wrap-distance-bottom:0;mso-position-horizontal:absolute;mso-position-horizontal-relative:text;mso-position-vertical:absolute;mso-position-vertical-relative:text;v-text-anchor:top" o:gfxdata="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" filled="f" stroked="f">
                 <v:textbox>
                   <w:txbxContent>
                     <w:p>
@@ -1150,7 +1150,7 @@
           </mc:Choice>
           <mc:Fallback>
             <w:pict>
-              <v:shape w14:anchorId="0DEDA7D2" id="_x0000_s1032" type="#_x0000_t202" style="position:absolute;margin-left:145.9pt;margin-top:671.9pt;width:92.05pt;height:27.8pt;z-index:251592704;visibility:visible;mso-wrap-style:square;mso-wrap-distance-left:9pt;mso-wrap-distance-top:0;mso-wrap-distance-right:9pt;mso-wrap-distance-bottom:0;mso-position-horizontal:absolute;mso-position-horizontal-relative:text;mso-position-vertical:absolute;mso-position-vertical-relative:text;v-text-anchor:top" o:gfxdata="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" filled="f" stroked="f">
+              <v:shape w14:anchorId="0DEDA7D2" id="_x0000_s1032" type="#_x0000_t202" style="position:absolute;margin-left:145.9pt;margin-top:671.9pt;width:92.05pt;height:27.8pt;z-index:251592704;visibility:visible;mso-wrap-style:square;mso-wrap-distance-left:9pt;mso-wrap-distance-top:0;mso-wrap-distance-right:9pt;mso-wrap-distance-bottom:0;mso-position-horizontal:absolute;mso-position-horizontal-relative:text;mso-position-vertical:absolute;mso-position-vertical-relative:text;v-text-anchor:top" o:gfxdata="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" filled="f" stroked="f">
                 <v:textbox>
                   <w:txbxContent>
                     <w:p>
@@ -1322,7 +1322,7 @@
           </mc:Choice>
           <mc:Fallback>
             <w:pict>
-              <v:shape w14:anchorId="58FA3C6B" id="_x0000_s1033" type="#_x0000_t202" style="position:absolute;margin-left:145.9pt;margin-top:652.05pt;width:92.05pt;height:27.8pt;z-index:251588608;visibility:visible;mso-wrap-style:square;mso-wrap-distance-left:9pt;mso-wrap-distance-top:0;mso-wrap-distance-right:9pt;mso-wrap-distance-bottom:0;mso-position-horizontal:absolute;mso-position-horizontal-relative:text;mso-position-vertical:absolute;mso-position-vertical-relative:text;v-text-anchor:top" o:gfxdata="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" filled="f" stroked="f">
+              <v:shape w14:anchorId="58FA3C6B" id="_x0000_s1033" type="#_x0000_t202" style="position:absolute;margin-left:145.9pt;margin-top:652.05pt;width:92.05pt;height:27.8pt;z-index:251588608;visibility:visible;mso-wrap-style:square;mso-wrap-distance-left:9pt;mso-wrap-distance-top:0;mso-wrap-distance-right:9pt;mso-wrap-distance-bottom:0;mso-position-horizontal:absolute;mso-position-horizontal-relative:text;mso-position-vertical:absolute;mso-position-vertical-relative:text;v-text-anchor:top" o:gfxdata="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" filled="f" stroked="f">
                 <v:textbox>
                   <w:txbxContent>
                     <w:p>
@@ -1495,7 +1495,7 @@
           </mc:Choice>
           <mc:Fallback>
             <w:pict>
-              <v:shape w14:anchorId="6A43CFD4" id="_x0000_s1034" type="#_x0000_t202" style="position:absolute;margin-left:145.9pt;margin-top:633.65pt;width:92.1pt;height:27.8pt;z-index:251584512;visibility:visible;mso-wrap-style:square;mso-wrap-distance-left:9pt;mso-wrap-distance-top:0;mso-wrap-distance-right:9pt;mso-wrap-distance-bottom:0;mso-position-horizontal:absolute;mso-position-horizontal-relative:text;mso-position-vertical:absolute;mso-position-vertical-relative:text;v-text-anchor:top" o:gfxdata="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" filled="f" stroked="f">
+              <v:shape w14:anchorId="6A43CFD4" id="_x0000_s1034" type="#_x0000_t202" style="position:absolute;margin-left:145.9pt;margin-top:633.65pt;width:92.1pt;height:27.8pt;z-index:251584512;visibility:visible;mso-wrap-style:square;mso-wrap-distance-left:9pt;mso-wrap-distance-top:0;mso-wrap-distance-right:9pt;mso-wrap-distance-bottom:0;mso-position-horizontal:absolute;mso-position-horizontal-relative:text;mso-position-vertical:absolute;mso-position-vertical-relative:text;v-text-anchor:top" o:gfxdata="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" filled="f" stroked="f">
                 <v:textbox>
                   <w:txbxContent>
                     <w:p>
@@ -1658,7 +1658,7 @@
           </mc:Choice>
           <mc:Fallback>
             <w:pict>
-              <v:shape w14:anchorId="0965F1C0" id="_x0000_s1035" type="#_x0000_t202" style="position:absolute;margin-left:145.9pt;margin-top:613.8pt;width:92.1pt;height:27.8pt;z-index:251580416;visibility:visible;mso-wrap-style:square;mso-wrap-distance-left:9pt;mso-wrap-distance-top:0;mso-wrap-distance-right:9pt;mso-wrap-distance-bottom:0;mso-position-horizontal:absolute;mso-position-horizontal-relative:text;mso-position-vertical:absolute;mso-position-vertical-relative:text;v-text-anchor:top" o:gfxdata="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" filled="f" stroked="f">
+              <v:shape w14:anchorId="0965F1C0" id="_x0000_s1035" type="#_x0000_t202" style="position:absolute;margin-left:145.9pt;margin-top:613.8pt;width:92.1pt;height:27.8pt;z-index:251580416;visibility:visible;mso-wrap-style:square;mso-wrap-distance-left:9pt;mso-wrap-distance-top:0;mso-wrap-distance-right:9pt;mso-wrap-distance-bottom:0;mso-position-horizontal:absolute;mso-position-horizontal-relative:text;mso-position-vertical:absolute;mso-position-vertical-relative:text;v-text-anchor:top" o:gfxdata="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" filled="f" stroked="f">
                 <v:textbox>
                   <w:txbxContent>
                     <w:p>
@@ -1717,15 +1717,15 @@
         <mc:AlternateContent>
           <mc:Choice Requires="wps">
             <w:drawing>
-              <wp:anchor distT="0" distB="0" distL="114300" distR="114300" simplePos="0" relativeHeight="251579392" behindDoc="0" locked="0" layoutInCell="1" allowOverlap="1" wp14:anchorId="654EC83F" wp14:editId="0E20BAB7">
+              <wp:anchor distT="0" distB="0" distL="114300" distR="114300" simplePos="0" relativeHeight="251579392" behindDoc="0" locked="0" layoutInCell="1" allowOverlap="1" wp14:anchorId="654EC83F" wp14:editId="08795A16">
                 <wp:simplePos x="0" y="0"/>
                 <wp:positionH relativeFrom="column">
-                  <wp:posOffset>1104899</wp:posOffset>
+                  <wp:posOffset>1104900</wp:posOffset>
                 </wp:positionH>
                 <wp:positionV relativeFrom="paragraph">
                   <wp:posOffset>7791450</wp:posOffset>
                 </wp:positionV>
-                <wp:extent cx="942975" cy="353253"/>
+                <wp:extent cx="2633663" cy="353253"/>
                 <wp:effectExtent l="0" t="0" r="0" b="0"/>
                 <wp:wrapNone/>
                 <wp:docPr id="476088168" name="Text Box 2"/>
@@ -1741,7 +1741,7 @@
                       <wps:spPr bwMode="auto">
                         <a:xfrm>
                           <a:off x="0" y="0"/>
-                          <a:ext cx="942975" cy="353253"/>
+                          <a:ext cx="2633663" cy="353253"/>
                         </a:xfrm>
                         <a:prstGeom prst="rect">
                           <a:avLst/>
@@ -1813,7 +1813,7 @@
           </mc:Choice>
           <mc:Fallback>
             <w:pict>
-              <v:shape w14:anchorId="654EC83F" id="_x0000_s1036" type="#_x0000_t202" style="position:absolute;margin-left:87pt;margin-top:613.5pt;width:74.25pt;height:27.8pt;z-index:251579392;visibility:visible;mso-wrap-style:square;mso-width-percent:0;mso-wrap-distance-left:9pt;mso-wrap-distance-top:0;mso-wrap-distance-right:9pt;mso-wrap-distance-bottom:0;mso-position-horizontal:absolute;mso-position-horizontal-relative:text;mso-position-vertical:absolute;mso-position-vertical-relative:text;mso-width-percent:0;mso-width-relative:margin;v-text-anchor:top" o:gfxdata="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" filled="f" stroked="f">
+              <v:shape w14:anchorId="654EC83F" id="_x0000_s1036" type="#_x0000_t202" style="position:absolute;margin-left:87pt;margin-top:613.5pt;width:207.4pt;height:27.8pt;z-index:251579392;visibility:visible;mso-wrap-style:square;mso-width-percent:0;mso-wrap-distance-left:9pt;mso-wrap-distance-top:0;mso-wrap-distance-right:9pt;mso-wrap-distance-bottom:0;mso-position-horizontal:absolute;mso-position-horizontal-relative:text;mso-position-vertical:absolute;mso-position-vertical-relative:text;mso-width-percent:0;mso-width-relative:margin;v-text-anchor:top" o:gfxdata="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" filled="f" stroked="f">
                 <v:textbox>
                   <w:txbxContent>
                     <w:p>
@@ -1872,7 +1872,7 @@
         <mc:AlternateContent>
           <mc:Choice Requires="wps">
             <w:drawing>
-              <wp:anchor distT="0" distB="0" distL="114300" distR="114300" simplePos="0" relativeHeight="251581440" behindDoc="0" locked="0" layoutInCell="1" allowOverlap="1" wp14:anchorId="26AECBDE" wp14:editId="18A7C43E">
+              <wp:anchor distT="0" distB="0" distL="114300" distR="114300" simplePos="0" relativeHeight="251581440" behindDoc="0" locked="0" layoutInCell="1" allowOverlap="1" wp14:anchorId="26AECBDE" wp14:editId="03A218B0">
                 <wp:simplePos x="0" y="0"/>
                 <wp:positionH relativeFrom="column">
                   <wp:posOffset>4042907</wp:posOffset>
@@ -1946,7 +1946,7 @@
           </mc:Choice>
           <mc:Fallback>
             <w:pict>
-              <v:shape w14:anchorId="26AECBDE" id="_x0000_s1037" type="#_x0000_t202" style="position:absolute;margin-left:318.35pt;margin-top:613.5pt;width:62.45pt;height:27.8pt;z-index:251581440;visibility:visible;mso-wrap-style:square;mso-wrap-distance-left:9pt;mso-wrap-distance-top:0;mso-wrap-distance-right:9pt;mso-wrap-distance-bottom:0;mso-position-horizontal:absolute;mso-position-horizontal-relative:text;mso-position-vertical:absolute;mso-position-vertical-relative:text;v-text-anchor:top" o:gfxdata="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" filled="f" stroked="f">
+              <v:shape w14:anchorId="26AECBDE" id="_x0000_s1037" type="#_x0000_t202" style="position:absolute;margin-left:318.35pt;margin-top:613.5pt;width:62.45pt;height:27.8pt;z-index:251581440;visibility:visible;mso-wrap-style:square;mso-wrap-distance-left:9pt;mso-wrap-distance-top:0;mso-wrap-distance-right:9pt;mso-wrap-distance-bottom:0;mso-position-horizontal:absolute;mso-position-horizontal-relative:text;mso-position-vertical:absolute;mso-position-vertical-relative:text;v-text-anchor:top" o:gfxdata="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" filled="f" stroked="f">
                 <v:textbox>
                   <w:txbxContent>
                     <w:p>
@@ -1986,15 +1986,15 @@
         <mc:AlternateContent>
           <mc:Choice Requires="wps">
             <w:drawing>
-              <wp:anchor distT="0" distB="0" distL="114300" distR="114300" simplePos="0" relativeHeight="251583488" behindDoc="0" locked="0" layoutInCell="1" allowOverlap="1" wp14:anchorId="3BC575B8" wp14:editId="7720361E">
+              <wp:anchor distT="0" distB="0" distL="114300" distR="114300" simplePos="0" relativeHeight="251583488" behindDoc="0" locked="0" layoutInCell="1" allowOverlap="1" wp14:anchorId="3BC575B8" wp14:editId="3281B84A">
                 <wp:simplePos x="0" y="0"/>
                 <wp:positionH relativeFrom="column">
-                  <wp:posOffset>1104899</wp:posOffset>
+                  <wp:posOffset>1104900</wp:posOffset>
                 </wp:positionH>
                 <wp:positionV relativeFrom="paragraph">
                   <wp:posOffset>8043863</wp:posOffset>
                 </wp:positionV>
-                <wp:extent cx="942975" cy="353253"/>
+                <wp:extent cx="2633663" cy="353253"/>
                 <wp:effectExtent l="0" t="0" r="0" b="0"/>
                 <wp:wrapNone/>
                 <wp:docPr id="18" name="Text Box 2"/>
@@ -2010,7 +2010,7 @@
                       <wps:spPr bwMode="auto">
                         <a:xfrm>
                           <a:off x="0" y="0"/>
-                          <a:ext cx="942975" cy="353253"/>
+                          <a:ext cx="2633663" cy="353253"/>
                         </a:xfrm>
                         <a:prstGeom prst="rect">
                           <a:avLst/>
@@ -2093,7 +2093,7 @@
           </mc:Choice>
           <mc:Fallback>
             <w:pict>
-              <v:shape w14:anchorId="3BC575B8" id="_x0000_s1038" type="#_x0000_t202" style="position:absolute;margin-left:87pt;margin-top:633.4pt;width:74.25pt;height:27.8pt;z-index:251583488;visibility:visible;mso-wrap-style:square;mso-width-percent:0;mso-wrap-distance-left:9pt;mso-wrap-distance-top:0;mso-wrap-distance-right:9pt;mso-wrap-distance-bottom:0;mso-position-horizontal:absolute;mso-position-horizontal-relative:text;mso-position-vertical:absolute;mso-position-vertical-relative:text;mso-width-percent:0;mso-width-relative:margin;v-text-anchor:top" o:gfxdata="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" filled="f" stroked="f">
+              <v:shape w14:anchorId="3BC575B8" id="_x0000_s1038" type="#_x0000_t202" style="position:absolute;margin-left:87pt;margin-top:633.4pt;width:207.4pt;height:27.8pt;z-index:251583488;visibility:visible;mso-wrap-style:square;mso-width-percent:0;mso-wrap-distance-left:9pt;mso-wrap-distance-top:0;mso-wrap-distance-right:9pt;mso-wrap-distance-bottom:0;mso-position-horizontal:absolute;mso-position-horizontal-relative:text;mso-position-vertical:absolute;mso-position-vertical-relative:text;mso-width-percent:0;mso-width-relative:margin;v-text-anchor:top" o:gfxdata="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" filled="f" stroked="f">
                 <v:textbox>
                   <w:txbxContent>
                     <w:p>
@@ -2163,7 +2163,7 @@
         <mc:AlternateContent>
           <mc:Choice Requires="wps">
             <w:drawing>
-              <wp:anchor distT="0" distB="0" distL="114300" distR="114300" simplePos="0" relativeHeight="251585536" behindDoc="0" locked="0" layoutInCell="1" allowOverlap="1" wp14:anchorId="7F7C5C97" wp14:editId="29C91490">
+              <wp:anchor distT="0" distB="0" distL="114300" distR="114300" simplePos="0" relativeHeight="251585536" behindDoc="0" locked="0" layoutInCell="1" allowOverlap="1" wp14:anchorId="7F7C5C97" wp14:editId="30B36EFC">
                 <wp:simplePos x="0" y="0"/>
                 <wp:positionH relativeFrom="column">
                   <wp:posOffset>4042907</wp:posOffset>
@@ -2257,7 +2257,7 @@
           </mc:Choice>
           <mc:Fallback>
             <w:pict>
-              <v:shape w14:anchorId="7F7C5C97" id="_x0000_s1039" type="#_x0000_t202" style="position:absolute;margin-left:318.35pt;margin-top:633.4pt;width:62.45pt;height:27.8pt;z-index:251585536;visibility:visible;mso-wrap-style:square;mso-wrap-distance-left:9pt;mso-wrap-distance-top:0;mso-wrap-distance-right:9pt;mso-wrap-distance-bottom:0;mso-position-horizontal:absolute;mso-position-horizontal-relative:text;mso-position-vertical:absolute;mso-position-vertical-relative:text;v-text-anchor:top" o:gfxdata="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" filled="f" stroked="f">
+              <v:shape w14:anchorId="7F7C5C97" id="_x0000_s1039" type="#_x0000_t202" style="position:absolute;margin-left:318.35pt;margin-top:633.4pt;width:62.45pt;height:27.8pt;z-index:251585536;visibility:visible;mso-wrap-style:square;mso-wrap-distance-left:9pt;mso-wrap-distance-top:0;mso-wrap-distance-right:9pt;mso-wrap-distance-bottom:0;mso-position-horizontal:absolute;mso-position-horizontal-relative:text;mso-position-vertical:absolute;mso-position-vertical-relative:text;v-text-anchor:top" o:gfxdata="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" filled="f" stroked="f">
                 <v:textbox>
                   <w:txbxContent>
                     <w:p>
@@ -2317,15 +2317,15 @@
         <mc:AlternateContent>
           <mc:Choice Requires="wps">
             <w:drawing>
-              <wp:anchor distT="0" distB="0" distL="114300" distR="114300" simplePos="0" relativeHeight="251587584" behindDoc="0" locked="0" layoutInCell="1" allowOverlap="1" wp14:anchorId="03A1E28B" wp14:editId="22268EF0">
+              <wp:anchor distT="0" distB="0" distL="114300" distR="114300" simplePos="0" relativeHeight="251587584" behindDoc="0" locked="0" layoutInCell="1" allowOverlap="1" wp14:anchorId="03A1E28B" wp14:editId="2D7DE811">
                 <wp:simplePos x="0" y="0"/>
                 <wp:positionH relativeFrom="column">
-                  <wp:posOffset>1104899</wp:posOffset>
+                  <wp:posOffset>1104900</wp:posOffset>
                 </wp:positionH>
                 <wp:positionV relativeFrom="paragraph">
                   <wp:posOffset>8277225</wp:posOffset>
                 </wp:positionV>
-                <wp:extent cx="942975" cy="353120"/>
+                <wp:extent cx="2633663" cy="353120"/>
                 <wp:effectExtent l="0" t="0" r="0" b="0"/>
                 <wp:wrapNone/>
                 <wp:docPr id="22" name="Text Box 2"/>
@@ -2341,19 +2341,32 @@
                       <wps:spPr bwMode="auto">
                         <a:xfrm>
                           <a:off x="0" y="0"/>
-                          <a:ext cx="942975" cy="353120"/>
+                          <a:ext cx="2633663" cy="353120"/>
                         </a:xfrm>
                         <a:prstGeom prst="rect">
                           <a:avLst/>
                         </a:prstGeom>
                         <a:noFill/>
-                        <a:ln w="9525">
+                        <a:ln>
                           <a:noFill/>
-                          <a:miter lim="800000"/>
                           <a:headEnd/>
                           <a:tailEnd/>
                         </a:ln>
                       </wps:spPr>
+                      <wps:style>
+                        <a:lnRef idx="2">
+                          <a:schemeClr val="accent2"/>
+                        </a:lnRef>
+                        <a:fillRef idx="1">
+                          <a:schemeClr val="lt1"/>
+                        </a:fillRef>
+                        <a:effectRef idx="0">
+                          <a:schemeClr val="accent2"/>
+                        </a:effectRef>
+                        <a:fontRef idx="minor">
+                          <a:schemeClr val="dk1"/>
+                        </a:fontRef>
+                      </wps:style>
                       <wps:txbx>
                         <w:txbxContent>
                           <w:p>
@@ -2423,7 +2436,7 @@
           </mc:Choice>
           <mc:Fallback>
             <w:pict>
-              <v:shape w14:anchorId="03A1E28B" id="_x0000_s1040" type="#_x0000_t202" style="position:absolute;margin-left:87pt;margin-top:651.75pt;width:74.25pt;height:27.8pt;z-index:251587584;visibility:visible;mso-wrap-style:square;mso-width-percent:0;mso-wrap-distance-left:9pt;mso-wrap-distance-top:0;mso-wrap-distance-right:9pt;mso-wrap-distance-bottom:0;mso-position-horizontal:absolute;mso-position-horizontal-relative:text;mso-position-vertical:absolute;mso-position-vertical-relative:text;mso-width-percent:0;mso-width-relative:margin;v-text-anchor:top" o:gfxdata="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" filled="f" stroked="f">
+              <v:shape w14:anchorId="03A1E28B" id="_x0000_s1040" type="#_x0000_t202" style="position:absolute;margin-left:87pt;margin-top:651.75pt;width:207.4pt;height:27.8pt;z-index:251587584;visibility:visible;mso-wrap-style:square;mso-width-percent:0;mso-wrap-distance-left:9pt;mso-wrap-distance-top:0;mso-wrap-distance-right:9pt;mso-wrap-distance-bottom:0;mso-position-horizontal:absolute;mso-position-horizontal-relative:text;mso-position-vertical:absolute;mso-position-vertical-relative:text;mso-width-percent:0;mso-width-relative:margin;v-text-anchor:top" o:gfxdata="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" filled="f" stroked="f" strokeweight="1pt">
                 <v:textbox>
                   <w:txbxContent>
                     <w:p>
@@ -2586,7 +2599,7 @@
           </mc:Choice>
           <mc:Fallback>
             <w:pict>
-              <v:shape w14:anchorId="3D691B08" id="_x0000_s1041" type="#_x0000_t202" style="position:absolute;margin-left:318.3pt;margin-top:651.75pt;width:62.45pt;height:27.8pt;z-index:251589632;visibility:visible;mso-wrap-style:square;mso-wrap-distance-left:9pt;mso-wrap-distance-top:0;mso-wrap-distance-right:9pt;mso-wrap-distance-bottom:0;mso-position-horizontal:absolute;mso-position-horizontal-relative:text;mso-position-vertical:absolute;mso-position-vertical-relative:text;v-text-anchor:top" o:gfxdata="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" filled="f" stroked="f">
+              <v:shape w14:anchorId="3D691B08" id="_x0000_s1041" type="#_x0000_t202" style="position:absolute;margin-left:318.3pt;margin-top:651.75pt;width:62.45pt;height:27.8pt;z-index:251589632;visibility:visible;mso-wrap-style:square;mso-wrap-distance-left:9pt;mso-wrap-distance-top:0;mso-wrap-distance-right:9pt;mso-wrap-distance-bottom:0;mso-position-horizontal:absolute;mso-position-horizontal-relative:text;mso-position-vertical:absolute;mso-position-vertical-relative:text;v-text-anchor:top" o:gfxdata="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" filled="f" stroked="f">
                 <v:textbox>
                   <w:txbxContent>
                     <w:p>
@@ -2646,15 +2659,15 @@
         <mc:AlternateContent>
           <mc:Choice Requires="wps">
             <w:drawing>
-              <wp:anchor distT="0" distB="0" distL="114300" distR="114300" simplePos="0" relativeHeight="251591680" behindDoc="0" locked="0" layoutInCell="1" allowOverlap="1" wp14:anchorId="017F1225" wp14:editId="708FCFE1">
+              <wp:anchor distT="0" distB="0" distL="114300" distR="114300" simplePos="0" relativeHeight="251591680" behindDoc="0" locked="0" layoutInCell="1" allowOverlap="1" wp14:anchorId="017F1225" wp14:editId="52B914F9">
                 <wp:simplePos x="0" y="0"/>
                 <wp:positionH relativeFrom="column">
-                  <wp:posOffset>1104899</wp:posOffset>
+                  <wp:posOffset>1104900</wp:posOffset>
                 </wp:positionH>
                 <wp:positionV relativeFrom="paragraph">
-                  <wp:posOffset>8529638</wp:posOffset>
+                  <wp:posOffset>8528050</wp:posOffset>
                 </wp:positionV>
-                <wp:extent cx="942975" cy="353120"/>
+                <wp:extent cx="2633345" cy="353120"/>
                 <wp:effectExtent l="0" t="0" r="0" b="0"/>
                 <wp:wrapNone/>
                 <wp:docPr id="26" name="Text Box 2"/>
@@ -2670,7 +2683,7 @@
                       <wps:spPr bwMode="auto">
                         <a:xfrm>
                           <a:off x="0" y="0"/>
-                          <a:ext cx="942975" cy="353120"/>
+                          <a:ext cx="2633345" cy="353120"/>
                         </a:xfrm>
                         <a:prstGeom prst="rect">
                           <a:avLst/>
@@ -2752,7 +2765,7 @@
           </mc:Choice>
           <mc:Fallback>
             <w:pict>
-              <v:shape w14:anchorId="017F1225" id="_x0000_s1042" type="#_x0000_t202" style="position:absolute;margin-left:87pt;margin-top:671.65pt;width:74.25pt;height:27.8pt;z-index:251591680;visibility:visible;mso-wrap-style:square;mso-width-percent:0;mso-wrap-distance-left:9pt;mso-wrap-distance-top:0;mso-wrap-distance-right:9pt;mso-wrap-distance-bottom:0;mso-position-horizontal:absolute;mso-position-horizontal-relative:text;mso-position-vertical:absolute;mso-position-vertical-relative:text;mso-width-percent:0;mso-width-relative:margin;v-text-anchor:top" o:gfxdata="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" filled="f" stroked="f">
+              <v:shape w14:anchorId="017F1225" id="_x0000_s1042" type="#_x0000_t202" style="position:absolute;margin-left:87pt;margin-top:671.5pt;width:207.35pt;height:27.8pt;z-index:251591680;visibility:visible;mso-wrap-style:square;mso-width-percent:0;mso-wrap-distance-left:9pt;mso-wrap-distance-top:0;mso-wrap-distance-right:9pt;mso-wrap-distance-bottom:0;mso-position-horizontal:absolute;mso-position-horizontal-relative:text;mso-position-vertical:absolute;mso-position-vertical-relative:text;mso-width-percent:0;mso-width-relative:margin;v-text-anchor:top" o:gfxdata="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" filled="f" stroked="f">
                 <v:textbox>
                   <w:txbxContent>
                     <w:p>
@@ -2821,7 +2834,7 @@
         <mc:AlternateContent>
           <mc:Choice Requires="wps">
             <w:drawing>
-              <wp:anchor distT="0" distB="0" distL="114300" distR="114300" simplePos="0" relativeHeight="251593728" behindDoc="0" locked="0" layoutInCell="1" allowOverlap="1" wp14:anchorId="48B29C6A" wp14:editId="5826EF0F">
+              <wp:anchor distT="0" distB="0" distL="114300" distR="114300" simplePos="0" relativeHeight="251593728" behindDoc="0" locked="0" layoutInCell="1" allowOverlap="1" wp14:anchorId="48B29C6A" wp14:editId="5077E55B">
                 <wp:simplePos x="0" y="0"/>
                 <wp:positionH relativeFrom="column">
                   <wp:posOffset>4042516</wp:posOffset>
@@ -2915,7 +2928,7 @@
           </mc:Choice>
           <mc:Fallback>
             <w:pict>
-              <v:shape w14:anchorId="48B29C6A" id="_x0000_s1043" type="#_x0000_t202" style="position:absolute;margin-left:318.3pt;margin-top:671.65pt;width:62.45pt;height:27.8pt;z-index:251593728;visibility:visible;mso-wrap-style:square;mso-wrap-distance-left:9pt;mso-wrap-distance-top:0;mso-wrap-distance-right:9pt;mso-wrap-distance-bottom:0;mso-position-horizontal:absolute;mso-position-horizontal-relative:text;mso-position-vertical:absolute;mso-position-vertical-relative:text;v-text-anchor:top" o:gfxdata="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" filled="f" stroked="f">
+              <v:shape w14:anchorId="48B29C6A" id="_x0000_s1043" type="#_x0000_t202" style="position:absolute;margin-left:318.3pt;margin-top:671.65pt;width:62.45pt;height:27.8pt;z-index:251593728;visibility:visible;mso-wrap-style:square;mso-wrap-distance-left:9pt;mso-wrap-distance-top:0;mso-wrap-distance-right:9pt;mso-wrap-distance-bottom:0;mso-position-horizontal:absolute;mso-position-horizontal-relative:text;mso-position-vertical:absolute;mso-position-vertical-relative:text;v-text-anchor:top" o:gfxdata="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" filled="f" stroked="f">
                 <v:textbox>
                   <w:txbxContent>
                     <w:p>
@@ -2975,15 +2988,15 @@
         <mc:AlternateContent>
           <mc:Choice Requires="wps">
             <w:drawing>
-              <wp:anchor distT="0" distB="0" distL="114300" distR="114300" simplePos="0" relativeHeight="251595776" behindDoc="0" locked="0" layoutInCell="1" allowOverlap="1" wp14:anchorId="21363107" wp14:editId="68AE0A42">
+              <wp:anchor distT="0" distB="0" distL="114300" distR="114300" simplePos="0" relativeHeight="251595776" behindDoc="0" locked="0" layoutInCell="1" allowOverlap="1" wp14:anchorId="21363107" wp14:editId="216672DE">
                 <wp:simplePos x="0" y="0"/>
                 <wp:positionH relativeFrom="column">
-                  <wp:posOffset>1104899</wp:posOffset>
+                  <wp:posOffset>1104900</wp:posOffset>
                 </wp:positionH>
                 <wp:positionV relativeFrom="paragraph">
-                  <wp:posOffset>8772525</wp:posOffset>
+                  <wp:posOffset>8775700</wp:posOffset>
                 </wp:positionV>
-                <wp:extent cx="942975" cy="353120"/>
+                <wp:extent cx="2633345" cy="353120"/>
                 <wp:effectExtent l="0" t="0" r="0" b="0"/>
                 <wp:wrapNone/>
                 <wp:docPr id="30" name="Text Box 2"/>
@@ -2999,7 +3012,7 @@
                       <wps:spPr bwMode="auto">
                         <a:xfrm>
                           <a:off x="0" y="0"/>
-                          <a:ext cx="942975" cy="353120"/>
+                          <a:ext cx="2633345" cy="353120"/>
                         </a:xfrm>
                         <a:prstGeom prst="rect">
                           <a:avLst/>
@@ -3081,7 +3094,7 @@
           </mc:Choice>
           <mc:Fallback>
             <w:pict>
-              <v:shape w14:anchorId="21363107" id="_x0000_s1044" type="#_x0000_t202" style="position:absolute;margin-left:87pt;margin-top:690.75pt;width:74.25pt;height:27.8pt;z-index:251595776;visibility:visible;mso-wrap-style:square;mso-width-percent:0;mso-wrap-distance-left:9pt;mso-wrap-distance-top:0;mso-wrap-distance-right:9pt;mso-wrap-distance-bottom:0;mso-position-horizontal:absolute;mso-position-horizontal-relative:text;mso-position-vertical:absolute;mso-position-vertical-relative:text;mso-width-percent:0;mso-width-relative:margin;v-text-anchor:top" o:gfxdata="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" filled="f" stroked="f">
+              <v:shape w14:anchorId="21363107" id="_x0000_s1044" type="#_x0000_t202" style="position:absolute;margin-left:87pt;margin-top:691pt;width:207.35pt;height:27.8pt;z-index:251595776;visibility:visible;mso-wrap-style:square;mso-width-percent:0;mso-wrap-distance-left:9pt;mso-wrap-distance-top:0;mso-wrap-distance-right:9pt;mso-wrap-distance-bottom:0;mso-position-horizontal:absolute;mso-position-horizontal-relative:text;mso-position-vertical:absolute;mso-position-vertical-relative:text;mso-width-percent:0;mso-width-relative:margin;v-text-anchor:top" o:gfxdata="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" filled="f" stroked="f">
                 <v:textbox>
                   <w:txbxContent>
                     <w:p>
@@ -3150,7 +3163,7 @@
         <mc:AlternateContent>
           <mc:Choice Requires="wps">
             <w:drawing>
-              <wp:anchor distT="0" distB="0" distL="114300" distR="114300" simplePos="0" relativeHeight="251597824" behindDoc="0" locked="0" layoutInCell="1" allowOverlap="1" wp14:anchorId="3A3AA3B1" wp14:editId="77CC70D2">
+              <wp:anchor distT="0" distB="0" distL="114300" distR="114300" simplePos="0" relativeHeight="251597824" behindDoc="0" locked="0" layoutInCell="1" allowOverlap="1" wp14:anchorId="3A3AA3B1" wp14:editId="6DD7B454">
                 <wp:simplePos x="0" y="0"/>
                 <wp:positionH relativeFrom="column">
                   <wp:posOffset>4042516</wp:posOffset>
@@ -3244,7 +3257,7 @@
           </mc:Choice>
           <mc:Fallback>
             <w:pict>
-              <v:shape w14:anchorId="3A3AA3B1" id="_x0000_s1045" type="#_x0000_t202" style="position:absolute;margin-left:318.3pt;margin-top:690.75pt;width:62.45pt;height:27.8pt;z-index:251597824;visibility:visible;mso-wrap-style:square;mso-wrap-distance-left:9pt;mso-wrap-distance-top:0;mso-wrap-distance-right:9pt;mso-wrap-distance-bottom:0;mso-position-horizontal:absolute;mso-position-horizontal-relative:text;mso-position-vertical:absolute;mso-position-vertical-relative:text;v-text-anchor:top" o:gfxdata="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" filled="f" stroked="f">
+              <v:shape w14:anchorId="3A3AA3B1" id="_x0000_s1045" type="#_x0000_t202" style="position:absolute;margin-left:318.3pt;margin-top:690.75pt;width:62.45pt;height:27.8pt;z-index:251597824;visibility:visible;mso-wrap-style:square;mso-wrap-distance-left:9pt;mso-wrap-distance-top:0;mso-wrap-distance-right:9pt;mso-wrap-distance-bottom:0;mso-position-horizontal:absolute;mso-position-horizontal-relative:text;mso-position-vertical:absolute;mso-position-vertical-relative:text;v-text-anchor:top" o:gfxdata="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" filled="f" stroked="f">
                 <v:textbox>
                   <w:txbxContent>
                     <w:p>
@@ -3304,15 +3317,15 @@
         <mc:AlternateContent>
           <mc:Choice Requires="wps">
             <w:drawing>
-              <wp:anchor distT="0" distB="0" distL="114300" distR="114300" simplePos="0" relativeHeight="251599872" behindDoc="0" locked="0" layoutInCell="1" allowOverlap="1" wp14:anchorId="76E350B1" wp14:editId="7911293D">
+              <wp:anchor distT="0" distB="0" distL="114300" distR="114300" simplePos="0" relativeHeight="251599872" behindDoc="0" locked="0" layoutInCell="1" allowOverlap="1" wp14:anchorId="76E350B1" wp14:editId="72518364">
                 <wp:simplePos x="0" y="0"/>
                 <wp:positionH relativeFrom="column">
-                  <wp:posOffset>1104899</wp:posOffset>
+                  <wp:posOffset>1104900</wp:posOffset>
                 </wp:positionH>
                 <wp:positionV relativeFrom="paragraph">
-                  <wp:posOffset>9024938</wp:posOffset>
+                  <wp:posOffset>9023350</wp:posOffset>
                 </wp:positionV>
-                <wp:extent cx="942975" cy="353120"/>
+                <wp:extent cx="2633345" cy="353120"/>
                 <wp:effectExtent l="0" t="0" r="0" b="0"/>
                 <wp:wrapNone/>
                 <wp:docPr id="476088162" name="Text Box 2"/>
@@ -3328,7 +3341,7 @@
                       <wps:spPr bwMode="auto">
                         <a:xfrm>
                           <a:off x="0" y="0"/>
-                          <a:ext cx="942975" cy="353120"/>
+                          <a:ext cx="2633345" cy="353120"/>
                         </a:xfrm>
                         <a:prstGeom prst="rect">
                           <a:avLst/>
@@ -3410,7 +3423,7 @@
           </mc:Choice>
           <mc:Fallback>
             <w:pict>
-              <v:shape w14:anchorId="76E350B1" id="_x0000_s1046" type="#_x0000_t202" style="position:absolute;margin-left:87pt;margin-top:710.65pt;width:74.25pt;height:27.8pt;z-index:251599872;visibility:visible;mso-wrap-style:square;mso-width-percent:0;mso-wrap-distance-left:9pt;mso-wrap-distance-top:0;mso-wrap-distance-right:9pt;mso-wrap-distance-bottom:0;mso-position-horizontal:absolute;mso-position-horizontal-relative:text;mso-position-vertical:absolute;mso-position-vertical-relative:text;mso-width-percent:0;mso-width-relative:margin;v-text-anchor:top" o:gfxdata="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" filled="f" stroked="f">
+              <v:shape w14:anchorId="76E350B1" id="_x0000_s1046" type="#_x0000_t202" style="position:absolute;margin-left:87pt;margin-top:710.5pt;width:207.35pt;height:27.8pt;z-index:251599872;visibility:visible;mso-wrap-style:square;mso-width-percent:0;mso-wrap-distance-left:9pt;mso-wrap-distance-top:0;mso-wrap-distance-right:9pt;mso-wrap-distance-bottom:0;mso-position-horizontal:absolute;mso-position-horizontal-relative:text;mso-position-vertical:absolute;mso-position-vertical-relative:text;mso-width-percent:0;mso-width-relative:margin;v-text-anchor:top" o:gfxdata="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" filled="f" stroked="f">
                 <v:textbox>
                   <w:txbxContent>
                     <w:p>
@@ -3479,7 +3492,7 @@
         <mc:AlternateContent>
           <mc:Choice Requires="wps">
             <w:drawing>
-              <wp:anchor distT="0" distB="0" distL="114300" distR="114300" simplePos="0" relativeHeight="251601920" behindDoc="0" locked="0" layoutInCell="1" allowOverlap="1" wp14:anchorId="0BFC2162" wp14:editId="2267FA3B">
+              <wp:anchor distT="0" distB="0" distL="114300" distR="114300" simplePos="0" relativeHeight="251601920" behindDoc="0" locked="0" layoutInCell="1" allowOverlap="1" wp14:anchorId="0BFC2162" wp14:editId="0A2074C9">
                 <wp:simplePos x="0" y="0"/>
                 <wp:positionH relativeFrom="column">
                   <wp:posOffset>4042516</wp:posOffset>
@@ -3573,7 +3586,7 @@
           </mc:Choice>
           <mc:Fallback>
             <w:pict>
-              <v:shape w14:anchorId="0BFC2162" id="_x0000_s1047" type="#_x0000_t202" style="position:absolute;margin-left:318.3pt;margin-top:710.65pt;width:62.45pt;height:27.8pt;z-index:251601920;visibility:visible;mso-wrap-style:square;mso-wrap-distance-left:9pt;mso-wrap-distance-top:0;mso-wrap-distance-right:9pt;mso-wrap-distance-bottom:0;mso-position-horizontal:absolute;mso-position-horizontal-relative:text;mso-position-vertical:absolute;mso-position-vertical-relative:text;v-text-anchor:top" o:gfxdata="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" filled="f" stroked="f">
+              <v:shape w14:anchorId="0BFC2162" id="_x0000_s1047" type="#_x0000_t202" style="position:absolute;margin-left:318.3pt;margin-top:710.65pt;width:62.45pt;height:27.8pt;z-index:251601920;visibility:visible;mso-wrap-style:square;mso-wrap-distance-left:9pt;mso-wrap-distance-top:0;mso-wrap-distance-right:9pt;mso-wrap-distance-bottom:0;mso-position-horizontal:absolute;mso-position-horizontal-relative:text;mso-position-vertical:absolute;mso-position-vertical-relative:text;v-text-anchor:top" o:gfxdata="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" filled="f" stroked="f">
                 <v:textbox>
                   <w:txbxContent>
                     <w:p>
@@ -3633,15 +3646,15 @@
         <mc:AlternateContent>
           <mc:Choice Requires="wps">
             <w:drawing>
-              <wp:anchor distT="0" distB="0" distL="114300" distR="114300" simplePos="0" relativeHeight="251603968" behindDoc="0" locked="0" layoutInCell="1" allowOverlap="1" wp14:anchorId="6B011B9E" wp14:editId="09F760A9">
+              <wp:anchor distT="0" distB="0" distL="114300" distR="114300" simplePos="0" relativeHeight="251603968" behindDoc="0" locked="0" layoutInCell="1" allowOverlap="1" wp14:anchorId="6B011B9E" wp14:editId="3C2A7DE0">
                 <wp:simplePos x="0" y="0"/>
                 <wp:positionH relativeFrom="column">
-                  <wp:posOffset>1104899</wp:posOffset>
+                  <wp:posOffset>1104900</wp:posOffset>
                 </wp:positionH>
                 <wp:positionV relativeFrom="paragraph">
                   <wp:posOffset>9258300</wp:posOffset>
                 </wp:positionV>
-                <wp:extent cx="942975" cy="353120"/>
+                <wp:extent cx="2633345" cy="353120"/>
                 <wp:effectExtent l="0" t="0" r="0" b="0"/>
                 <wp:wrapNone/>
                 <wp:docPr id="476088166" name="Text Box 2"/>
@@ -3657,7 +3670,7 @@
                       <wps:spPr bwMode="auto">
                         <a:xfrm>
                           <a:off x="0" y="0"/>
-                          <a:ext cx="942975" cy="353120"/>
+                          <a:ext cx="2633345" cy="353120"/>
                         </a:xfrm>
                         <a:prstGeom prst="rect">
                           <a:avLst/>
@@ -3739,7 +3752,7 @@
           </mc:Choice>
           <mc:Fallback>
             <w:pict>
-              <v:shape w14:anchorId="6B011B9E" id="_x0000_s1048" type="#_x0000_t202" style="position:absolute;margin-left:87pt;margin-top:729pt;width:74.25pt;height:27.8pt;z-index:251603968;visibility:visible;mso-wrap-style:square;mso-width-percent:0;mso-wrap-distance-left:9pt;mso-wrap-distance-top:0;mso-wrap-distance-right:9pt;mso-wrap-distance-bottom:0;mso-position-horizontal:absolute;mso-position-horizontal-relative:text;mso-position-vertical:absolute;mso-position-vertical-relative:text;mso-width-percent:0;mso-width-relative:margin;v-text-anchor:top" o:gfxdata="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" filled="f" stroked="f">
+              <v:shape w14:anchorId="6B011B9E" id="_x0000_s1048" type="#_x0000_t202" style="position:absolute;margin-left:87pt;margin-top:729pt;width:207.35pt;height:27.8pt;z-index:251603968;visibility:visible;mso-wrap-style:square;mso-width-percent:0;mso-wrap-distance-left:9pt;mso-wrap-distance-top:0;mso-wrap-distance-right:9pt;mso-wrap-distance-bottom:0;mso-position-horizontal:absolute;mso-position-horizontal-relative:text;mso-position-vertical:absolute;mso-position-vertical-relative:text;mso-width-percent:0;mso-width-relative:margin;v-text-anchor:top" o:gfxdata="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" filled="f" stroked="f">
                 <v:textbox>
                   <w:txbxContent>
                     <w:p>
@@ -3808,7 +3821,7 @@
         <mc:AlternateContent>
           <mc:Choice Requires="wps">
             <w:drawing>
-              <wp:anchor distT="0" distB="0" distL="114300" distR="114300" simplePos="0" relativeHeight="251606016" behindDoc="0" locked="0" layoutInCell="1" allowOverlap="1" wp14:anchorId="317F3F46" wp14:editId="7243E1D9">
+              <wp:anchor distT="0" distB="0" distL="114300" distR="114300" simplePos="0" relativeHeight="251606016" behindDoc="0" locked="0" layoutInCell="1" allowOverlap="1" wp14:anchorId="317F3F46" wp14:editId="480DADEC">
                 <wp:simplePos x="0" y="0"/>
                 <wp:positionH relativeFrom="column">
                   <wp:posOffset>4042516</wp:posOffset>
@@ -3902,7 +3915,7 @@
           </mc:Choice>
           <mc:Fallback>
             <w:pict>
-              <v:shape w14:anchorId="317F3F46" id="_x0000_s1049" type="#_x0000_t202" style="position:absolute;margin-left:318.3pt;margin-top:729pt;width:62.45pt;height:27.8pt;z-index:251606016;visibility:visible;mso-wrap-style:square;mso-wrap-distance-left:9pt;mso-wrap-distance-top:0;mso-wrap-distance-right:9pt;mso-wrap-distance-bottom:0;mso-position-horizontal:absolute;mso-position-horizontal-relative:text;mso-position-vertical:absolute;mso-position-vertical-relative:text;v-text-anchor:top" o:gfxdata="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" filled="f" stroked="f">
+              <v:shape w14:anchorId="317F3F46" id="_x0000_s1049" type="#_x0000_t202" style="position:absolute;margin-left:318.3pt;margin-top:729pt;width:62.45pt;height:27.8pt;z-index:251606016;visibility:visible;mso-wrap-style:square;mso-wrap-distance-left:9pt;mso-wrap-distance-top:0;mso-wrap-distance-right:9pt;mso-wrap-distance-bottom:0;mso-position-horizontal:absolute;mso-position-horizontal-relative:text;mso-position-vertical:absolute;mso-position-vertical-relative:text;v-text-anchor:top" o:gfxdata="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" filled="f" stroked="f">
                 <v:textbox>
                   <w:txbxContent>
                     <w:p>
@@ -3962,15 +3975,15 @@
         <mc:AlternateContent>
           <mc:Choice Requires="wps">
             <w:drawing>
-              <wp:anchor distT="0" distB="0" distL="114300" distR="114300" simplePos="0" relativeHeight="251608064" behindDoc="0" locked="0" layoutInCell="1" allowOverlap="1" wp14:anchorId="28E1CE9D" wp14:editId="313C335A">
+              <wp:anchor distT="0" distB="0" distL="114300" distR="114300" simplePos="0" relativeHeight="251608064" behindDoc="0" locked="0" layoutInCell="1" allowOverlap="1" wp14:anchorId="28E1CE9D" wp14:editId="452BDF9A">
                 <wp:simplePos x="0" y="0"/>
                 <wp:positionH relativeFrom="column">
-                  <wp:posOffset>1104899</wp:posOffset>
+                  <wp:posOffset>1104900</wp:posOffset>
                 </wp:positionH>
                 <wp:positionV relativeFrom="paragraph">
-                  <wp:posOffset>9510713</wp:posOffset>
+                  <wp:posOffset>9512300</wp:posOffset>
                 </wp:positionV>
-                <wp:extent cx="942975" cy="353120"/>
+                <wp:extent cx="2633345" cy="353120"/>
                 <wp:effectExtent l="0" t="0" r="0" b="0"/>
                 <wp:wrapNone/>
                 <wp:docPr id="476088171" name="Text Box 2"/>
@@ -3986,7 +3999,7 @@
                       <wps:spPr bwMode="auto">
                         <a:xfrm>
                           <a:off x="0" y="0"/>
-                          <a:ext cx="942975" cy="353120"/>
+                          <a:ext cx="2633345" cy="353120"/>
                         </a:xfrm>
                         <a:prstGeom prst="rect">
                           <a:avLst/>
@@ -4068,7 +4081,7 @@
           </mc:Choice>
           <mc:Fallback>
             <w:pict>
-              <v:shape w14:anchorId="28E1CE9D" id="_x0000_s1050" type="#_x0000_t202" style="position:absolute;margin-left:87pt;margin-top:748.9pt;width:74.25pt;height:27.8pt;z-index:251608064;visibility:visible;mso-wrap-style:square;mso-width-percent:0;mso-wrap-distance-left:9pt;mso-wrap-distance-top:0;mso-wrap-distance-right:9pt;mso-wrap-distance-bottom:0;mso-position-horizontal:absolute;mso-position-horizontal-relative:text;mso-position-vertical:absolute;mso-position-vertical-relative:text;mso-width-percent:0;mso-width-relative:margin;v-text-anchor:top" o:gfxdata="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" filled="f" stroked="f">
+              <v:shape w14:anchorId="28E1CE9D" id="_x0000_s1050" type="#_x0000_t202" style="position:absolute;margin-left:87pt;margin-top:749pt;width:207.35pt;height:27.8pt;z-index:251608064;visibility:visible;mso-wrap-style:square;mso-width-percent:0;mso-wrap-distance-left:9pt;mso-wrap-distance-top:0;mso-wrap-distance-right:9pt;mso-wrap-distance-bottom:0;mso-position-horizontal:absolute;mso-position-horizontal-relative:text;mso-position-vertical:absolute;mso-position-vertical-relative:text;mso-width-percent:0;mso-width-relative:margin;v-text-anchor:top" o:gfxdata="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" filled="f" stroked="f">
                 <v:textbox>
                   <w:txbxContent>
                     <w:p>
@@ -4137,7 +4150,7 @@
         <mc:AlternateContent>
           <mc:Choice Requires="wps">
             <w:drawing>
-              <wp:anchor distT="0" distB="0" distL="114300" distR="114300" simplePos="0" relativeHeight="251610112" behindDoc="0" locked="0" layoutInCell="1" allowOverlap="1" wp14:anchorId="6D86EA0E" wp14:editId="6D8ABE5D">
+              <wp:anchor distT="0" distB="0" distL="114300" distR="114300" simplePos="0" relativeHeight="251610112" behindDoc="0" locked="0" layoutInCell="1" allowOverlap="1" wp14:anchorId="6D86EA0E" wp14:editId="6454B168">
                 <wp:simplePos x="0" y="0"/>
                 <wp:positionH relativeFrom="column">
                   <wp:posOffset>4042516</wp:posOffset>
@@ -4231,7 +4244,7 @@
           </mc:Choice>
           <mc:Fallback>
             <w:pict>
-              <v:shape w14:anchorId="6D86EA0E" id="_x0000_s1051" type="#_x0000_t202" style="position:absolute;margin-left:318.3pt;margin-top:748.9pt;width:62.45pt;height:27.8pt;z-index:251610112;visibility:visible;mso-wrap-style:square;mso-wrap-distance-left:9pt;mso-wrap-distance-top:0;mso-wrap-distance-right:9pt;mso-wrap-distance-bottom:0;mso-position-horizontal:absolute;mso-position-horizontal-relative:text;mso-position-vertical:absolute;mso-position-vertical-relative:text;v-text-anchor:top" o:gfxdata="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" filled="f" stroked="f">
+              <v:shape w14:anchorId="6D86EA0E" id="_x0000_s1051" type="#_x0000_t202" style="position:absolute;margin-left:318.3pt;margin-top:748.9pt;width:62.45pt;height:27.8pt;z-index:251610112;visibility:visible;mso-wrap-style:square;mso-wrap-distance-left:9pt;mso-wrap-distance-top:0;mso-wrap-distance-right:9pt;mso-wrap-distance-bottom:0;mso-position-horizontal:absolute;mso-position-horizontal-relative:text;mso-position-vertical:absolute;mso-position-vertical-relative:text;v-text-anchor:top" o:gfxdata="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" filled="f" stroked="f">
                 <v:textbox>
                   <w:txbxContent>
                     <w:p>
@@ -4291,15 +4304,15 @@
         <mc:AlternateContent>
           <mc:Choice Requires="wps">
             <w:drawing>
-              <wp:anchor distT="0" distB="0" distL="114300" distR="114300" simplePos="0" relativeHeight="251612160" behindDoc="0" locked="0" layoutInCell="1" allowOverlap="1" wp14:anchorId="52EB9488" wp14:editId="7EB5D83D">
+              <wp:anchor distT="0" distB="0" distL="114300" distR="114300" simplePos="0" relativeHeight="251612160" behindDoc="0" locked="0" layoutInCell="1" allowOverlap="1" wp14:anchorId="52EB9488" wp14:editId="3F2DFFFF">
                 <wp:simplePos x="0" y="0"/>
                 <wp:positionH relativeFrom="column">
-                  <wp:posOffset>1104899</wp:posOffset>
+                  <wp:posOffset>1104900</wp:posOffset>
                 </wp:positionH>
                 <wp:positionV relativeFrom="paragraph">
-                  <wp:posOffset>9739313</wp:posOffset>
+                  <wp:posOffset>9740900</wp:posOffset>
                 </wp:positionV>
-                <wp:extent cx="942975" cy="353120"/>
+                <wp:extent cx="2633345" cy="353120"/>
                 <wp:effectExtent l="0" t="0" r="0" b="0"/>
                 <wp:wrapNone/>
                 <wp:docPr id="476088175" name="Text Box 2"/>
@@ -4315,7 +4328,7 @@
                       <wps:spPr bwMode="auto">
                         <a:xfrm>
                           <a:off x="0" y="0"/>
-                          <a:ext cx="942975" cy="353120"/>
+                          <a:ext cx="2633345" cy="353120"/>
                         </a:xfrm>
                         <a:prstGeom prst="rect">
                           <a:avLst/>
@@ -4397,7 +4410,7 @@
           </mc:Choice>
           <mc:Fallback>
             <w:pict>
-              <v:shape w14:anchorId="52EB9488" id="_x0000_s1052" type="#_x0000_t202" style="position:absolute;margin-left:87pt;margin-top:766.9pt;width:74.25pt;height:27.8pt;z-index:251612160;visibility:visible;mso-wrap-style:square;mso-width-percent:0;mso-wrap-distance-left:9pt;mso-wrap-distance-top:0;mso-wrap-distance-right:9pt;mso-wrap-distance-bottom:0;mso-position-horizontal:absolute;mso-position-horizontal-relative:text;mso-position-vertical:absolute;mso-position-vertical-relative:text;mso-width-percent:0;mso-width-relative:margin;v-text-anchor:top" o:gfxdata="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" filled="f" stroked="f">
+              <v:shape w14:anchorId="52EB9488" id="_x0000_s1052" type="#_x0000_t202" style="position:absolute;margin-left:87pt;margin-top:767pt;width:207.35pt;height:27.8pt;z-index:251612160;visibility:visible;mso-wrap-style:square;mso-width-percent:0;mso-wrap-distance-left:9pt;mso-wrap-distance-top:0;mso-wrap-distance-right:9pt;mso-wrap-distance-bottom:0;mso-position-horizontal:absolute;mso-position-horizontal-relative:text;mso-position-vertical:absolute;mso-position-vertical-relative:text;mso-width-percent:0;mso-width-relative:margin;v-text-anchor:top" o:gfxdata="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" filled="f" stroked="f">
                 <v:textbox>
                   <w:txbxContent>
                     <w:p>
@@ -4466,7 +4479,7 @@
         <mc:AlternateContent>
           <mc:Choice Requires="wps">
             <w:drawing>
-              <wp:anchor distT="0" distB="0" distL="114300" distR="114300" simplePos="0" relativeHeight="251614208" behindDoc="0" locked="0" layoutInCell="1" allowOverlap="1" wp14:anchorId="32AE654D" wp14:editId="21359014">
+              <wp:anchor distT="0" distB="0" distL="114300" distR="114300" simplePos="0" relativeHeight="251614208" behindDoc="0" locked="0" layoutInCell="1" allowOverlap="1" wp14:anchorId="32AE654D" wp14:editId="0B04BB95">
                 <wp:simplePos x="0" y="0"/>
                 <wp:positionH relativeFrom="column">
                   <wp:posOffset>4042516</wp:posOffset>
@@ -4560,7 +4573,7 @@
           </mc:Choice>
           <mc:Fallback>
             <w:pict>
-              <v:shape w14:anchorId="32AE654D" id="_x0000_s1053" type="#_x0000_t202" style="position:absolute;margin-left:318.3pt;margin-top:766.9pt;width:62.45pt;height:27.8pt;z-index:251614208;visibility:visible;mso-wrap-style:square;mso-wrap-distance-left:9pt;mso-wrap-distance-top:0;mso-wrap-distance-right:9pt;mso-wrap-distance-bottom:0;mso-position-horizontal:absolute;mso-position-horizontal-relative:text;mso-position-vertical:absolute;mso-position-vertical-relative:text;v-text-anchor:top" o:gfxdata="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" filled="f" stroked="f">
+              <v:shape w14:anchorId="32AE654D" id="_x0000_s1053" type="#_x0000_t202" style="position:absolute;margin-left:318.3pt;margin-top:766.9pt;width:62.45pt;height:27.8pt;z-index:251614208;visibility:visible;mso-wrap-style:square;mso-wrap-distance-left:9pt;mso-wrap-distance-top:0;mso-wrap-distance-right:9pt;mso-wrap-distance-bottom:0;mso-position-horizontal:absolute;mso-position-horizontal-relative:text;mso-position-vertical:absolute;mso-position-vertical-relative:text;v-text-anchor:top" o:gfxdata="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" filled="f" stroked="f">
                 <v:textbox>
                   <w:txbxContent>
                     <w:p>
@@ -4620,15 +4633,15 @@
         <mc:AlternateContent>
           <mc:Choice Requires="wps">
             <w:drawing>
-              <wp:anchor distT="0" distB="0" distL="114300" distR="114300" simplePos="0" relativeHeight="251616256" behindDoc="0" locked="0" layoutInCell="1" allowOverlap="1" wp14:anchorId="277E110F" wp14:editId="1EE502BE">
+              <wp:anchor distT="0" distB="0" distL="114300" distR="114300" simplePos="0" relativeHeight="251616256" behindDoc="0" locked="0" layoutInCell="1" allowOverlap="1" wp14:anchorId="277E110F" wp14:editId="62C2A670">
                 <wp:simplePos x="0" y="0"/>
                 <wp:positionH relativeFrom="column">
-                  <wp:posOffset>1104899</wp:posOffset>
+                  <wp:posOffset>1104900</wp:posOffset>
                 </wp:positionH>
                 <wp:positionV relativeFrom="paragraph">
-                  <wp:posOffset>9996488</wp:posOffset>
+                  <wp:posOffset>9994900</wp:posOffset>
                 </wp:positionV>
-                <wp:extent cx="942975" cy="353120"/>
+                <wp:extent cx="2633345" cy="353120"/>
                 <wp:effectExtent l="0" t="0" r="0" b="0"/>
                 <wp:wrapNone/>
                 <wp:docPr id="476088179" name="Text Box 2"/>
@@ -4644,7 +4657,7 @@
                       <wps:spPr bwMode="auto">
                         <a:xfrm>
                           <a:off x="0" y="0"/>
-                          <a:ext cx="942975" cy="353120"/>
+                          <a:ext cx="2633345" cy="353120"/>
                         </a:xfrm>
                         <a:prstGeom prst="rect">
                           <a:avLst/>
@@ -4726,7 +4739,7 @@
           </mc:Choice>
           <mc:Fallback>
             <w:pict>
-              <v:shape w14:anchorId="277E110F" id="_x0000_s1054" type="#_x0000_t202" style="position:absolute;margin-left:87pt;margin-top:787.15pt;width:74.25pt;height:27.8pt;z-index:251616256;visibility:visible;mso-wrap-style:square;mso-width-percent:0;mso-wrap-distance-left:9pt;mso-wrap-distance-top:0;mso-wrap-distance-right:9pt;mso-wrap-distance-bottom:0;mso-position-horizontal:absolute;mso-position-horizontal-relative:text;mso-position-vertical:absolute;mso-position-vertical-relative:text;mso-width-percent:0;mso-width-relative:margin;v-text-anchor:top" o:gfxdata="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" filled="f" stroked="f">
+              <v:shape w14:anchorId="277E110F" id="_x0000_s1054" type="#_x0000_t202" style="position:absolute;margin-left:87pt;margin-top:787pt;width:207.35pt;height:27.8pt;z-index:251616256;visibility:visible;mso-wrap-style:square;mso-width-percent:0;mso-wrap-distance-left:9pt;mso-wrap-distance-top:0;mso-wrap-distance-right:9pt;mso-wrap-distance-bottom:0;mso-position-horizontal:absolute;mso-position-horizontal-relative:text;mso-position-vertical:absolute;mso-position-vertical-relative:text;mso-width-percent:0;mso-width-relative:margin;v-text-anchor:top" o:gfxdata="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" filled="f" stroked="f">
                 <v:textbox>
                   <w:txbxContent>
                     <w:p>
@@ -4889,7 +4902,7 @@
           </mc:Choice>
           <mc:Fallback>
             <w:pict>
-              <v:shape w14:anchorId="3E7E08D8" id="_x0000_s1055" type="#_x0000_t202" style="position:absolute;margin-left:318.3pt;margin-top:787.15pt;width:62.45pt;height:27.8pt;z-index:251618304;visibility:visible;mso-wrap-style:square;mso-wrap-distance-left:9pt;mso-wrap-distance-top:0;mso-wrap-distance-right:9pt;mso-wrap-distance-bottom:0;mso-position-horizontal:absolute;mso-position-horizontal-relative:text;mso-position-vertical:absolute;mso-position-vertical-relative:text;v-text-anchor:top" o:gfxdata="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" filled="f" stroked="f">
+              <v:shape w14:anchorId="3E7E08D8" id="_x0000_s1055" type="#_x0000_t202" style="position:absolute;margin-left:318.3pt;margin-top:787.15pt;width:62.45pt;height:27.8pt;z-index:251618304;visibility:visible;mso-wrap-style:square;mso-wrap-distance-left:9pt;mso-wrap-distance-top:0;mso-wrap-distance-right:9pt;mso-wrap-distance-bottom:0;mso-position-horizontal:absolute;mso-position-horizontal-relative:text;mso-position-vertical:absolute;mso-position-vertical-relative:text;v-text-anchor:top" o:gfxdata="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" filled="f" stroked="f">
                 <v:textbox>
                   <w:txbxContent>
                     <w:p>
@@ -5048,7 +5061,7 @@
           </mc:Choice>
           <mc:Fallback>
             <w:pict>
-              <v:shape w14:anchorId="2F42F977" id="_x0000_s1056" type="#_x0000_t202" style="position:absolute;margin-left:153.35pt;margin-top:231.4pt;width:238.1pt;height:34pt;z-index:251541504;visibility:visible;mso-wrap-style:square;mso-wrap-distance-left:9pt;mso-wrap-distance-top:0;mso-wrap-distance-right:9pt;mso-wrap-distance-bottom:0;mso-position-horizontal:absolute;mso-position-horizontal-relative:text;mso-position-vertical:absolute;mso-position-vertical-relative:text;v-text-anchor:top" o:gfxdata="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" filled="f" stroked="f">
+              <v:shape w14:anchorId="2F42F977" id="_x0000_s1056" type="#_x0000_t202" style="position:absolute;margin-left:153.35pt;margin-top:231.4pt;width:238.1pt;height:34pt;z-index:251541504;visibility:visible;mso-wrap-style:square;mso-wrap-distance-left:9pt;mso-wrap-distance-top:0;mso-wrap-distance-right:9pt;mso-wrap-distance-bottom:0;mso-position-horizontal:absolute;mso-position-horizontal-relative:text;mso-position-vertical:absolute;mso-position-vertical-relative:text;v-text-anchor:top" o:gfxdata="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" filled="f" stroked="f">
                 <v:textbox style="mso-fit-shape-to-text:t">
                   <w:txbxContent>
                     <w:p>
@@ -5210,7 +5223,7 @@
           </mc:Choice>
           <mc:Fallback>
             <w:pict>
-              <v:shape w14:anchorId="57715A05" id="_x0000_s1057" type="#_x0000_t202" style="position:absolute;margin-left:98.9pt;margin-top:287.2pt;width:104.05pt;height:31.7pt;z-index:251542528;visibility:visible;mso-wrap-style:square;mso-wrap-distance-left:9pt;mso-wrap-distance-top:0;mso-wrap-distance-right:9pt;mso-wrap-distance-bottom:0;mso-position-horizontal:absolute;mso-position-horizontal-relative:text;mso-position-vertical:absolute;mso-position-vertical-relative:text;v-text-anchor:top" o:gfxdata="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" filled="f" stroked="f">
+              <v:shape w14:anchorId="57715A05" id="_x0000_s1057" type="#_x0000_t202" style="position:absolute;margin-left:98.9pt;margin-top:287.2pt;width:104.05pt;height:31.7pt;z-index:251542528;visibility:visible;mso-wrap-style:square;mso-wrap-distance-left:9pt;mso-wrap-distance-top:0;mso-wrap-distance-right:9pt;mso-wrap-distance-bottom:0;mso-position-horizontal:absolute;mso-position-horizontal-relative:text;mso-position-vertical:absolute;mso-position-vertical-relative:text;v-text-anchor:top" o:gfxdata="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" filled="f" stroked="f">
                 <v:textbox style="mso-fit-shape-to-text:t">
                   <w:txbxContent>
                     <w:p>
@@ -5372,7 +5385,7 @@
           </mc:Choice>
           <mc:Fallback>
             <w:pict>
-              <v:shape w14:anchorId="74129D1C" id="_x0000_s1058" type="#_x0000_t202" style="position:absolute;margin-left:302.05pt;margin-top:287.4pt;width:154.3pt;height:31.7pt;z-index:251543552;visibility:visible;mso-wrap-style:square;mso-wrap-distance-left:9pt;mso-wrap-distance-top:0;mso-wrap-distance-right:9pt;mso-wrap-distance-bottom:0;mso-position-horizontal:absolute;mso-position-horizontal-relative:text;mso-position-vertical:absolute;mso-position-vertical-relative:text;v-text-anchor:top" o:gfxdata="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" filled="f" stroked="f">
+              <v:shape w14:anchorId="74129D1C" id="_x0000_s1058" type="#_x0000_t202" style="position:absolute;margin-left:302.05pt;margin-top:287.4pt;width:154.3pt;height:31.7pt;z-index:251543552;visibility:visible;mso-wrap-style:square;mso-wrap-distance-left:9pt;mso-wrap-distance-top:0;mso-wrap-distance-right:9pt;mso-wrap-distance-bottom:0;mso-position-horizontal:absolute;mso-position-horizontal-relative:text;mso-position-vertical:absolute;mso-position-vertical-relative:text;v-text-anchor:top" o:gfxdata="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" filled="f" stroked="f">
                 <v:textbox style="mso-fit-shape-to-text:t">
                   <w:txbxContent>
                     <w:p>
@@ -5532,7 +5545,7 @@
           </mc:Choice>
           <mc:Fallback>
             <w:pict>
-              <v:shape w14:anchorId="00D3E90F" id="_x0000_s1059" type="#_x0000_t202" style="position:absolute;margin-left:193.45pt;margin-top:327.45pt;width:91.95pt;height:27.85pt;z-index:251544576;visibility:visible;mso-wrap-style:square;mso-wrap-distance-left:9pt;mso-wrap-distance-top:0;mso-wrap-distance-right:9pt;mso-wrap-distance-bottom:0;mso-position-horizontal:absolute;mso-position-horizontal-relative:text;mso-position-vertical:absolute;mso-position-vertical-relative:text;v-text-anchor:top" o:gfxdata="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" filled="f" stroked="f">
+              <v:shape w14:anchorId="00D3E90F" id="_x0000_s1059" type="#_x0000_t202" style="position:absolute;margin-left:193.45pt;margin-top:327.45pt;width:91.95pt;height:27.85pt;z-index:251544576;visibility:visible;mso-wrap-style:square;mso-wrap-distance-left:9pt;mso-wrap-distance-top:0;mso-wrap-distance-right:9pt;mso-wrap-distance-bottom:0;mso-position-horizontal:absolute;mso-position-horizontal-relative:text;mso-position-vertical:absolute;mso-position-vertical-relative:text;v-text-anchor:top" o:gfxdata="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" filled="f" stroked="f">
                 <v:textbox>
                   <w:txbxContent>
                     <w:p>
@@ -5688,7 +5701,7 @@
           </mc:Choice>
           <mc:Fallback>
             <w:pict>
-              <v:shape w14:anchorId="161CA5DB" id="_x0000_s1060" type="#_x0000_t202" style="position:absolute;margin-left:330.55pt;margin-top:327.8pt;width:91.95pt;height:27.85pt;z-index:251545600;visibility:visible;mso-wrap-style:square;mso-wrap-distance-left:9pt;mso-wrap-distance-top:0;mso-wrap-distance-right:9pt;mso-wrap-distance-bottom:0;mso-position-horizontal:absolute;mso-position-horizontal-relative:text;mso-position-vertical:absolute;mso-position-vertical-relative:text;v-text-anchor:top" o:gfxdata="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" filled="f" stroked="f">
+              <v:shape w14:anchorId="161CA5DB" id="_x0000_s1060" type="#_x0000_t202" style="position:absolute;margin-left:330.55pt;margin-top:327.8pt;width:91.95pt;height:27.85pt;z-index:251545600;visibility:visible;mso-wrap-style:square;mso-wrap-distance-left:9pt;mso-wrap-distance-top:0;mso-wrap-distance-right:9pt;mso-wrap-distance-bottom:0;mso-position-horizontal:absolute;mso-position-horizontal-relative:text;mso-position-vertical:absolute;mso-position-vertical-relative:text;v-text-anchor:top" o:gfxdata="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" filled="f" stroked="f">
                 <v:textbox>
                   <w:txbxContent>
                     <w:p>
@@ -5854,7 +5867,7 @@
           </mc:Choice>
           <mc:Fallback>
             <w:pict>
-              <v:shape w14:anchorId="58791664" id="_x0000_s1061" type="#_x0000_t202" style="position:absolute;margin-left:146.5pt;margin-top:401.05pt;width:91.95pt;height:27.85pt;z-index:251546624;visibility:visible;mso-wrap-style:square;mso-wrap-distance-left:9pt;mso-wrap-distance-top:0;mso-wrap-distance-right:9pt;mso-wrap-distance-bottom:0;mso-position-horizontal:absolute;mso-position-horizontal-relative:text;mso-position-vertical:absolute;mso-position-vertical-relative:text;v-text-anchor:top" o:gfxdata="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" filled="f" stroked="f">
+              <v:shape w14:anchorId="58791664" id="_x0000_s1061" type="#_x0000_t202" style="position:absolute;margin-left:146.5pt;margin-top:401.05pt;width:91.95pt;height:27.85pt;z-index:251546624;visibility:visible;mso-wrap-style:square;mso-wrap-distance-left:9pt;mso-wrap-distance-top:0;mso-wrap-distance-right:9pt;mso-wrap-distance-bottom:0;mso-position-horizontal:absolute;mso-position-horizontal-relative:text;mso-position-vertical:absolute;mso-position-vertical-relative:text;v-text-anchor:top" o:gfxdata="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" filled="f" stroked="f">
                 <v:textbox>
                   <w:txbxContent>
                     <w:p>
@@ -6020,7 +6033,7 @@
           </mc:Choice>
           <mc:Fallback>
             <w:pict>
-              <v:shape w14:anchorId="5D2FFCB0" id="_x0000_s1062" type="#_x0000_t202" style="position:absolute;margin-left:310.2pt;margin-top:401.65pt;width:91.95pt;height:27.85pt;z-index:251547648;visibility:visible;mso-wrap-style:square;mso-wrap-distance-left:9pt;mso-wrap-distance-top:0;mso-wrap-distance-right:9pt;mso-wrap-distance-bottom:0;mso-position-horizontal:absolute;mso-position-horizontal-relative:text;mso-position-vertical:absolute;mso-position-vertical-relative:text;v-text-anchor:top" o:gfxdata="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" filled="f" stroked="f">
+              <v:shape w14:anchorId="5D2FFCB0" id="_x0000_s1062" type="#_x0000_t202" style="position:absolute;margin-left:310.2pt;margin-top:401.65pt;width:91.95pt;height:27.85pt;z-index:251547648;visibility:visible;mso-wrap-style:square;mso-wrap-distance-left:9pt;mso-wrap-distance-top:0;mso-wrap-distance-right:9pt;mso-wrap-distance-bottom:0;mso-position-horizontal:absolute;mso-position-horizontal-relative:text;mso-position-vertical:absolute;mso-position-vertical-relative:text;v-text-anchor:top" o:gfxdata="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" filled="f" stroked="f">
                 <v:textbox>
                   <w:txbxContent>
                     <w:p>
@@ -6176,7 +6189,7 @@
           </mc:Choice>
           <mc:Fallback>
             <w:pict>
-              <v:shape w14:anchorId="67A1A911" id="_x0000_s1063" type="#_x0000_t202" style="position:absolute;margin-left:487.4pt;margin-top:401.65pt;width:91.95pt;height:27.85pt;z-index:251548672;visibility:visible;mso-wrap-style:square;mso-wrap-distance-left:9pt;mso-wrap-distance-top:0;mso-wrap-distance-right:9pt;mso-wrap-distance-bottom:0;mso-position-horizontal:absolute;mso-position-horizontal-relative:text;mso-position-vertical:absolute;mso-position-vertical-relative:text;v-text-anchor:top" o:gfxdata="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" filled="f" stroked="f">
+              <v:shape w14:anchorId="67A1A911" id="_x0000_s1063" type="#_x0000_t202" style="position:absolute;margin-left:487.4pt;margin-top:401.65pt;width:91.95pt;height:27.85pt;z-index:251548672;visibility:visible;mso-wrap-style:square;mso-wrap-distance-left:9pt;mso-wrap-distance-top:0;mso-wrap-distance-right:9pt;mso-wrap-distance-bottom:0;mso-position-horizontal:absolute;mso-position-horizontal-relative:text;mso-position-vertical:absolute;mso-position-vertical-relative:text;v-text-anchor:top" o:gfxdata="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" filled="f" stroked="f">
                 <v:textbox>
                   <w:txbxContent>
                     <w:p>
@@ -6336,7 +6349,7 @@
           </mc:Choice>
           <mc:Fallback>
             <w:pict>
-              <v:shape w14:anchorId="08176325" id="_x0000_s1064" type="#_x0000_t202" style="position:absolute;margin-left:85.15pt;margin-top:468pt;width:91.95pt;height:27.85pt;z-index:251549696;visibility:visible;mso-wrap-style:square;mso-wrap-distance-left:9pt;mso-wrap-distance-top:0;mso-wrap-distance-right:9pt;mso-wrap-distance-bottom:0;mso-position-horizontal:absolute;mso-position-horizontal-relative:text;mso-position-vertical:absolute;mso-position-vertical-relative:text;v-text-anchor:top" o:gfxdata="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" filled="f" stroked="f">
+              <v:shape w14:anchorId="08176325" id="_x0000_s1064" type="#_x0000_t202" style="position:absolute;margin-left:85.15pt;margin-top:468pt;width:91.95pt;height:27.85pt;z-index:251549696;visibility:visible;mso-wrap-style:square;mso-wrap-distance-left:9pt;mso-wrap-distance-top:0;mso-wrap-distance-right:9pt;mso-wrap-distance-bottom:0;mso-position-horizontal:absolute;mso-position-horizontal-relative:text;mso-position-vertical:absolute;mso-position-vertical-relative:text;v-text-anchor:top" o:gfxdata="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" filled="f" stroked="f">
                 <v:textbox>
                   <w:txbxContent>
                     <w:p>
@@ -6500,7 +6513,7 @@
           </mc:Choice>
           <mc:Fallback>
             <w:pict>
-              <v:shape w14:anchorId="228C3DA1" id="_x0000_s1065" type="#_x0000_t202" style="position:absolute;margin-left:275.75pt;margin-top:458.3pt;width:91.95pt;height:27.85pt;z-index:251550720;visibility:visible;mso-wrap-style:square;mso-wrap-distance-left:9pt;mso-wrap-distance-top:0;mso-wrap-distance-right:9pt;mso-wrap-distance-bottom:0;mso-position-horizontal:absolute;mso-position-horizontal-relative:text;mso-position-vertical:absolute;mso-position-vertical-relative:text;v-text-anchor:top" o:gfxdata="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" filled="f" stroked="f">
+              <v:shape w14:anchorId="228C3DA1" id="_x0000_s1065" type="#_x0000_t202" style="position:absolute;margin-left:275.75pt;margin-top:458.3pt;width:91.95pt;height:27.85pt;z-index:251550720;visibility:visible;mso-wrap-style:square;mso-wrap-distance-left:9pt;mso-wrap-distance-top:0;mso-wrap-distance-right:9pt;mso-wrap-distance-bottom:0;mso-position-horizontal:absolute;mso-position-horizontal-relative:text;mso-position-vertical:absolute;mso-position-vertical-relative:text;v-text-anchor:top" o:gfxdata="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" filled="f" stroked="f">
                 <v:textbox>
                   <w:txbxContent>
                     <w:p>
@@ -6664,7 +6677,7 @@
           </mc:Choice>
           <mc:Fallback>
             <w:pict>
-              <v:shape w14:anchorId="1EEBF4A8" id="_x0000_s1066" type="#_x0000_t202" style="position:absolute;margin-left:275.75pt;margin-top:478.65pt;width:91.95pt;height:27.85pt;z-index:251551744;visibility:visible;mso-wrap-style:square;mso-wrap-distance-left:9pt;mso-wrap-distance-top:0;mso-wrap-distance-right:9pt;mso-wrap-distance-bottom:0;mso-position-horizontal:absolute;mso-position-horizontal-relative:text;mso-position-vertical:absolute;mso-position-vertical-relative:text;v-text-anchor:top" o:gfxdata="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" filled="f" stroked="f">
+              <v:shape w14:anchorId="1EEBF4A8" id="_x0000_s1066" type="#_x0000_t202" style="position:absolute;margin-left:275.75pt;margin-top:478.65pt;width:91.95pt;height:27.85pt;z-index:251551744;visibility:visible;mso-wrap-style:square;mso-wrap-distance-left:9pt;mso-wrap-distance-top:0;mso-wrap-distance-right:9pt;mso-wrap-distance-bottom:0;mso-position-horizontal:absolute;mso-position-horizontal-relative:text;mso-position-vertical:absolute;mso-position-vertical-relative:text;v-text-anchor:top" o:gfxdata="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" filled="f" stroked="f">
                 <v:textbox>
                   <w:txbxContent>
                     <w:p>
@@ -6828,7 +6841,7 @@
           </mc:Choice>
           <mc:Fallback>
             <w:pict>
-              <v:shape w14:anchorId="22408A95" id="_x0000_s1067" type="#_x0000_t202" style="position:absolute;margin-left:458.9pt;margin-top:458pt;width:91.95pt;height:27.85pt;z-index:251552768;visibility:visible;mso-wrap-style:square;mso-wrap-distance-left:9pt;mso-wrap-distance-top:0;mso-wrap-distance-right:9pt;mso-wrap-distance-bottom:0;mso-position-horizontal:absolute;mso-position-horizontal-relative:text;mso-position-vertical:absolute;mso-position-vertical-relative:text;v-text-anchor:top" o:gfxdata="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" filled="f" stroked="f">
+              <v:shape w14:anchorId="22408A95" id="_x0000_s1067" type="#_x0000_t202" style="position:absolute;margin-left:458.9pt;margin-top:458pt;width:91.95pt;height:27.85pt;z-index:251552768;visibility:visible;mso-wrap-style:square;mso-wrap-distance-left:9pt;mso-wrap-distance-top:0;mso-wrap-distance-right:9pt;mso-wrap-distance-bottom:0;mso-position-horizontal:absolute;mso-position-horizontal-relative:text;mso-position-vertical:absolute;mso-position-vertical-relative:text;v-text-anchor:top" o:gfxdata="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" filled="f" stroked="f">
                 <v:textbox>
                   <w:txbxContent>
                     <w:p>
@@ -6992,7 +7005,7 @@
           </mc:Choice>
           <mc:Fallback>
             <w:pict>
-              <v:shape w14:anchorId="2F77F74D" id="_x0000_s1068" type="#_x0000_t202" style="position:absolute;margin-left:458.9pt;margin-top:478.35pt;width:91.95pt;height:27.85pt;z-index:251553792;visibility:visible;mso-wrap-style:square;mso-wrap-distance-left:9pt;mso-wrap-distance-top:0;mso-wrap-distance-right:9pt;mso-wrap-distance-bottom:0;mso-position-horizontal:absolute;mso-position-horizontal-relative:text;mso-position-vertical:absolute;mso-position-vertical-relative:text;v-text-anchor:top" o:gfxdata="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" filled="f" stroked="f">
+              <v:shape w14:anchorId="2F77F74D" id="_x0000_s1068" type="#_x0000_t202" style="position:absolute;margin-left:458.9pt;margin-top:478.35pt;width:91.95pt;height:27.85pt;z-index:251553792;visibility:visible;mso-wrap-style:square;mso-wrap-distance-left:9pt;mso-wrap-distance-top:0;mso-wrap-distance-right:9pt;mso-wrap-distance-bottom:0;mso-position-horizontal:absolute;mso-position-horizontal-relative:text;mso-position-vertical:absolute;mso-position-vertical-relative:text;v-text-anchor:top" o:gfxdata="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" filled="f" stroked="f">
                 <v:textbox>
                   <w:txbxContent>
                     <w:p>
@@ -7153,7 +7166,7 @@
           </mc:Choice>
           <mc:Fallback>
             <w:pict>
-              <v:shape w14:anchorId="31B8DE10" id="_x0000_s1069" type="#_x0000_t202" style="position:absolute;margin-left:236pt;margin-top:558.5pt;width:62.45pt;height:27.85pt;z-index:251554816;visibility:visible;mso-wrap-style:square;mso-wrap-distance-left:9pt;mso-wrap-distance-top:0;mso-wrap-distance-right:9pt;mso-wrap-distance-bottom:0;mso-position-horizontal:absolute;mso-position-horizontal-relative:text;mso-position-vertical:absolute;mso-position-vertical-relative:text;v-text-anchor:top" o:gfxdata="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" filled="f" stroked="f">
+              <v:shape w14:anchorId="31B8DE10" id="_x0000_s1069" type="#_x0000_t202" style="position:absolute;margin-left:236pt;margin-top:558.5pt;width:62.45pt;height:27.85pt;z-index:251554816;visibility:visible;mso-wrap-style:square;mso-wrap-distance-left:9pt;mso-wrap-distance-top:0;mso-wrap-distance-right:9pt;mso-wrap-distance-bottom:0;mso-position-horizontal:absolute;mso-position-horizontal-relative:text;mso-position-vertical:absolute;mso-position-vertical-relative:text;v-text-anchor:top" o:gfxdata="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" filled="f" stroked="f">
                 <v:textbox>
                   <w:txbxContent>
                     <w:p>
@@ -7309,7 +7322,7 @@
           </mc:Choice>
           <mc:Fallback>
             <w:pict>
-              <v:shape w14:anchorId="594FDDC6" id="_x0000_s1070" type="#_x0000_t202" style="position:absolute;margin-left:327.1pt;margin-top:558.5pt;width:62.45pt;height:27.85pt;z-index:251555840;visibility:visible;mso-wrap-style:square;mso-wrap-distance-left:9pt;mso-wrap-distance-top:0;mso-wrap-distance-right:9pt;mso-wrap-distance-bottom:0;mso-position-horizontal:absolute;mso-position-horizontal-relative:text;mso-position-vertical:absolute;mso-position-vertical-relative:text;v-text-anchor:top" o:gfxdata="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" filled="f" stroked="f">
+              <v:shape w14:anchorId="594FDDC6" id="_x0000_s1070" type="#_x0000_t202" style="position:absolute;margin-left:327.1pt;margin-top:558.5pt;width:62.45pt;height:27.85pt;z-index:251555840;visibility:visible;mso-wrap-style:square;mso-wrap-distance-left:9pt;mso-wrap-distance-top:0;mso-wrap-distance-right:9pt;mso-wrap-distance-bottom:0;mso-position-horizontal:absolute;mso-position-horizontal-relative:text;mso-position-vertical:absolute;mso-position-vertical-relative:text;v-text-anchor:top" o:gfxdata="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" filled="f" stroked="f">
                 <v:textbox>
                   <w:txbxContent>
                     <w:p>
@@ -7465,7 +7478,7 @@
           </mc:Choice>
           <mc:Fallback>
             <w:pict>
-              <v:shape w14:anchorId="41FEAFD3" id="_x0000_s1071" type="#_x0000_t202" style="position:absolute;margin-left:442.3pt;margin-top:558.5pt;width:84.7pt;height:27.85pt;z-index:251556864;visibility:visible;mso-wrap-style:square;mso-wrap-distance-left:9pt;mso-wrap-distance-top:0;mso-wrap-distance-right:9pt;mso-wrap-distance-bottom:0;mso-position-horizontal:absolute;mso-position-horizontal-relative:text;mso-position-vertical:absolute;mso-position-vertical-relative:text;v-text-anchor:top" o:gfxdata="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" filled="f" stroked="f">
+              <v:shape w14:anchorId="41FEAFD3" id="_x0000_s1071" type="#_x0000_t202" style="position:absolute;margin-left:442.3pt;margin-top:558.5pt;width:84.7pt;height:27.85pt;z-index:251556864;visibility:visible;mso-wrap-style:square;mso-wrap-distance-left:9pt;mso-wrap-distance-top:0;mso-wrap-distance-right:9pt;mso-wrap-distance-bottom:0;mso-position-horizontal:absolute;mso-position-horizontal-relative:text;mso-position-vertical:absolute;mso-position-vertical-relative:text;v-text-anchor:top" o:gfxdata="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" filled="f" stroked="f">
                 <v:textbox>
                   <w:txbxContent>
                     <w:p>
@@ -7524,9 +7537,9 @@
           <w:noProof/>
         </w:rPr>
         <w:drawing>
-          <wp:inline distT="0" distB="0" distL="0" distR="0" wp14:anchorId="197F9C8F" wp14:editId="03EE8764">
+          <wp:inline distT="0" distB="0" distL="0" distR="0" wp14:anchorId="197F9C8F" wp14:editId="0901BC76">
             <wp:extent cx="7556500" cy="10693400"/>
-            <wp:effectExtent l="0" t="0" r="6350" b="0"/>
+            <wp:effectExtent l="0" t="0" r="8890" b="0"/>
             <wp:docPr id="1" name="Picture 1" descr="C:\Users\siripon.sri\AppData\Local\Temp\Rar$DRa4636.43458\siripon.sri_251215-135928-fa07_page-0001.jpg"/>
             <wp:cNvGraphicFramePr>
               <a:graphicFrameLocks xmlns:a="http://schemas.openxmlformats.org/drawingml/2006/main" noChangeAspect="1"/>
@@ -7581,6 +7594,194 @@
         <mc:AlternateContent>
           <mc:Choice Requires="wps">
             <w:drawing>
+              <wp:anchor distT="0" distB="0" distL="114300" distR="114300" simplePos="0" relativeHeight="251622400" behindDoc="0" locked="0" layoutInCell="1" allowOverlap="1" wp14:anchorId="775BD5D4" wp14:editId="3341CC90">
+                <wp:simplePos x="0" y="0"/>
+                <wp:positionH relativeFrom="column">
+                  <wp:posOffset>1130300</wp:posOffset>
+                </wp:positionH>
+                <wp:positionV relativeFrom="paragraph">
+                  <wp:posOffset>2400300</wp:posOffset>
+                </wp:positionV>
+                <wp:extent cx="2647950" cy="353060"/>
+                <wp:effectExtent l="0" t="0" r="0" b="0"/>
+                <wp:wrapNone/>
+                <wp:docPr id="476088185" name="Text Box 2"/>
+                <wp:cNvGraphicFramePr>
+                  <a:graphicFrameLocks xmlns:a="http://schemas.openxmlformats.org/drawingml/2006/main"/>
+                </wp:cNvGraphicFramePr>
+                <a:graphic xmlns:a="http://schemas.openxmlformats.org/drawingml/2006/main">
+                  <a:graphicData uri="http://schemas.microsoft.com/office/word/2010/wordprocessingShape">
+                    <wps:wsp>
+                      <wps:cNvSpPr txBox="1">
+                        <a:spLocks noChangeArrowheads="1"/>
+                      </wps:cNvSpPr>
+                      <wps:spPr bwMode="auto">
+                        <a:xfrm>
+                          <a:off x="0" y="0"/>
+                          <a:ext cx="2647950" cy="353060"/>
+                        </a:xfrm>
+                        <a:prstGeom prst="rect">
+                          <a:avLst/>
+                        </a:prstGeom>
+                        <a:noFill/>
+                        <a:ln>
+                          <a:noFill/>
+                          <a:headEnd/>
+                          <a:tailEnd/>
+                        </a:ln>
+                      </wps:spPr>
+                      <wps:style>
+                        <a:lnRef idx="2">
+                          <a:schemeClr val="accent2"/>
+                        </a:lnRef>
+                        <a:fillRef idx="1">
+                          <a:schemeClr val="lt1"/>
+                        </a:fillRef>
+                        <a:effectRef idx="0">
+                          <a:schemeClr val="accent2"/>
+                        </a:effectRef>
+                        <a:fontRef idx="minor">
+                          <a:schemeClr val="dk1"/>
+                        </a:fontRef>
+                      </wps:style>
+                      <wps:txbx>
+                        <w:txbxContent>
+                          <w:p>
+                            <w:pPr>
+                              <w:rPr>
+                                <w:rFonts w:ascii="TH SarabunPSK" w:hAnsi="TH SarabunPSK" w:cs="TH SarabunPSK"/>
+                                <w:b/>
+                                <w:bCs/>
+                                <w:color w:val="0049B7"/>
+                                <w:szCs w:val="24"/>
+                              </w:rPr>
+                            </w:pPr>
+                            <w:r>
+                              <w:rPr>
+                                <w:rFonts w:ascii="TH SarabunPSK" w:hAnsi="TH SarabunPSK" w:cs="TH SarabunPSK" w:hint="cs"/>
+                                <w:b/>
+                                <w:bCs/>
+                                <w:color w:val="0049B7"/>
+                                <w:szCs w:val="24"/>
+                              </w:rPr>
+                              <w:t>&lt;</w:t>
+                            </w:r>
+                            <w:r>
+                              <w:rPr>
+                                <w:rFonts w:ascii="TH SarabunPSK" w:hAnsi="TH SarabunPSK" w:cs="TH SarabunPSK"/>
+                                <w:b/>
+                                <w:bCs/>
+                                <w:color w:val="0049B7"/>
+                                <w:szCs w:val="24"/>
+                              </w:rPr>
+                              <w:t>tagNo</w:t>
+                            </w:r>
+                            <w:r>
+                              <w:rPr>
+                                <w:rFonts w:ascii="TH SarabunPSK" w:hAnsi="TH SarabunPSK" w:cs="TH SarabunPSK"/>
+                                <w:b/>
+                                <w:bCs/>
+                                <w:color w:val="0049B7"/>
+                                <w:szCs w:val="24"/>
+                              </w:rPr>
+                              <w:t>11</w:t>
+                            </w:r>
+                            <w:r>
+                              <w:rPr>
+                                <w:rFonts w:ascii="TH SarabunPSK" w:hAnsi="TH SarabunPSK" w:cs="TH SarabunPSK" w:hint="cs"/>
+                                <w:b/>
+                                <w:bCs/>
+                                <w:color w:val="0049B7"/>
+                                <w:szCs w:val="24"/>
+                              </w:rPr>
+                              <w:t>&gt;</w:t>
+                            </w:r>
+                          </w:p>
+                        </w:txbxContent>
+                      </wps:txbx>
+                      <wps:bodyPr rot="0" vert="horz" wrap="square" lIns="91440" tIns="45720" rIns="91440" bIns="45720" anchor="t" anchorCtr="0">
+                        <a:noAutofit/>
+                      </wps:bodyPr>
+                    </wps:wsp>
+                  </a:graphicData>
+                </a:graphic>
+                <wp14:sizeRelH relativeFrom="margin">
+                  <wp14:pctWidth>0</wp14:pctWidth>
+                </wp14:sizeRelH>
+              </wp:anchor>
+            </w:drawing>
+          </mc:Choice>
+          <mc:Fallback>
+            <w:pict>
+              <v:shape w14:anchorId="775BD5D4" id="_x0000_s1072" type="#_x0000_t202" style="position:absolute;margin-left:89pt;margin-top:189pt;width:208.5pt;height:27.8pt;z-index:251622400;visibility:visible;mso-wrap-style:square;mso-width-percent:0;mso-wrap-distance-left:9pt;mso-wrap-distance-top:0;mso-wrap-distance-right:9pt;mso-wrap-distance-bottom:0;mso-position-horizontal:absolute;mso-position-horizontal-relative:text;mso-position-vertical:absolute;mso-position-vertical-relative:text;mso-width-percent:0;mso-width-relative:margin;v-text-anchor:top" o:gfxdata="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" filled="f" stroked="f" strokeweight="1pt">
+                <v:textbox>
+                  <w:txbxContent>
+                    <w:p>
+                      <w:pPr>
+                        <w:rPr>
+                          <w:rFonts w:ascii="TH SarabunPSK" w:hAnsi="TH SarabunPSK" w:cs="TH SarabunPSK"/>
+                          <w:b/>
+                          <w:bCs/>
+                          <w:color w:val="0049B7"/>
+                          <w:szCs w:val="24"/>
+                        </w:rPr>
+                      </w:pPr>
+                      <w:r>
+                        <w:rPr>
+                          <w:rFonts w:ascii="TH SarabunPSK" w:hAnsi="TH SarabunPSK" w:cs="TH SarabunPSK" w:hint="cs"/>
+                          <w:b/>
+                          <w:bCs/>
+                          <w:color w:val="0049B7"/>
+                          <w:szCs w:val="24"/>
+                        </w:rPr>
+                        <w:t>&lt;</w:t>
+                      </w:r>
+                      <w:r>
+                        <w:rPr>
+                          <w:rFonts w:ascii="TH SarabunPSK" w:hAnsi="TH SarabunPSK" w:cs="TH SarabunPSK"/>
+                          <w:b/>
+                          <w:bCs/>
+                          <w:color w:val="0049B7"/>
+                          <w:szCs w:val="24"/>
+                        </w:rPr>
+                        <w:t>tagNo</w:t>
+                      </w:r>
+                      <w:r>
+                        <w:rPr>
+                          <w:rFonts w:ascii="TH SarabunPSK" w:hAnsi="TH SarabunPSK" w:cs="TH SarabunPSK"/>
+                          <w:b/>
+                          <w:bCs/>
+                          <w:color w:val="0049B7"/>
+                          <w:szCs w:val="24"/>
+                        </w:rPr>
+                        <w:t>11</w:t>
+                      </w:r>
+                      <w:r>
+                        <w:rPr>
+                          <w:rFonts w:ascii="TH SarabunPSK" w:hAnsi="TH SarabunPSK" w:cs="TH SarabunPSK" w:hint="cs"/>
+                          <w:b/>
+                          <w:bCs/>
+                          <w:color w:val="0049B7"/>
+                          <w:szCs w:val="24"/>
+                        </w:rPr>
+                        <w:t>&gt;</w:t>
+                      </w:r>
+                    </w:p>
+                  </w:txbxContent>
+                </v:textbox>
+              </v:shape>
+            </w:pict>
+          </mc:Fallback>
+        </mc:AlternateContent>
+      </w:r>
+      <w:r>
+        <w:rPr>
+          <w:noProof/>
+          <w14:ligatures w14:val="none"/>
+        </w:rPr>
+        <mc:AlternateContent>
+          <mc:Choice Requires="wps">
+            <w:drawing>
               <wp:anchor distT="0" distB="0" distL="114300" distR="114300" simplePos="0" relativeHeight="251703296" behindDoc="0" locked="0" layoutInCell="1" allowOverlap="1" wp14:anchorId="6CEF6920" wp14:editId="75EB616D">
                 <wp:simplePos x="0" y="0"/>
                 <wp:positionH relativeFrom="column">
@@ -7684,7 +7885,7 @@
           </mc:Choice>
           <mc:Fallback>
             <w:pict>
-              <v:shape w14:anchorId="6CEF6920" id="_x0000_s1072" type="#_x0000_t202" style="position:absolute;margin-left:145.55pt;margin-top:553.4pt;width:92.05pt;height:27.8pt;z-index:251703296;visibility:visible;mso-wrap-style:square;mso-wrap-distance-left:9pt;mso-wrap-distance-top:0;mso-wrap-distance-right:9pt;mso-wrap-distance-bottom:0;mso-position-horizontal:absolute;mso-position-horizontal-relative:text;mso-position-vertical:absolute;mso-position-vertical-relative:text;v-text-anchor:top" o:gfxdata="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" filled="f" stroked="f">
+              <v:shape w14:anchorId="6CEF6920" id="_x0000_s1073" type="#_x0000_t202" style="position:absolute;margin-left:145.55pt;margin-top:553.4pt;width:92.05pt;height:27.8pt;z-index:251703296;visibility:visible;mso-wrap-style:square;mso-wrap-distance-left:9pt;mso-wrap-distance-top:0;mso-wrap-distance-right:9pt;mso-wrap-distance-bottom:0;mso-position-horizontal:absolute;mso-position-horizontal-relative:text;mso-position-vertical:absolute;mso-position-vertical-relative:text;v-text-anchor:top" o:gfxdata="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" filled="f" stroked="f">
                 <v:textbox>
                   <w:txbxContent>
                     <w:p>
@@ -7856,7 +8057,7 @@
           </mc:Choice>
           <mc:Fallback>
             <w:pict>
-              <v:shape w14:anchorId="3A84EA49" id="_x0000_s1073" type="#_x0000_t202" style="position:absolute;margin-left:145.55pt;margin-top:533.15pt;width:92.05pt;height:27.8pt;z-index:251699200;visibility:visible;mso-wrap-style:square;mso-wrap-distance-left:9pt;mso-wrap-distance-top:0;mso-wrap-distance-right:9pt;mso-wrap-distance-bottom:0;mso-position-horizontal:absolute;mso-position-horizontal-relative:text;mso-position-vertical:absolute;mso-position-vertical-relative:text;v-text-anchor:top" o:gfxdata="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" filled="f" stroked="f">
+              <v:shape w14:anchorId="3A84EA49" id="_x0000_s1074" type="#_x0000_t202" style="position:absolute;margin-left:145.55pt;margin-top:533.15pt;width:92.05pt;height:27.8pt;z-index:251699200;visibility:visible;mso-wrap-style:square;mso-wrap-distance-left:9pt;mso-wrap-distance-top:0;mso-wrap-distance-right:9pt;mso-wrap-distance-bottom:0;mso-position-horizontal:absolute;mso-position-horizontal-relative:text;mso-position-vertical:absolute;mso-position-vertical-relative:text;v-text-anchor:top" o:gfxdata="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" filled="f" stroked="f">
                 <v:textbox>
                   <w:txbxContent>
                     <w:p>
@@ -8028,7 +8229,7 @@
           </mc:Choice>
           <mc:Fallback>
             <w:pict>
-              <v:shape w14:anchorId="62E877AA" id="_x0000_s1074" type="#_x0000_t202" style="position:absolute;margin-left:145.55pt;margin-top:515.15pt;width:92.05pt;height:27.8pt;z-index:251695104;visibility:visible;mso-wrap-style:square;mso-wrap-distance-left:9pt;mso-wrap-distance-top:0;mso-wrap-distance-right:9pt;mso-wrap-distance-bottom:0;mso-position-horizontal:absolute;mso-position-horizontal-relative:text;mso-position-vertical:absolute;mso-position-vertical-relative:text;v-text-anchor:top" o:gfxdata="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" filled="f" stroked="f">
+              <v:shape w14:anchorId="62E877AA" id="_x0000_s1075" type="#_x0000_t202" style="position:absolute;margin-left:145.55pt;margin-top:515.15pt;width:92.05pt;height:27.8pt;z-index:251695104;visibility:visible;mso-wrap-style:square;mso-wrap-distance-left:9pt;mso-wrap-distance-top:0;mso-wrap-distance-right:9pt;mso-wrap-distance-bottom:0;mso-position-horizontal:absolute;mso-position-horizontal-relative:text;mso-position-vertical:absolute;mso-position-vertical-relative:text;v-text-anchor:top" o:gfxdata="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" filled="f" stroked="f">
                 <v:textbox>
                   <w:txbxContent>
                     <w:p>
@@ -8200,7 +8401,7 @@
           </mc:Choice>
           <mc:Fallback>
             <w:pict>
-              <v:shape w14:anchorId="6DF1FB03" id="_x0000_s1075" type="#_x0000_t202" style="position:absolute;margin-left:145.55pt;margin-top:495.3pt;width:92.05pt;height:27.8pt;z-index:251691008;visibility:visible;mso-wrap-style:square;mso-wrap-distance-left:9pt;mso-wrap-distance-top:0;mso-wrap-distance-right:9pt;mso-wrap-distance-bottom:0;mso-position-horizontal:absolute;mso-position-horizontal-relative:text;mso-position-vertical:absolute;mso-position-vertical-relative:text;v-text-anchor:top" o:gfxdata="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" filled="f" stroked="f">
+              <v:shape w14:anchorId="6DF1FB03" id="_x0000_s1076" type="#_x0000_t202" style="position:absolute;margin-left:145.55pt;margin-top:495.3pt;width:92.05pt;height:27.8pt;z-index:251691008;visibility:visible;mso-wrap-style:square;mso-wrap-distance-left:9pt;mso-wrap-distance-top:0;mso-wrap-distance-right:9pt;mso-wrap-distance-bottom:0;mso-position-horizontal:absolute;mso-position-horizontal-relative:text;mso-position-vertical:absolute;mso-position-vertical-relative:text;v-text-anchor:top" o:gfxdata="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" filled="f" stroked="f">
                 <v:textbox>
                   <w:txbxContent>
                     <w:p>
@@ -8372,7 +8573,7 @@
           </mc:Choice>
           <mc:Fallback>
             <w:pict>
-              <v:shape w14:anchorId="3DC57F8F" id="_x0000_s1076" type="#_x0000_t202" style="position:absolute;margin-left:145.55pt;margin-top:476.9pt;width:92.05pt;height:27.8pt;z-index:251686912;visibility:visible;mso-wrap-style:square;mso-wrap-distance-left:9pt;mso-wrap-distance-top:0;mso-wrap-distance-right:9pt;mso-wrap-distance-bottom:0;mso-position-horizontal:absolute;mso-position-horizontal-relative:text;mso-position-vertical:absolute;mso-position-vertical-relative:text;v-text-anchor:top" o:gfxdata="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" filled="f" stroked="f">
+              <v:shape w14:anchorId="3DC57F8F" id="_x0000_s1077" type="#_x0000_t202" style="position:absolute;margin-left:145.55pt;margin-top:476.9pt;width:92.05pt;height:27.8pt;z-index:251686912;visibility:visible;mso-wrap-style:square;mso-wrap-distance-left:9pt;mso-wrap-distance-top:0;mso-wrap-distance-right:9pt;mso-wrap-distance-bottom:0;mso-position-horizontal:absolute;mso-position-horizontal-relative:text;mso-position-vertical:absolute;mso-position-vertical-relative:text;v-text-anchor:top" o:gfxdata="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" filled="f" stroked="f">
                 <v:textbox>
                   <w:txbxContent>
                     <w:p>
@@ -8544,7 +8745,7 @@
           </mc:Choice>
           <mc:Fallback>
             <w:pict>
-              <v:shape w14:anchorId="1EC7D5ED" id="_x0000_s1077" type="#_x0000_t202" style="position:absolute;margin-left:145.55pt;margin-top:457.05pt;width:92.05pt;height:27.8pt;z-index:251682816;visibility:visible;mso-wrap-style:square;mso-wrap-distance-left:9pt;mso-wrap-distance-top:0;mso-wrap-distance-right:9pt;mso-wrap-distance-bottom:0;mso-position-horizontal:absolute;mso-position-horizontal-relative:text;mso-position-vertical:absolute;mso-position-vertical-relative:text;v-text-anchor:top" o:gfxdata="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" filled="f" stroked="f">
+              <v:shape w14:anchorId="1EC7D5ED" id="_x0000_s1078" type="#_x0000_t202" style="position:absolute;margin-left:145.55pt;margin-top:457.05pt;width:92.05pt;height:27.8pt;z-index:251682816;visibility:visible;mso-wrap-style:square;mso-wrap-distance-left:9pt;mso-wrap-distance-top:0;mso-wrap-distance-right:9pt;mso-wrap-distance-bottom:0;mso-position-horizontal:absolute;mso-position-horizontal-relative:text;mso-position-vertical:absolute;mso-position-vertical-relative:text;v-text-anchor:top" o:gfxdata="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" filled="f" stroked="f">
                 <v:textbox>
                   <w:txbxContent>
                     <w:p>
@@ -8716,7 +8917,7 @@
           </mc:Choice>
           <mc:Fallback>
             <w:pict>
-              <v:shape w14:anchorId="0BDF7B36" id="_x0000_s1078" type="#_x0000_t202" style="position:absolute;margin-left:145.55pt;margin-top:437.9pt;width:92.05pt;height:27.8pt;z-index:251678720;visibility:visible;mso-wrap-style:square;mso-wrap-distance-left:9pt;mso-wrap-distance-top:0;mso-wrap-distance-right:9pt;mso-wrap-distance-bottom:0;mso-position-horizontal:absolute;mso-position-horizontal-relative:text;mso-position-vertical:absolute;mso-position-vertical-relative:text;v-text-anchor:top" o:gfxdata="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" filled="f" stroked="f">
+              <v:shape w14:anchorId="0BDF7B36" id="_x0000_s1079" type="#_x0000_t202" style="position:absolute;margin-left:145.55pt;margin-top:437.9pt;width:92.05pt;height:27.8pt;z-index:251678720;visibility:visible;mso-wrap-style:square;mso-wrap-distance-left:9pt;mso-wrap-distance-top:0;mso-wrap-distance-right:9pt;mso-wrap-distance-bottom:0;mso-position-horizontal:absolute;mso-position-horizontal-relative:text;mso-position-vertical:absolute;mso-position-vertical-relative:text;v-text-anchor:top" o:gfxdata="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" filled="f" stroked="f">
                 <v:textbox>
                   <w:txbxContent>
                     <w:p>
@@ -8888,7 +9089,7 @@
           </mc:Choice>
           <mc:Fallback>
             <w:pict>
-              <v:shape w14:anchorId="50E41A32" id="_x0000_s1079" type="#_x0000_t202" style="position:absolute;margin-left:145.55pt;margin-top:418.05pt;width:92.05pt;height:27.8pt;z-index:251674624;visibility:visible;mso-wrap-style:square;mso-wrap-distance-left:9pt;mso-wrap-distance-top:0;mso-wrap-distance-right:9pt;mso-wrap-distance-bottom:0;mso-position-horizontal:absolute;mso-position-horizontal-relative:text;mso-position-vertical:absolute;mso-position-vertical-relative:text;v-text-anchor:top" o:gfxdata="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" filled="f" stroked="f">
+              <v:shape w14:anchorId="50E41A32" id="_x0000_s1080" type="#_x0000_t202" style="position:absolute;margin-left:145.55pt;margin-top:418.05pt;width:92.05pt;height:27.8pt;z-index:251674624;visibility:visible;mso-wrap-style:square;mso-wrap-distance-left:9pt;mso-wrap-distance-top:0;mso-wrap-distance-right:9pt;mso-wrap-distance-bottom:0;mso-position-horizontal:absolute;mso-position-horizontal-relative:text;mso-position-vertical:absolute;mso-position-vertical-relative:text;v-text-anchor:top" o:gfxdata="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" filled="f" stroked="f">
                 <v:textbox>
                   <w:txbxContent>
                     <w:p>
@@ -9060,7 +9261,7 @@
           </mc:Choice>
           <mc:Fallback>
             <w:pict>
-              <v:shape w14:anchorId="6C749FBA" id="_x0000_s1080" type="#_x0000_t202" style="position:absolute;margin-left:145.55pt;margin-top:399.65pt;width:92.05pt;height:27.8pt;z-index:251670528;visibility:visible;mso-wrap-style:square;mso-wrap-distance-left:9pt;mso-wrap-distance-top:0;mso-wrap-distance-right:9pt;mso-wrap-distance-bottom:0;mso-position-horizontal:absolute;mso-position-horizontal-relative:text;mso-position-vertical:absolute;mso-position-vertical-relative:text;v-text-anchor:top" o:gfxdata="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" filled="f" stroked="f">
+              <v:shape w14:anchorId="6C749FBA" id="_x0000_s1081" type="#_x0000_t202" style="position:absolute;margin-left:145.55pt;margin-top:399.65pt;width:92.05pt;height:27.8pt;z-index:251670528;visibility:visible;mso-wrap-style:square;mso-wrap-distance-left:9pt;mso-wrap-distance-top:0;mso-wrap-distance-right:9pt;mso-wrap-distance-bottom:0;mso-position-horizontal:absolute;mso-position-horizontal-relative:text;mso-position-vertical:absolute;mso-position-vertical-relative:text;v-text-anchor:top" o:gfxdata="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" filled="f" stroked="f">
                 <v:textbox>
                   <w:txbxContent>
                     <w:p>
@@ -9232,7 +9433,7 @@
           </mc:Choice>
           <mc:Fallback>
             <w:pict>
-              <v:shape w14:anchorId="2B7647A7" id="_x0000_s1081" type="#_x0000_t202" style="position:absolute;margin-left:145.55pt;margin-top:379.8pt;width:92.05pt;height:27.8pt;z-index:251666432;visibility:visible;mso-wrap-style:square;mso-wrap-distance-left:9pt;mso-wrap-distance-top:0;mso-wrap-distance-right:9pt;mso-wrap-distance-bottom:0;mso-position-horizontal:absolute;mso-position-horizontal-relative:text;mso-position-vertical:absolute;mso-position-vertical-relative:text;v-text-anchor:top" o:gfxdata="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" filled="f" stroked="f">
+              <v:shape w14:anchorId="2B7647A7" id="_x0000_s1082" type="#_x0000_t202" style="position:absolute;margin-left:145.55pt;margin-top:379.8pt;width:92.05pt;height:27.8pt;z-index:251666432;visibility:visible;mso-wrap-style:square;mso-wrap-distance-left:9pt;mso-wrap-distance-top:0;mso-wrap-distance-right:9pt;mso-wrap-distance-bottom:0;mso-position-horizontal:absolute;mso-position-horizontal-relative:text;mso-position-vertical:absolute;mso-position-vertical-relative:text;v-text-anchor:top" o:gfxdata="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" filled="f" stroked="f">
                 <v:textbox>
                   <w:txbxContent>
                     <w:p>
@@ -9404,7 +9605,7 @@
           </mc:Choice>
           <mc:Fallback>
             <w:pict>
-              <v:shape w14:anchorId="1BAF3504" id="_x0000_s1082" type="#_x0000_t202" style="position:absolute;margin-left:145.55pt;margin-top:362.9pt;width:92.05pt;height:27.8pt;z-index:251660288;visibility:visible;mso-wrap-style:square;mso-wrap-distance-left:9pt;mso-wrap-distance-top:0;mso-wrap-distance-right:9pt;mso-wrap-distance-bottom:0;mso-position-horizontal:absolute;mso-position-horizontal-relative:text;mso-position-vertical:absolute;mso-position-vertical-relative:text;v-text-anchor:top" o:gfxdata="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" filled="f" stroked="f">
+              <v:shape w14:anchorId="1BAF3504" id="_x0000_s1083" type="#_x0000_t202" style="position:absolute;margin-left:145.55pt;margin-top:362.9pt;width:92.05pt;height:27.8pt;z-index:251660288;visibility:visible;mso-wrap-style:square;mso-wrap-distance-left:9pt;mso-wrap-distance-top:0;mso-wrap-distance-right:9pt;mso-wrap-distance-bottom:0;mso-position-horizontal:absolute;mso-position-horizontal-relative:text;mso-position-vertical:absolute;mso-position-vertical-relative:text;v-text-anchor:top" o:gfxdata="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" filled="f" stroked="f">
                 <v:textbox>
                   <w:txbxContent>
                     <w:p>
@@ -9576,7 +9777,7 @@
           </mc:Choice>
           <mc:Fallback>
             <w:pict>
-              <v:shape w14:anchorId="61FF7552" id="_x0000_s1083" type="#_x0000_t202" style="position:absolute;margin-left:145.55pt;margin-top:342.65pt;width:92.05pt;height:27.8pt;z-index:251656192;visibility:visible;mso-wrap-style:square;mso-wrap-distance-left:9pt;mso-wrap-distance-top:0;mso-wrap-distance-right:9pt;mso-wrap-distance-bottom:0;mso-position-horizontal:absolute;mso-position-horizontal-relative:text;mso-position-vertical:absolute;mso-position-vertical-relative:text;v-text-anchor:top" o:gfxdata="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" filled="f" stroked="f">
+              <v:shape w14:anchorId="61FF7552" id="_x0000_s1084" type="#_x0000_t202" style="position:absolute;margin-left:145.55pt;margin-top:342.65pt;width:92.05pt;height:27.8pt;z-index:251656192;visibility:visible;mso-wrap-style:square;mso-wrap-distance-left:9pt;mso-wrap-distance-top:0;mso-wrap-distance-right:9pt;mso-wrap-distance-bottom:0;mso-position-horizontal:absolute;mso-position-horizontal-relative:text;mso-position-vertical:absolute;mso-position-vertical-relative:text;v-text-anchor:top" o:gfxdata="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" filled="f" stroked="f">
                 <v:textbox>
                   <w:txbxContent>
                     <w:p>
@@ -9748,7 +9949,7 @@
           </mc:Choice>
           <mc:Fallback>
             <w:pict>
-              <v:shape w14:anchorId="7D85E8D2" id="_x0000_s1084" type="#_x0000_t202" style="position:absolute;margin-left:145.55pt;margin-top:324.65pt;width:92.05pt;height:27.8pt;z-index:251652096;visibility:visible;mso-wrap-style:square;mso-wrap-distance-left:9pt;mso-wrap-distance-top:0;mso-wrap-distance-right:9pt;mso-wrap-distance-bottom:0;mso-position-horizontal:absolute;mso-position-horizontal-relative:text;mso-position-vertical:absolute;mso-position-vertical-relative:text;v-text-anchor:top" o:gfxdata="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" filled="f" stroked="f">
+              <v:shape w14:anchorId="7D85E8D2" id="_x0000_s1085" type="#_x0000_t202" style="position:absolute;margin-left:145.55pt;margin-top:324.65pt;width:92.05pt;height:27.8pt;z-index:251652096;visibility:visible;mso-wrap-style:square;mso-wrap-distance-left:9pt;mso-wrap-distance-top:0;mso-wrap-distance-right:9pt;mso-wrap-distance-bottom:0;mso-position-horizontal:absolute;mso-position-horizontal-relative:text;mso-position-vertical:absolute;mso-position-vertical-relative:text;v-text-anchor:top" o:gfxdata="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" filled="f" stroked="f">
                 <v:textbox>
                   <w:txbxContent>
                     <w:p>
@@ -9920,7 +10121,7 @@
           </mc:Choice>
           <mc:Fallback>
             <w:pict>
-              <v:shape w14:anchorId="3E4B353A" id="_x0000_s1085" type="#_x0000_t202" style="position:absolute;margin-left:145.55pt;margin-top:304.8pt;width:92.05pt;height:27.8pt;z-index:251648000;visibility:visible;mso-wrap-style:square;mso-wrap-distance-left:9pt;mso-wrap-distance-top:0;mso-wrap-distance-right:9pt;mso-wrap-distance-bottom:0;mso-position-horizontal:absolute;mso-position-horizontal-relative:text;mso-position-vertical:absolute;mso-position-vertical-relative:text;v-text-anchor:top" o:gfxdata="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" filled="f" stroked="f">
+              <v:shape w14:anchorId="3E4B353A" id="_x0000_s1086" type="#_x0000_t202" style="position:absolute;margin-left:145.55pt;margin-top:304.8pt;width:92.05pt;height:27.8pt;z-index:251648000;visibility:visible;mso-wrap-style:square;mso-wrap-distance-left:9pt;mso-wrap-distance-top:0;mso-wrap-distance-right:9pt;mso-wrap-distance-bottom:0;mso-position-horizontal:absolute;mso-position-horizontal-relative:text;mso-position-vertical:absolute;mso-position-vertical-relative:text;v-text-anchor:top" o:gfxdata="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" filled="f" stroked="f">
                 <v:textbox>
                   <w:txbxContent>
                     <w:p>
@@ -10092,7 +10293,7 @@
           </mc:Choice>
           <mc:Fallback>
             <w:pict>
-              <v:shape w14:anchorId="51E7747D" id="_x0000_s1086" type="#_x0000_t202" style="position:absolute;margin-left:145.55pt;margin-top:286.4pt;width:92.05pt;height:27.8pt;z-index:251643904;visibility:visible;mso-wrap-style:square;mso-wrap-distance-left:9pt;mso-wrap-distance-top:0;mso-wrap-distance-right:9pt;mso-wrap-distance-bottom:0;mso-position-horizontal:absolute;mso-position-horizontal-relative:text;mso-position-vertical:absolute;mso-position-vertical-relative:text;v-text-anchor:top" o:gfxdata="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" filled="f" stroked="f">
+              <v:shape w14:anchorId="51E7747D" id="_x0000_s1087" type="#_x0000_t202" style="position:absolute;margin-left:145.55pt;margin-top:286.4pt;width:92.05pt;height:27.8pt;z-index:251643904;visibility:visible;mso-wrap-style:square;mso-wrap-distance-left:9pt;mso-wrap-distance-top:0;mso-wrap-distance-right:9pt;mso-wrap-distance-bottom:0;mso-position-horizontal:absolute;mso-position-horizontal-relative:text;mso-position-vertical:absolute;mso-position-vertical-relative:text;v-text-anchor:top" o:gfxdata="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" filled="f" stroked="f">
                 <v:textbox>
                   <w:txbxContent>
                     <w:p>
@@ -10264,7 +10465,7 @@
           </mc:Choice>
           <mc:Fallback>
             <w:pict>
-              <v:shape w14:anchorId="0E7E7D5E" id="_x0000_s1087" type="#_x0000_t202" style="position:absolute;margin-left:145.55pt;margin-top:247.4pt;width:92.05pt;height:27.8pt;z-index:251635712;visibility:visible;mso-wrap-style:square;mso-wrap-distance-left:9pt;mso-wrap-distance-top:0;mso-wrap-distance-right:9pt;mso-wrap-distance-bottom:0;mso-position-horizontal:absolute;mso-position-horizontal-relative:text;mso-position-vertical:absolute;mso-position-vertical-relative:text;v-text-anchor:top" o:gfxdata="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" filled="f" stroked="f">
+              <v:shape w14:anchorId="0E7E7D5E" id="_x0000_s1088" type="#_x0000_t202" style="position:absolute;margin-left:145.55pt;margin-top:247.4pt;width:92.05pt;height:27.8pt;z-index:251635712;visibility:visible;mso-wrap-style:square;mso-wrap-distance-left:9pt;mso-wrap-distance-top:0;mso-wrap-distance-right:9pt;mso-wrap-distance-bottom:0;mso-position-horizontal:absolute;mso-position-horizontal-relative:text;mso-position-vertical:absolute;mso-position-vertical-relative:text;v-text-anchor:top" o:gfxdata="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" filled="f" stroked="f">
                 <v:textbox>
                   <w:txbxContent>
                     <w:p>
@@ -10436,7 +10637,7 @@
           </mc:Choice>
           <mc:Fallback>
             <w:pict>
-              <v:shape w14:anchorId="2C9FFC93" id="_x0000_s1088" type="#_x0000_t202" style="position:absolute;margin-left:145.55pt;margin-top:227.55pt;width:92.05pt;height:27.8pt;z-index:251631616;visibility:visible;mso-wrap-style:square;mso-wrap-distance-left:9pt;mso-wrap-distance-top:0;mso-wrap-distance-right:9pt;mso-wrap-distance-bottom:0;mso-position-horizontal:absolute;mso-position-horizontal-relative:text;mso-position-vertical:absolute;mso-position-vertical-relative:text;v-text-anchor:top" o:gfxdata="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" filled="f" stroked="f">
+              <v:shape w14:anchorId="2C9FFC93" id="_x0000_s1089" type="#_x0000_t202" style="position:absolute;margin-left:145.55pt;margin-top:227.55pt;width:92.05pt;height:27.8pt;z-index:251631616;visibility:visible;mso-wrap-style:square;mso-wrap-distance-left:9pt;mso-wrap-distance-top:0;mso-wrap-distance-right:9pt;mso-wrap-distance-bottom:0;mso-position-horizontal:absolute;mso-position-horizontal-relative:text;mso-position-vertical:absolute;mso-position-vertical-relative:text;v-text-anchor:top" o:gfxdata="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" filled="f" stroked="f">
                 <v:textbox>
                   <w:txbxContent>
                     <w:p>
@@ -10608,7 +10809,7 @@
           </mc:Choice>
           <mc:Fallback>
             <w:pict>
-              <v:shape w14:anchorId="202F898A" id="_x0000_s1089" type="#_x0000_t202" style="position:absolute;margin-left:145.55pt;margin-top:209.15pt;width:92.1pt;height:27.8pt;z-index:251627520;visibility:visible;mso-wrap-style:square;mso-wrap-distance-left:9pt;mso-wrap-distance-top:0;mso-wrap-distance-right:9pt;mso-wrap-distance-bottom:0;mso-position-horizontal:absolute;mso-position-horizontal-relative:text;mso-position-vertical:absolute;mso-position-vertical-relative:text;v-text-anchor:top" o:gfxdata="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" filled="f" stroked="f">
+              <v:shape w14:anchorId="202F898A" id="_x0000_s1090" type="#_x0000_t202" style="position:absolute;margin-left:145.55pt;margin-top:209.15pt;width:92.1pt;height:27.8pt;z-index:251627520;visibility:visible;mso-wrap-style:square;mso-wrap-distance-left:9pt;mso-wrap-distance-top:0;mso-wrap-distance-right:9pt;mso-wrap-distance-bottom:0;mso-position-horizontal:absolute;mso-position-horizontal-relative:text;mso-position-vertical:absolute;mso-position-vertical-relative:text;v-text-anchor:top" o:gfxdata="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" filled="f" stroked="f">
                 <v:textbox>
                   <w:txbxContent>
                     <w:p>
@@ -10780,7 +10981,7 @@
           </mc:Choice>
           <mc:Fallback>
             <w:pict>
-              <v:shape w14:anchorId="748CD4E5" id="_x0000_s1090" type="#_x0000_t202" style="position:absolute;margin-left:145.55pt;margin-top:189.3pt;width:92.1pt;height:27.8pt;z-index:251623424;visibility:visible;mso-wrap-style:square;mso-wrap-distance-left:9pt;mso-wrap-distance-top:0;mso-wrap-distance-right:9pt;mso-wrap-distance-bottom:0;mso-position-horizontal:absolute;mso-position-horizontal-relative:text;mso-position-vertical:absolute;mso-position-vertical-relative:text;v-text-anchor:top" o:gfxdata="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" filled="f" stroked="f">
+              <v:shape w14:anchorId="748CD4E5" id="_x0000_s1091" type="#_x0000_t202" style="position:absolute;margin-left:145.55pt;margin-top:189.3pt;width:92.1pt;height:27.8pt;z-index:251623424;visibility:visible;mso-wrap-style:square;mso-wrap-distance-left:9pt;mso-wrap-distance-top:0;mso-wrap-distance-right:9pt;mso-wrap-distance-bottom:0;mso-position-horizontal:absolute;mso-position-horizontal-relative:text;mso-position-vertical:absolute;mso-position-vertical-relative:text;v-text-anchor:top" o:gfxdata="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" filled="f" stroked="f">
                 <v:textbox>
                   <w:txbxContent>
                     <w:p>
@@ -10952,7 +11153,7 @@
           </mc:Choice>
           <mc:Fallback>
             <w:pict>
-              <v:shape w14:anchorId="7FEB7D88" id="_x0000_s1091" type="#_x0000_t202" style="position:absolute;margin-left:145.6pt;margin-top:266.55pt;width:92.05pt;height:27.8pt;z-index:251639808;visibility:visible;mso-wrap-style:square;mso-wrap-distance-left:9pt;mso-wrap-distance-top:0;mso-wrap-distance-right:9pt;mso-wrap-distance-bottom:0;mso-position-horizontal:absolute;mso-position-horizontal-relative:text;mso-position-vertical:absolute;mso-position-vertical-relative:text;v-text-anchor:top" o:gfxdata="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" filled="f" stroked="f">
+              <v:shape w14:anchorId="7FEB7D88" id="_x0000_s1092" type="#_x0000_t202" style="position:absolute;margin-left:145.6pt;margin-top:266.55pt;width:92.05pt;height:27.8pt;z-index:251639808;visibility:visible;mso-wrap-style:square;mso-wrap-distance-left:9pt;mso-wrap-distance-top:0;mso-wrap-distance-right:9pt;mso-wrap-distance-bottom:0;mso-position-horizontal:absolute;mso-position-horizontal-relative:text;mso-position-vertical:absolute;mso-position-vertical-relative:text;v-text-anchor:top" o:gfxdata="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" filled="f" stroked="f">
                 <v:textbox>
                   <w:txbxContent>
                     <w:p>
@@ -11021,15 +11222,15 @@
         <mc:AlternateContent>
           <mc:Choice Requires="wps">
             <w:drawing>
-              <wp:anchor distT="0" distB="0" distL="114300" distR="114300" simplePos="0" relativeHeight="251638784" behindDoc="0" locked="0" layoutInCell="1" allowOverlap="1" wp14:anchorId="19C2CC8F" wp14:editId="256A42BF">
+              <wp:anchor distT="0" distB="0" distL="114300" distR="114300" simplePos="0" relativeHeight="251638784" behindDoc="0" locked="0" layoutInCell="1" allowOverlap="1" wp14:anchorId="19C2CC8F" wp14:editId="54C02B9C">
                 <wp:simplePos x="0" y="0"/>
                 <wp:positionH relativeFrom="column">
-                  <wp:posOffset>1128712</wp:posOffset>
+                  <wp:posOffset>1130300</wp:posOffset>
                 </wp:positionH>
                 <wp:positionV relativeFrom="paragraph">
-                  <wp:posOffset>3381375</wp:posOffset>
+                  <wp:posOffset>3384550</wp:posOffset>
                 </wp:positionV>
-                <wp:extent cx="1023937" cy="353120"/>
+                <wp:extent cx="2647950" cy="353120"/>
                 <wp:effectExtent l="0" t="0" r="0" b="0"/>
                 <wp:wrapNone/>
                 <wp:docPr id="858453769" name="Text Box 2"/>
@@ -11045,7 +11246,7 @@
                       <wps:spPr bwMode="auto">
                         <a:xfrm>
                           <a:off x="0" y="0"/>
-                          <a:ext cx="1023937" cy="353120"/>
+                          <a:ext cx="2647950" cy="353120"/>
                         </a:xfrm>
                         <a:prstGeom prst="rect">
                           <a:avLst/>
@@ -11127,7 +11328,7 @@
           </mc:Choice>
           <mc:Fallback>
             <w:pict>
-              <v:shape w14:anchorId="19C2CC8F" id="_x0000_s1092" type="#_x0000_t202" style="position:absolute;margin-left:88.85pt;margin-top:266.25pt;width:80.6pt;height:27.8pt;z-index:251638784;visibility:visible;mso-wrap-style:square;mso-width-percent:0;mso-wrap-distance-left:9pt;mso-wrap-distance-top:0;mso-wrap-distance-right:9pt;mso-wrap-distance-bottom:0;mso-position-horizontal:absolute;mso-position-horizontal-relative:text;mso-position-vertical:absolute;mso-position-vertical-relative:text;mso-width-percent:0;mso-width-relative:margin;v-text-anchor:top" o:gfxdata="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" filled="f" stroked="f">
+              <v:shape w14:anchorId="19C2CC8F" id="_x0000_s1093" type="#_x0000_t202" style="position:absolute;margin-left:89pt;margin-top:266.5pt;width:208.5pt;height:27.8pt;z-index:251638784;visibility:visible;mso-wrap-style:square;mso-width-percent:0;mso-wrap-distance-left:9pt;mso-wrap-distance-top:0;mso-wrap-distance-right:9pt;mso-wrap-distance-bottom:0;mso-position-horizontal:absolute;mso-position-horizontal-relative:text;mso-position-vertical:absolute;mso-position-vertical-relative:text;mso-width-percent:0;mso-width-relative:margin;v-text-anchor:top" o:gfxdata="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" filled="f" stroked="f">
                 <v:textbox>
                   <w:txbxContent>
                     <w:p>
@@ -11196,7 +11397,7 @@
         <mc:AlternateContent>
           <mc:Choice Requires="wps">
             <w:drawing>
-              <wp:anchor distT="0" distB="0" distL="114300" distR="114300" simplePos="0" relativeHeight="251640832" behindDoc="0" locked="0" layoutInCell="1" allowOverlap="1" wp14:anchorId="1B27AD79" wp14:editId="17B10C64">
+              <wp:anchor distT="0" distB="0" distL="114300" distR="114300" simplePos="0" relativeHeight="251640832" behindDoc="0" locked="0" layoutInCell="1" allowOverlap="1" wp14:anchorId="1B27AD79" wp14:editId="35AE6151">
                 <wp:simplePos x="0" y="0"/>
                 <wp:positionH relativeFrom="column">
                   <wp:posOffset>4066329</wp:posOffset>
@@ -11290,7 +11491,7 @@
           </mc:Choice>
           <mc:Fallback>
             <w:pict>
-              <v:shape w14:anchorId="1B27AD79" id="_x0000_s1093" type="#_x0000_t202" style="position:absolute;margin-left:320.2pt;margin-top:266.25pt;width:62.45pt;height:27.8pt;z-index:251640832;visibility:visible;mso-wrap-style:square;mso-wrap-distance-left:9pt;mso-wrap-distance-top:0;mso-wrap-distance-right:9pt;mso-wrap-distance-bottom:0;mso-position-horizontal:absolute;mso-position-horizontal-relative:text;mso-position-vertical:absolute;mso-position-vertical-relative:text;v-text-anchor:top" o:gfxdata="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" filled="f" stroked="f">
+              <v:shape w14:anchorId="1B27AD79" id="_x0000_s1094" type="#_x0000_t202" style="position:absolute;margin-left:320.2pt;margin-top:266.25pt;width:62.45pt;height:27.8pt;z-index:251640832;visibility:visible;mso-wrap-style:square;mso-wrap-distance-left:9pt;mso-wrap-distance-top:0;mso-wrap-distance-right:9pt;mso-wrap-distance-bottom:0;mso-position-horizontal:absolute;mso-position-horizontal-relative:text;mso-position-vertical:absolute;mso-position-vertical-relative:text;v-text-anchor:top" o:gfxdata="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" filled="f" stroked="f">
                 <v:textbox>
                   <w:txbxContent>
                     <w:p>
@@ -11350,182 +11551,7 @@
         <mc:AlternateContent>
           <mc:Choice Requires="wps">
             <w:drawing>
-              <wp:anchor distT="0" distB="0" distL="114300" distR="114300" simplePos="0" relativeHeight="251622400" behindDoc="0" locked="0" layoutInCell="1" allowOverlap="1" wp14:anchorId="775BD5D4" wp14:editId="288AC0A6">
-                <wp:simplePos x="0" y="0"/>
-                <wp:positionH relativeFrom="column">
-                  <wp:posOffset>1128712</wp:posOffset>
-                </wp:positionH>
-                <wp:positionV relativeFrom="paragraph">
-                  <wp:posOffset>2400300</wp:posOffset>
-                </wp:positionV>
-                <wp:extent cx="1023937" cy="353253"/>
-                <wp:effectExtent l="0" t="0" r="0" b="0"/>
-                <wp:wrapNone/>
-                <wp:docPr id="476088185" name="Text Box 2"/>
-                <wp:cNvGraphicFramePr>
-                  <a:graphicFrameLocks xmlns:a="http://schemas.openxmlformats.org/drawingml/2006/main"/>
-                </wp:cNvGraphicFramePr>
-                <a:graphic xmlns:a="http://schemas.openxmlformats.org/drawingml/2006/main">
-                  <a:graphicData uri="http://schemas.microsoft.com/office/word/2010/wordprocessingShape">
-                    <wps:wsp>
-                      <wps:cNvSpPr txBox="1">
-                        <a:spLocks noChangeArrowheads="1"/>
-                      </wps:cNvSpPr>
-                      <wps:spPr bwMode="auto">
-                        <a:xfrm>
-                          <a:off x="0" y="0"/>
-                          <a:ext cx="1023937" cy="353253"/>
-                        </a:xfrm>
-                        <a:prstGeom prst="rect">
-                          <a:avLst/>
-                        </a:prstGeom>
-                        <a:noFill/>
-                        <a:ln w="9525">
-                          <a:noFill/>
-                          <a:miter lim="800000"/>
-                          <a:headEnd/>
-                          <a:tailEnd/>
-                        </a:ln>
-                      </wps:spPr>
-                      <wps:txbx>
-                        <w:txbxContent>
-                          <w:p>
-                            <w:pPr>
-                              <w:rPr>
-                                <w:rFonts w:ascii="TH SarabunPSK" w:hAnsi="TH SarabunPSK" w:cs="TH SarabunPSK"/>
-                                <w:b/>
-                                <w:bCs/>
-                                <w:color w:val="0049B7"/>
-                                <w:szCs w:val="24"/>
-                              </w:rPr>
-                            </w:pPr>
-                            <w:r>
-                              <w:rPr>
-                                <w:rFonts w:ascii="TH SarabunPSK" w:hAnsi="TH SarabunPSK" w:cs="TH SarabunPSK" w:hint="cs"/>
-                                <w:b/>
-                                <w:bCs/>
-                                <w:color w:val="0049B7"/>
-                                <w:szCs w:val="24"/>
-                              </w:rPr>
-                              <w:t>&lt;</w:t>
-                            </w:r>
-                            <w:r>
-                              <w:rPr>
-                                <w:rFonts w:ascii="TH SarabunPSK" w:hAnsi="TH SarabunPSK" w:cs="TH SarabunPSK"/>
-                                <w:b/>
-                                <w:bCs/>
-                                <w:color w:val="0049B7"/>
-                                <w:szCs w:val="24"/>
-                              </w:rPr>
-                              <w:t>tagNo</w:t>
-                            </w:r>
-                            <w:r>
-                              <w:rPr>
-                                <w:rFonts w:ascii="TH SarabunPSK" w:hAnsi="TH SarabunPSK" w:cs="TH SarabunPSK"/>
-                                <w:b/>
-                                <w:bCs/>
-                                <w:color w:val="0049B7"/>
-                                <w:szCs w:val="24"/>
-                              </w:rPr>
-                              <w:t>11</w:t>
-                            </w:r>
-                            <w:r>
-                              <w:rPr>
-                                <w:rFonts w:ascii="TH SarabunPSK" w:hAnsi="TH SarabunPSK" w:cs="TH SarabunPSK" w:hint="cs"/>
-                                <w:b/>
-                                <w:bCs/>
-                                <w:color w:val="0049B7"/>
-                                <w:szCs w:val="24"/>
-                              </w:rPr>
-                              <w:t>&gt;</w:t>
-                            </w:r>
-                          </w:p>
-                        </w:txbxContent>
-                      </wps:txbx>
-                      <wps:bodyPr rot="0" vert="horz" wrap="square" lIns="91440" tIns="45720" rIns="91440" bIns="45720" anchor="t" anchorCtr="0">
-                        <a:noAutofit/>
-                      </wps:bodyPr>
-                    </wps:wsp>
-                  </a:graphicData>
-                </a:graphic>
-                <wp14:sizeRelH relativeFrom="margin">
-                  <wp14:pctWidth>0</wp14:pctWidth>
-                </wp14:sizeRelH>
-              </wp:anchor>
-            </w:drawing>
-          </mc:Choice>
-          <mc:Fallback>
-            <w:pict>
-              <v:shape w14:anchorId="775BD5D4" id="_x0000_s1094" type="#_x0000_t202" style="position:absolute;margin-left:88.85pt;margin-top:189pt;width:80.6pt;height:27.8pt;z-index:251622400;visibility:visible;mso-wrap-style:square;mso-width-percent:0;mso-wrap-distance-left:9pt;mso-wrap-distance-top:0;mso-wrap-distance-right:9pt;mso-wrap-distance-bottom:0;mso-position-horizontal:absolute;mso-position-horizontal-relative:text;mso-position-vertical:absolute;mso-position-vertical-relative:text;mso-width-percent:0;mso-width-relative:margin;v-text-anchor:top" o:gfxdata="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" filled="f" stroked="f">
-                <v:textbox>
-                  <w:txbxContent>
-                    <w:p>
-                      <w:pPr>
-                        <w:rPr>
-                          <w:rFonts w:ascii="TH SarabunPSK" w:hAnsi="TH SarabunPSK" w:cs="TH SarabunPSK"/>
-                          <w:b/>
-                          <w:bCs/>
-                          <w:color w:val="0049B7"/>
-                          <w:szCs w:val="24"/>
-                        </w:rPr>
-                      </w:pPr>
-                      <w:r>
-                        <w:rPr>
-                          <w:rFonts w:ascii="TH SarabunPSK" w:hAnsi="TH SarabunPSK" w:cs="TH SarabunPSK" w:hint="cs"/>
-                          <w:b/>
-                          <w:bCs/>
-                          <w:color w:val="0049B7"/>
-                          <w:szCs w:val="24"/>
-                        </w:rPr>
-                        <w:t>&lt;</w:t>
-                      </w:r>
-                      <w:r>
-                        <w:rPr>
-                          <w:rFonts w:ascii="TH SarabunPSK" w:hAnsi="TH SarabunPSK" w:cs="TH SarabunPSK"/>
-                          <w:b/>
-                          <w:bCs/>
-                          <w:color w:val="0049B7"/>
-                          <w:szCs w:val="24"/>
-                        </w:rPr>
-                        <w:t>tagNo</w:t>
-                      </w:r>
-                      <w:r>
-                        <w:rPr>
-                          <w:rFonts w:ascii="TH SarabunPSK" w:hAnsi="TH SarabunPSK" w:cs="TH SarabunPSK"/>
-                          <w:b/>
-                          <w:bCs/>
-                          <w:color w:val="0049B7"/>
-                          <w:szCs w:val="24"/>
-                        </w:rPr>
-                        <w:t>11</w:t>
-                      </w:r>
-                      <w:r>
-                        <w:rPr>
-                          <w:rFonts w:ascii="TH SarabunPSK" w:hAnsi="TH SarabunPSK" w:cs="TH SarabunPSK" w:hint="cs"/>
-                          <w:b/>
-                          <w:bCs/>
-                          <w:color w:val="0049B7"/>
-                          <w:szCs w:val="24"/>
-                        </w:rPr>
-                        <w:t>&gt;</w:t>
-                      </w:r>
-                    </w:p>
-                  </w:txbxContent>
-                </v:textbox>
-              </v:shape>
-            </w:pict>
-          </mc:Fallback>
-        </mc:AlternateContent>
-      </w:r>
-      <w:r>
-        <w:rPr>
-          <w:noProof/>
-          <w14:ligatures w14:val="none"/>
-        </w:rPr>
-        <mc:AlternateContent>
-          <mc:Choice Requires="wps">
-            <w:drawing>
-              <wp:anchor distT="0" distB="0" distL="114300" distR="114300" simplePos="0" relativeHeight="251624448" behindDoc="0" locked="0" layoutInCell="1" allowOverlap="1" wp14:anchorId="13B20EB1" wp14:editId="53663744">
+              <wp:anchor distT="0" distB="0" distL="114300" distR="114300" simplePos="0" relativeHeight="251624448" behindDoc="0" locked="0" layoutInCell="1" allowOverlap="1" wp14:anchorId="13B20EB1" wp14:editId="7DD83072">
                 <wp:simplePos x="0" y="0"/>
                 <wp:positionH relativeFrom="column">
                   <wp:posOffset>4066720</wp:posOffset>
@@ -11619,7 +11645,7 @@
           </mc:Choice>
           <mc:Fallback>
             <w:pict>
-              <v:shape w14:anchorId="13B20EB1" id="_x0000_s1095" type="#_x0000_t202" style="position:absolute;margin-left:320.2pt;margin-top:189pt;width:62.45pt;height:27.8pt;z-index:251624448;visibility:visible;mso-wrap-style:square;mso-wrap-distance-left:9pt;mso-wrap-distance-top:0;mso-wrap-distance-right:9pt;mso-wrap-distance-bottom:0;mso-position-horizontal:absolute;mso-position-horizontal-relative:text;mso-position-vertical:absolute;mso-position-vertical-relative:text;v-text-anchor:top" o:gfxdata="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" filled="f" stroked="f">
+              <v:shape w14:anchorId="13B20EB1" id="_x0000_s1095" type="#_x0000_t202" style="position:absolute;margin-left:320.2pt;margin-top:189pt;width:62.45pt;height:27.8pt;z-index:251624448;visibility:visible;mso-wrap-style:square;mso-wrap-distance-left:9pt;mso-wrap-distance-top:0;mso-wrap-distance-right:9pt;mso-wrap-distance-bottom:0;mso-position-horizontal:absolute;mso-position-horizontal-relative:text;mso-position-vertical:absolute;mso-position-vertical-relative:text;v-text-anchor:top" o:gfxdata="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" filled="f" stroked="f">
                 <v:textbox>
                   <w:txbxContent>
                     <w:p>
@@ -11679,15 +11705,15 @@
         <mc:AlternateContent>
           <mc:Choice Requires="wps">
             <w:drawing>
-              <wp:anchor distT="0" distB="0" distL="114300" distR="114300" simplePos="0" relativeHeight="251626496" behindDoc="0" locked="0" layoutInCell="1" allowOverlap="1" wp14:anchorId="2DC6FC39" wp14:editId="6E0D6144">
+              <wp:anchor distT="0" distB="0" distL="114300" distR="114300" simplePos="0" relativeHeight="251626496" behindDoc="0" locked="0" layoutInCell="1" allowOverlap="1" wp14:anchorId="2DC6FC39" wp14:editId="2525538E">
                 <wp:simplePos x="0" y="0"/>
                 <wp:positionH relativeFrom="column">
-                  <wp:posOffset>1128712</wp:posOffset>
+                  <wp:posOffset>1130300</wp:posOffset>
                 </wp:positionH>
                 <wp:positionV relativeFrom="paragraph">
-                  <wp:posOffset>2652713</wp:posOffset>
+                  <wp:posOffset>2654300</wp:posOffset>
                 </wp:positionV>
-                <wp:extent cx="1023937" cy="353253"/>
+                <wp:extent cx="2647950" cy="353253"/>
                 <wp:effectExtent l="0" t="0" r="0" b="0"/>
                 <wp:wrapNone/>
                 <wp:docPr id="476088189" name="Text Box 2"/>
@@ -11703,7 +11729,7 @@
                       <wps:spPr bwMode="auto">
                         <a:xfrm>
                           <a:off x="0" y="0"/>
-                          <a:ext cx="1023937" cy="353253"/>
+                          <a:ext cx="2647950" cy="353253"/>
                         </a:xfrm>
                         <a:prstGeom prst="rect">
                           <a:avLst/>
@@ -11785,7 +11811,7 @@
           </mc:Choice>
           <mc:Fallback>
             <w:pict>
-              <v:shape w14:anchorId="2DC6FC39" id="_x0000_s1096" type="#_x0000_t202" style="position:absolute;margin-left:88.85pt;margin-top:208.9pt;width:80.6pt;height:27.8pt;z-index:251626496;visibility:visible;mso-wrap-style:square;mso-width-percent:0;mso-wrap-distance-left:9pt;mso-wrap-distance-top:0;mso-wrap-distance-right:9pt;mso-wrap-distance-bottom:0;mso-position-horizontal:absolute;mso-position-horizontal-relative:text;mso-position-vertical:absolute;mso-position-vertical-relative:text;mso-width-percent:0;mso-width-relative:margin;v-text-anchor:top" o:gfxdata="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" filled="f" stroked="f">
+              <v:shape w14:anchorId="2DC6FC39" id="_x0000_s1096" type="#_x0000_t202" style="position:absolute;margin-left:89pt;margin-top:209pt;width:208.5pt;height:27.8pt;z-index:251626496;visibility:visible;mso-wrap-style:square;mso-width-percent:0;mso-wrap-distance-left:9pt;mso-wrap-distance-top:0;mso-wrap-distance-right:9pt;mso-wrap-distance-bottom:0;mso-position-horizontal:absolute;mso-position-horizontal-relative:text;mso-position-vertical:absolute;mso-position-vertical-relative:text;mso-width-percent:0;mso-width-relative:margin;v-text-anchor:top" o:gfxdata="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" filled="f" stroked="f">
                 <v:textbox>
                   <w:txbxContent>
                     <w:p>
@@ -11854,7 +11880,7 @@
         <mc:AlternateContent>
           <mc:Choice Requires="wps">
             <w:drawing>
-              <wp:anchor distT="0" distB="0" distL="114300" distR="114300" simplePos="0" relativeHeight="251628544" behindDoc="0" locked="0" layoutInCell="1" allowOverlap="1" wp14:anchorId="32E8A9D0" wp14:editId="5B5C5A33">
+              <wp:anchor distT="0" distB="0" distL="114300" distR="114300" simplePos="0" relativeHeight="251628544" behindDoc="0" locked="0" layoutInCell="1" allowOverlap="1" wp14:anchorId="32E8A9D0" wp14:editId="265250AA">
                 <wp:simplePos x="0" y="0"/>
                 <wp:positionH relativeFrom="column">
                   <wp:posOffset>4066720</wp:posOffset>
@@ -11948,7 +11974,7 @@
           </mc:Choice>
           <mc:Fallback>
             <w:pict>
-              <v:shape w14:anchorId="32E8A9D0" id="_x0000_s1097" type="#_x0000_t202" style="position:absolute;margin-left:320.2pt;margin-top:208.9pt;width:62.45pt;height:27.8pt;z-index:251628544;visibility:visible;mso-wrap-style:square;mso-wrap-distance-left:9pt;mso-wrap-distance-top:0;mso-wrap-distance-right:9pt;mso-wrap-distance-bottom:0;mso-position-horizontal:absolute;mso-position-horizontal-relative:text;mso-position-vertical:absolute;mso-position-vertical-relative:text;v-text-anchor:top" o:gfxdata="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" filled="f" stroked="f">
+              <v:shape w14:anchorId="32E8A9D0" id="_x0000_s1097" type="#_x0000_t202" style="position:absolute;margin-left:320.2pt;margin-top:208.9pt;width:62.45pt;height:27.8pt;z-index:251628544;visibility:visible;mso-wrap-style:square;mso-wrap-distance-left:9pt;mso-wrap-distance-top:0;mso-wrap-distance-right:9pt;mso-wrap-distance-bottom:0;mso-position-horizontal:absolute;mso-position-horizontal-relative:text;mso-position-vertical:absolute;mso-position-vertical-relative:text;v-text-anchor:top" o:gfxdata="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" filled="f" stroked="f">
                 <v:textbox>
                   <w:txbxContent>
                     <w:p>
@@ -12008,15 +12034,15 @@
         <mc:AlternateContent>
           <mc:Choice Requires="wps">
             <w:drawing>
-              <wp:anchor distT="0" distB="0" distL="114300" distR="114300" simplePos="0" relativeHeight="251630592" behindDoc="0" locked="0" layoutInCell="1" allowOverlap="1" wp14:anchorId="139B3945" wp14:editId="12595A0D">
+              <wp:anchor distT="0" distB="0" distL="114300" distR="114300" simplePos="0" relativeHeight="251630592" behindDoc="0" locked="0" layoutInCell="1" allowOverlap="1" wp14:anchorId="139B3945" wp14:editId="24034594">
                 <wp:simplePos x="0" y="0"/>
                 <wp:positionH relativeFrom="column">
-                  <wp:posOffset>1128712</wp:posOffset>
+                  <wp:posOffset>1130300</wp:posOffset>
                 </wp:positionH>
                 <wp:positionV relativeFrom="paragraph">
-                  <wp:posOffset>2886075</wp:posOffset>
+                  <wp:posOffset>2889250</wp:posOffset>
                 </wp:positionV>
-                <wp:extent cx="1023937" cy="353120"/>
+                <wp:extent cx="2647950" cy="353120"/>
                 <wp:effectExtent l="0" t="0" r="0" b="0"/>
                 <wp:wrapNone/>
                 <wp:docPr id="858453761" name="Text Box 2"/>
@@ -12032,7 +12058,7 @@
                       <wps:spPr bwMode="auto">
                         <a:xfrm>
                           <a:off x="0" y="0"/>
-                          <a:ext cx="1023937" cy="353120"/>
+                          <a:ext cx="2647950" cy="353120"/>
                         </a:xfrm>
                         <a:prstGeom prst="rect">
                           <a:avLst/>
@@ -12114,7 +12140,7 @@
           </mc:Choice>
           <mc:Fallback>
             <w:pict>
-              <v:shape w14:anchorId="139B3945" id="_x0000_s1098" type="#_x0000_t202" style="position:absolute;margin-left:88.85pt;margin-top:227.25pt;width:80.6pt;height:27.8pt;z-index:251630592;visibility:visible;mso-wrap-style:square;mso-width-percent:0;mso-wrap-distance-left:9pt;mso-wrap-distance-top:0;mso-wrap-distance-right:9pt;mso-wrap-distance-bottom:0;mso-position-horizontal:absolute;mso-position-horizontal-relative:text;mso-position-vertical:absolute;mso-position-vertical-relative:text;mso-width-percent:0;mso-width-relative:margin;v-text-anchor:top" o:gfxdata="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" filled="f" stroked="f">
+              <v:shape w14:anchorId="139B3945" id="_x0000_s1098" type="#_x0000_t202" style="position:absolute;margin-left:89pt;margin-top:227.5pt;width:208.5pt;height:27.8pt;z-index:251630592;visibility:visible;mso-wrap-style:square;mso-width-percent:0;mso-wrap-distance-left:9pt;mso-wrap-distance-top:0;mso-wrap-distance-right:9pt;mso-wrap-distance-bottom:0;mso-position-horizontal:absolute;mso-position-horizontal-relative:text;mso-position-vertical:absolute;mso-position-vertical-relative:text;mso-width-percent:0;mso-width-relative:margin;v-text-anchor:top" o:gfxdata="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" filled="f" stroked="f">
                 <v:textbox>
                   <w:txbxContent>
                     <w:p>
@@ -12183,7 +12209,7 @@
         <mc:AlternateContent>
           <mc:Choice Requires="wps">
             <w:drawing>
-              <wp:anchor distT="0" distB="0" distL="114300" distR="114300" simplePos="0" relativeHeight="251632640" behindDoc="0" locked="0" layoutInCell="1" allowOverlap="1" wp14:anchorId="41723766" wp14:editId="0BC81CBD">
+              <wp:anchor distT="0" distB="0" distL="114300" distR="114300" simplePos="0" relativeHeight="251632640" behindDoc="0" locked="0" layoutInCell="1" allowOverlap="1" wp14:anchorId="41723766" wp14:editId="31C570C4">
                 <wp:simplePos x="0" y="0"/>
                 <wp:positionH relativeFrom="column">
                   <wp:posOffset>4066329</wp:posOffset>
@@ -12277,7 +12303,7 @@
           </mc:Choice>
           <mc:Fallback>
             <w:pict>
-              <v:shape w14:anchorId="41723766" id="_x0000_s1099" type="#_x0000_t202" style="position:absolute;margin-left:320.2pt;margin-top:227.25pt;width:62.45pt;height:27.8pt;z-index:251632640;visibility:visible;mso-wrap-style:square;mso-wrap-distance-left:9pt;mso-wrap-distance-top:0;mso-wrap-distance-right:9pt;mso-wrap-distance-bottom:0;mso-position-horizontal:absolute;mso-position-horizontal-relative:text;mso-position-vertical:absolute;mso-position-vertical-relative:text;v-text-anchor:top" o:gfxdata="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" filled="f" stroked="f">
+              <v:shape w14:anchorId="41723766" id="_x0000_s1099" type="#_x0000_t202" style="position:absolute;margin-left:320.2pt;margin-top:227.25pt;width:62.45pt;height:27.8pt;z-index:251632640;visibility:visible;mso-wrap-style:square;mso-wrap-distance-left:9pt;mso-wrap-distance-top:0;mso-wrap-distance-right:9pt;mso-wrap-distance-bottom:0;mso-position-horizontal:absolute;mso-position-horizontal-relative:text;mso-position-vertical:absolute;mso-position-vertical-relative:text;v-text-anchor:top" o:gfxdata="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" filled="f" stroked="f">
                 <v:textbox>
                   <w:txbxContent>
                     <w:p>
@@ -12337,15 +12363,15 @@
         <mc:AlternateContent>
           <mc:Choice Requires="wps">
             <w:drawing>
-              <wp:anchor distT="0" distB="0" distL="114300" distR="114300" simplePos="0" relativeHeight="251634688" behindDoc="0" locked="0" layoutInCell="1" allowOverlap="1" wp14:anchorId="09E84AC1" wp14:editId="08E07161">
+              <wp:anchor distT="0" distB="0" distL="114300" distR="114300" simplePos="0" relativeHeight="251634688" behindDoc="0" locked="0" layoutInCell="1" allowOverlap="1" wp14:anchorId="09E84AC1" wp14:editId="2C91142F">
                 <wp:simplePos x="0" y="0"/>
                 <wp:positionH relativeFrom="column">
-                  <wp:posOffset>1128712</wp:posOffset>
+                  <wp:posOffset>1130300</wp:posOffset>
                 </wp:positionH>
                 <wp:positionV relativeFrom="paragraph">
-                  <wp:posOffset>3138488</wp:posOffset>
+                  <wp:posOffset>3136900</wp:posOffset>
                 </wp:positionV>
-                <wp:extent cx="1023937" cy="353120"/>
+                <wp:extent cx="2647950" cy="353120"/>
                 <wp:effectExtent l="0" t="0" r="0" b="0"/>
                 <wp:wrapNone/>
                 <wp:docPr id="858453765" name="Text Box 2"/>
@@ -12361,7 +12387,7 @@
                       <wps:spPr bwMode="auto">
                         <a:xfrm>
                           <a:off x="0" y="0"/>
-                          <a:ext cx="1023937" cy="353120"/>
+                          <a:ext cx="2647950" cy="353120"/>
                         </a:xfrm>
                         <a:prstGeom prst="rect">
                           <a:avLst/>
@@ -12443,7 +12469,7 @@
           </mc:Choice>
           <mc:Fallback>
             <w:pict>
-              <v:shape w14:anchorId="09E84AC1" id="_x0000_s1100" type="#_x0000_t202" style="position:absolute;margin-left:88.85pt;margin-top:247.15pt;width:80.6pt;height:27.8pt;z-index:251634688;visibility:visible;mso-wrap-style:square;mso-width-percent:0;mso-wrap-distance-left:9pt;mso-wrap-distance-top:0;mso-wrap-distance-right:9pt;mso-wrap-distance-bottom:0;mso-position-horizontal:absolute;mso-position-horizontal-relative:text;mso-position-vertical:absolute;mso-position-vertical-relative:text;mso-width-percent:0;mso-width-relative:margin;v-text-anchor:top" o:gfxdata="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" filled="f" stroked="f">
+              <v:shape w14:anchorId="09E84AC1" id="_x0000_s1100" type="#_x0000_t202" style="position:absolute;margin-left:89pt;margin-top:247pt;width:208.5pt;height:27.8pt;z-index:251634688;visibility:visible;mso-wrap-style:square;mso-width-percent:0;mso-wrap-distance-left:9pt;mso-wrap-distance-top:0;mso-wrap-distance-right:9pt;mso-wrap-distance-bottom:0;mso-position-horizontal:absolute;mso-position-horizontal-relative:text;mso-position-vertical:absolute;mso-position-vertical-relative:text;mso-width-percent:0;mso-width-relative:margin;v-text-anchor:top" o:gfxdata="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" filled="f" stroked="f">
                 <v:textbox>
                   <w:txbxContent>
                     <w:p>
@@ -12512,7 +12538,7 @@
         <mc:AlternateContent>
           <mc:Choice Requires="wps">
             <w:drawing>
-              <wp:anchor distT="0" distB="0" distL="114300" distR="114300" simplePos="0" relativeHeight="251636736" behindDoc="0" locked="0" layoutInCell="1" allowOverlap="1" wp14:anchorId="161F6783" wp14:editId="710EC13B">
+              <wp:anchor distT="0" distB="0" distL="114300" distR="114300" simplePos="0" relativeHeight="251636736" behindDoc="0" locked="0" layoutInCell="1" allowOverlap="1" wp14:anchorId="161F6783" wp14:editId="259E7C06">
                 <wp:simplePos x="0" y="0"/>
                 <wp:positionH relativeFrom="column">
                   <wp:posOffset>4066329</wp:posOffset>
@@ -12606,7 +12632,7 @@
           </mc:Choice>
           <mc:Fallback>
             <w:pict>
-              <v:shape w14:anchorId="161F6783" id="_x0000_s1101" type="#_x0000_t202" style="position:absolute;margin-left:320.2pt;margin-top:247.15pt;width:62.45pt;height:27.8pt;z-index:251636736;visibility:visible;mso-wrap-style:square;mso-wrap-distance-left:9pt;mso-wrap-distance-top:0;mso-wrap-distance-right:9pt;mso-wrap-distance-bottom:0;mso-position-horizontal:absolute;mso-position-horizontal-relative:text;mso-position-vertical:absolute;mso-position-vertical-relative:text;v-text-anchor:top" o:gfxdata="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" filled="f" stroked="f">
+              <v:shape w14:anchorId="161F6783" id="_x0000_s1101" type="#_x0000_t202" style="position:absolute;margin-left:320.2pt;margin-top:247.15pt;width:62.45pt;height:27.8pt;z-index:251636736;visibility:visible;mso-wrap-style:square;mso-wrap-distance-left:9pt;mso-wrap-distance-top:0;mso-wrap-distance-right:9pt;mso-wrap-distance-bottom:0;mso-position-horizontal:absolute;mso-position-horizontal-relative:text;mso-position-vertical:absolute;mso-position-vertical-relative:text;v-text-anchor:top" o:gfxdata="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" filled="f" stroked="f">
                 <v:textbox>
                   <w:txbxContent>
                     <w:p>
@@ -12666,15 +12692,15 @@
         <mc:AlternateContent>
           <mc:Choice Requires="wps">
             <w:drawing>
-              <wp:anchor distT="0" distB="0" distL="114300" distR="114300" simplePos="0" relativeHeight="251642880" behindDoc="0" locked="0" layoutInCell="1" allowOverlap="1" wp14:anchorId="59A8A5CB" wp14:editId="788F6F2D">
+              <wp:anchor distT="0" distB="0" distL="114300" distR="114300" simplePos="0" relativeHeight="251642880" behindDoc="0" locked="0" layoutInCell="1" allowOverlap="1" wp14:anchorId="59A8A5CB" wp14:editId="6B55E606">
                 <wp:simplePos x="0" y="0"/>
                 <wp:positionH relativeFrom="column">
-                  <wp:posOffset>1128712</wp:posOffset>
+                  <wp:posOffset>1130300</wp:posOffset>
                 </wp:positionH>
                 <wp:positionV relativeFrom="paragraph">
-                  <wp:posOffset>3633788</wp:posOffset>
+                  <wp:posOffset>3632200</wp:posOffset>
                 </wp:positionV>
-                <wp:extent cx="1023937" cy="353120"/>
+                <wp:extent cx="2647950" cy="353120"/>
                 <wp:effectExtent l="0" t="0" r="0" b="0"/>
                 <wp:wrapNone/>
                 <wp:docPr id="858453774" name="Text Box 2"/>
@@ -12690,7 +12716,7 @@
                       <wps:spPr bwMode="auto">
                         <a:xfrm>
                           <a:off x="0" y="0"/>
-                          <a:ext cx="1023937" cy="353120"/>
+                          <a:ext cx="2647950" cy="353120"/>
                         </a:xfrm>
                         <a:prstGeom prst="rect">
                           <a:avLst/>
@@ -12772,7 +12798,7 @@
           </mc:Choice>
           <mc:Fallback>
             <w:pict>
-              <v:shape w14:anchorId="59A8A5CB" id="_x0000_s1102" type="#_x0000_t202" style="position:absolute;margin-left:88.85pt;margin-top:286.15pt;width:80.6pt;height:27.8pt;z-index:251642880;visibility:visible;mso-wrap-style:square;mso-width-percent:0;mso-wrap-distance-left:9pt;mso-wrap-distance-top:0;mso-wrap-distance-right:9pt;mso-wrap-distance-bottom:0;mso-position-horizontal:absolute;mso-position-horizontal-relative:text;mso-position-vertical:absolute;mso-position-vertical-relative:text;mso-width-percent:0;mso-width-relative:margin;v-text-anchor:top" o:gfxdata="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" filled="f" stroked="f">
+              <v:shape w14:anchorId="59A8A5CB" id="_x0000_s1102" type="#_x0000_t202" style="position:absolute;margin-left:89pt;margin-top:286pt;width:208.5pt;height:27.8pt;z-index:251642880;visibility:visible;mso-wrap-style:square;mso-width-percent:0;mso-wrap-distance-left:9pt;mso-wrap-distance-top:0;mso-wrap-distance-right:9pt;mso-wrap-distance-bottom:0;mso-position-horizontal:absolute;mso-position-horizontal-relative:text;mso-position-vertical:absolute;mso-position-vertical-relative:text;mso-width-percent:0;mso-width-relative:margin;v-text-anchor:top" o:gfxdata="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" filled="f" stroked="f">
                 <v:textbox>
                   <w:txbxContent>
                     <w:p>
@@ -12841,7 +12867,7 @@
         <mc:AlternateContent>
           <mc:Choice Requires="wps">
             <w:drawing>
-              <wp:anchor distT="0" distB="0" distL="114300" distR="114300" simplePos="0" relativeHeight="251644928" behindDoc="0" locked="0" layoutInCell="1" allowOverlap="1" wp14:anchorId="03ADCC12" wp14:editId="553553E9">
+              <wp:anchor distT="0" distB="0" distL="114300" distR="114300" simplePos="0" relativeHeight="251644928" behindDoc="0" locked="0" layoutInCell="1" allowOverlap="1" wp14:anchorId="03ADCC12" wp14:editId="0562D1B4">
                 <wp:simplePos x="0" y="0"/>
                 <wp:positionH relativeFrom="column">
                   <wp:posOffset>4066329</wp:posOffset>
@@ -12935,7 +12961,7 @@
           </mc:Choice>
           <mc:Fallback>
             <w:pict>
-              <v:shape w14:anchorId="03ADCC12" id="_x0000_s1103" type="#_x0000_t202" style="position:absolute;margin-left:320.2pt;margin-top:286.15pt;width:62.45pt;height:27.8pt;z-index:251644928;visibility:visible;mso-wrap-style:square;mso-wrap-distance-left:9pt;mso-wrap-distance-top:0;mso-wrap-distance-right:9pt;mso-wrap-distance-bottom:0;mso-position-horizontal:absolute;mso-position-horizontal-relative:text;mso-position-vertical:absolute;mso-position-vertical-relative:text;v-text-anchor:top" o:gfxdata="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" filled="f" stroked="f">
+              <v:shape w14:anchorId="03ADCC12" id="_x0000_s1103" type="#_x0000_t202" style="position:absolute;margin-left:320.2pt;margin-top:286.15pt;width:62.45pt;height:27.8pt;z-index:251644928;visibility:visible;mso-wrap-style:square;mso-wrap-distance-left:9pt;mso-wrap-distance-top:0;mso-wrap-distance-right:9pt;mso-wrap-distance-bottom:0;mso-position-horizontal:absolute;mso-position-horizontal-relative:text;mso-position-vertical:absolute;mso-position-vertical-relative:text;v-text-anchor:top" o:gfxdata="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" filled="f" stroked="f">
                 <v:textbox>
                   <w:txbxContent>
                     <w:p>
@@ -12995,15 +13021,15 @@
         <mc:AlternateContent>
           <mc:Choice Requires="wps">
             <w:drawing>
-              <wp:anchor distT="0" distB="0" distL="114300" distR="114300" simplePos="0" relativeHeight="251646976" behindDoc="0" locked="0" layoutInCell="1" allowOverlap="1" wp14:anchorId="56A244B1" wp14:editId="31A910BA">
+              <wp:anchor distT="0" distB="0" distL="114300" distR="114300" simplePos="0" relativeHeight="251646976" behindDoc="0" locked="0" layoutInCell="1" allowOverlap="1" wp14:anchorId="56A244B1" wp14:editId="596652AA">
                 <wp:simplePos x="0" y="0"/>
                 <wp:positionH relativeFrom="column">
-                  <wp:posOffset>1128712</wp:posOffset>
+                  <wp:posOffset>1130300</wp:posOffset>
                 </wp:positionH>
                 <wp:positionV relativeFrom="paragraph">
                   <wp:posOffset>3867150</wp:posOffset>
                 </wp:positionV>
-                <wp:extent cx="1023937" cy="353120"/>
+                <wp:extent cx="2647950" cy="353120"/>
                 <wp:effectExtent l="0" t="0" r="0" b="0"/>
                 <wp:wrapNone/>
                 <wp:docPr id="858453778" name="Text Box 2"/>
@@ -13019,7 +13045,7 @@
                       <wps:spPr bwMode="auto">
                         <a:xfrm>
                           <a:off x="0" y="0"/>
-                          <a:ext cx="1023937" cy="353120"/>
+                          <a:ext cx="2647950" cy="353120"/>
                         </a:xfrm>
                         <a:prstGeom prst="rect">
                           <a:avLst/>
@@ -13101,7 +13127,7 @@
           </mc:Choice>
           <mc:Fallback>
             <w:pict>
-              <v:shape w14:anchorId="56A244B1" id="_x0000_s1104" type="#_x0000_t202" style="position:absolute;margin-left:88.85pt;margin-top:304.5pt;width:80.6pt;height:27.8pt;z-index:251646976;visibility:visible;mso-wrap-style:square;mso-width-percent:0;mso-wrap-distance-left:9pt;mso-wrap-distance-top:0;mso-wrap-distance-right:9pt;mso-wrap-distance-bottom:0;mso-position-horizontal:absolute;mso-position-horizontal-relative:text;mso-position-vertical:absolute;mso-position-vertical-relative:text;mso-width-percent:0;mso-width-relative:margin;v-text-anchor:top" o:gfxdata="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" filled="f" stroked="f">
+              <v:shape w14:anchorId="56A244B1" id="_x0000_s1104" type="#_x0000_t202" style="position:absolute;margin-left:89pt;margin-top:304.5pt;width:208.5pt;height:27.8pt;z-index:251646976;visibility:visible;mso-wrap-style:square;mso-width-percent:0;mso-wrap-distance-left:9pt;mso-wrap-distance-top:0;mso-wrap-distance-right:9pt;mso-wrap-distance-bottom:0;mso-position-horizontal:absolute;mso-position-horizontal-relative:text;mso-position-vertical:absolute;mso-position-vertical-relative:text;mso-width-percent:0;mso-width-relative:margin;v-text-anchor:top" o:gfxdata="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" filled="f" stroked="f">
                 <v:textbox>
                   <w:txbxContent>
                     <w:p>
@@ -13170,7 +13196,7 @@
         <mc:AlternateContent>
           <mc:Choice Requires="wps">
             <w:drawing>
-              <wp:anchor distT="0" distB="0" distL="114300" distR="114300" simplePos="0" relativeHeight="251649024" behindDoc="0" locked="0" layoutInCell="1" allowOverlap="1" wp14:anchorId="181A3616" wp14:editId="48293E04">
+              <wp:anchor distT="0" distB="0" distL="114300" distR="114300" simplePos="0" relativeHeight="251649024" behindDoc="0" locked="0" layoutInCell="1" allowOverlap="1" wp14:anchorId="181A3616" wp14:editId="7A6466EC">
                 <wp:simplePos x="0" y="0"/>
                 <wp:positionH relativeFrom="column">
                   <wp:posOffset>4066329</wp:posOffset>
@@ -13264,7 +13290,7 @@
           </mc:Choice>
           <mc:Fallback>
             <w:pict>
-              <v:shape w14:anchorId="181A3616" id="_x0000_s1105" type="#_x0000_t202" style="position:absolute;margin-left:320.2pt;margin-top:304.5pt;width:62.45pt;height:27.8pt;z-index:251649024;visibility:visible;mso-wrap-style:square;mso-wrap-distance-left:9pt;mso-wrap-distance-top:0;mso-wrap-distance-right:9pt;mso-wrap-distance-bottom:0;mso-position-horizontal:absolute;mso-position-horizontal-relative:text;mso-position-vertical:absolute;mso-position-vertical-relative:text;v-text-anchor:top" o:gfxdata="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" filled="f" stroked="f">
+              <v:shape w14:anchorId="181A3616" id="_x0000_s1105" type="#_x0000_t202" style="position:absolute;margin-left:320.2pt;margin-top:304.5pt;width:62.45pt;height:27.8pt;z-index:251649024;visibility:visible;mso-wrap-style:square;mso-wrap-distance-left:9pt;mso-wrap-distance-top:0;mso-wrap-distance-right:9pt;mso-wrap-distance-bottom:0;mso-position-horizontal:absolute;mso-position-horizontal-relative:text;mso-position-vertical:absolute;mso-position-vertical-relative:text;v-text-anchor:top" o:gfxdata="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" filled="f" stroked="f">
                 <v:textbox>
                   <w:txbxContent>
                     <w:p>
@@ -13324,15 +13350,15 @@
         <mc:AlternateContent>
           <mc:Choice Requires="wps">
             <w:drawing>
-              <wp:anchor distT="0" distB="0" distL="114300" distR="114300" simplePos="0" relativeHeight="251651072" behindDoc="0" locked="0" layoutInCell="1" allowOverlap="1" wp14:anchorId="239DA073" wp14:editId="3DF38151">
+              <wp:anchor distT="0" distB="0" distL="114300" distR="114300" simplePos="0" relativeHeight="251651072" behindDoc="0" locked="0" layoutInCell="1" allowOverlap="1" wp14:anchorId="239DA073" wp14:editId="457E1F8C">
                 <wp:simplePos x="0" y="0"/>
                 <wp:positionH relativeFrom="column">
-                  <wp:posOffset>1128712</wp:posOffset>
+                  <wp:posOffset>1130300</wp:posOffset>
                 </wp:positionH>
                 <wp:positionV relativeFrom="paragraph">
-                  <wp:posOffset>4119563</wp:posOffset>
+                  <wp:posOffset>4121150</wp:posOffset>
                 </wp:positionV>
-                <wp:extent cx="1023937" cy="353120"/>
+                <wp:extent cx="2647950" cy="353120"/>
                 <wp:effectExtent l="0" t="0" r="0" b="0"/>
                 <wp:wrapNone/>
                 <wp:docPr id="858453782" name="Text Box 2"/>
@@ -13348,7 +13374,7 @@
                       <wps:spPr bwMode="auto">
                         <a:xfrm>
                           <a:off x="0" y="0"/>
-                          <a:ext cx="1023937" cy="353120"/>
+                          <a:ext cx="2647950" cy="353120"/>
                         </a:xfrm>
                         <a:prstGeom prst="rect">
                           <a:avLst/>
@@ -13430,7 +13456,7 @@
           </mc:Choice>
           <mc:Fallback>
             <w:pict>
-              <v:shape w14:anchorId="239DA073" id="_x0000_s1106" type="#_x0000_t202" style="position:absolute;margin-left:88.85pt;margin-top:324.4pt;width:80.6pt;height:27.8pt;z-index:251651072;visibility:visible;mso-wrap-style:square;mso-width-percent:0;mso-wrap-distance-left:9pt;mso-wrap-distance-top:0;mso-wrap-distance-right:9pt;mso-wrap-distance-bottom:0;mso-position-horizontal:absolute;mso-position-horizontal-relative:text;mso-position-vertical:absolute;mso-position-vertical-relative:text;mso-width-percent:0;mso-width-relative:margin;v-text-anchor:top" o:gfxdata="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" filled="f" stroked="f">
+              <v:shape w14:anchorId="239DA073" id="_x0000_s1106" type="#_x0000_t202" style="position:absolute;margin-left:89pt;margin-top:324.5pt;width:208.5pt;height:27.8pt;z-index:251651072;visibility:visible;mso-wrap-style:square;mso-width-percent:0;mso-wrap-distance-left:9pt;mso-wrap-distance-top:0;mso-wrap-distance-right:9pt;mso-wrap-distance-bottom:0;mso-position-horizontal:absolute;mso-position-horizontal-relative:text;mso-position-vertical:absolute;mso-position-vertical-relative:text;mso-width-percent:0;mso-width-relative:margin;v-text-anchor:top" o:gfxdata="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" filled="f" stroked="f">
                 <v:textbox>
                   <w:txbxContent>
                     <w:p>
@@ -13499,7 +13525,7 @@
         <mc:AlternateContent>
           <mc:Choice Requires="wps">
             <w:drawing>
-              <wp:anchor distT="0" distB="0" distL="114300" distR="114300" simplePos="0" relativeHeight="251653120" behindDoc="0" locked="0" layoutInCell="1" allowOverlap="1" wp14:anchorId="0765C576" wp14:editId="4B45C324">
+              <wp:anchor distT="0" distB="0" distL="114300" distR="114300" simplePos="0" relativeHeight="251653120" behindDoc="0" locked="0" layoutInCell="1" allowOverlap="1" wp14:anchorId="0765C576" wp14:editId="77E153E7">
                 <wp:simplePos x="0" y="0"/>
                 <wp:positionH relativeFrom="column">
                   <wp:posOffset>4066329</wp:posOffset>
@@ -13593,7 +13619,7 @@
           </mc:Choice>
           <mc:Fallback>
             <w:pict>
-              <v:shape w14:anchorId="0765C576" id="_x0000_s1107" type="#_x0000_t202" style="position:absolute;margin-left:320.2pt;margin-top:324.4pt;width:62.45pt;height:27.8pt;z-index:251653120;visibility:visible;mso-wrap-style:square;mso-wrap-distance-left:9pt;mso-wrap-distance-top:0;mso-wrap-distance-right:9pt;mso-wrap-distance-bottom:0;mso-position-horizontal:absolute;mso-position-horizontal-relative:text;mso-position-vertical:absolute;mso-position-vertical-relative:text;v-text-anchor:top" o:gfxdata="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" filled="f" stroked="f">
+              <v:shape w14:anchorId="0765C576" id="_x0000_s1107" type="#_x0000_t202" style="position:absolute;margin-left:320.2pt;margin-top:324.4pt;width:62.45pt;height:27.8pt;z-index:251653120;visibility:visible;mso-wrap-style:square;mso-wrap-distance-left:9pt;mso-wrap-distance-top:0;mso-wrap-distance-right:9pt;mso-wrap-distance-bottom:0;mso-position-horizontal:absolute;mso-position-horizontal-relative:text;mso-position-vertical:absolute;mso-position-vertical-relative:text;v-text-anchor:top" o:gfxdata="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" filled="f" stroked="f">
                 <v:textbox>
                   <w:txbxContent>
                     <w:p>
@@ -13653,15 +13679,15 @@
         <mc:AlternateContent>
           <mc:Choice Requires="wps">
             <w:drawing>
-              <wp:anchor distT="0" distB="0" distL="114300" distR="114300" simplePos="0" relativeHeight="251655168" behindDoc="0" locked="0" layoutInCell="1" allowOverlap="1" wp14:anchorId="5AAD01E5" wp14:editId="41B4E0C9">
+              <wp:anchor distT="0" distB="0" distL="114300" distR="114300" simplePos="0" relativeHeight="251655168" behindDoc="0" locked="0" layoutInCell="1" allowOverlap="1" wp14:anchorId="5AAD01E5" wp14:editId="128D04E5">
                 <wp:simplePos x="0" y="0"/>
                 <wp:positionH relativeFrom="column">
-                  <wp:posOffset>1128712</wp:posOffset>
+                  <wp:posOffset>1130300</wp:posOffset>
                 </wp:positionH>
                 <wp:positionV relativeFrom="paragraph">
-                  <wp:posOffset>4348163</wp:posOffset>
+                  <wp:posOffset>4349750</wp:posOffset>
                 </wp:positionV>
-                <wp:extent cx="1023937" cy="353120"/>
+                <wp:extent cx="2647950" cy="353120"/>
                 <wp:effectExtent l="0" t="0" r="0" b="0"/>
                 <wp:wrapNone/>
                 <wp:docPr id="858453786" name="Text Box 2"/>
@@ -13677,7 +13703,7 @@
                       <wps:spPr bwMode="auto">
                         <a:xfrm>
                           <a:off x="0" y="0"/>
-                          <a:ext cx="1023937" cy="353120"/>
+                          <a:ext cx="2647950" cy="353120"/>
                         </a:xfrm>
                         <a:prstGeom prst="rect">
                           <a:avLst/>
@@ -13759,7 +13785,7 @@
           </mc:Choice>
           <mc:Fallback>
             <w:pict>
-              <v:shape w14:anchorId="5AAD01E5" id="_x0000_s1108" type="#_x0000_t202" style="position:absolute;margin-left:88.85pt;margin-top:342.4pt;width:80.6pt;height:27.8pt;z-index:251655168;visibility:visible;mso-wrap-style:square;mso-width-percent:0;mso-wrap-distance-left:9pt;mso-wrap-distance-top:0;mso-wrap-distance-right:9pt;mso-wrap-distance-bottom:0;mso-position-horizontal:absolute;mso-position-horizontal-relative:text;mso-position-vertical:absolute;mso-position-vertical-relative:text;mso-width-percent:0;mso-width-relative:margin;v-text-anchor:top" o:gfxdata="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" filled="f" stroked="f">
+              <v:shape w14:anchorId="5AAD01E5" id="_x0000_s1108" type="#_x0000_t202" style="position:absolute;margin-left:89pt;margin-top:342.5pt;width:208.5pt;height:27.8pt;z-index:251655168;visibility:visible;mso-wrap-style:square;mso-width-percent:0;mso-wrap-distance-left:9pt;mso-wrap-distance-top:0;mso-wrap-distance-right:9pt;mso-wrap-distance-bottom:0;mso-position-horizontal:absolute;mso-position-horizontal-relative:text;mso-position-vertical:absolute;mso-position-vertical-relative:text;mso-width-percent:0;mso-width-relative:margin;v-text-anchor:top" o:gfxdata="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" filled="f" stroked="f">
                 <v:textbox>
                   <w:txbxContent>
                     <w:p>
@@ -13828,7 +13854,7 @@
         <mc:AlternateContent>
           <mc:Choice Requires="wps">
             <w:drawing>
-              <wp:anchor distT="0" distB="0" distL="114300" distR="114300" simplePos="0" relativeHeight="251657216" behindDoc="0" locked="0" layoutInCell="1" allowOverlap="1" wp14:anchorId="240E4635" wp14:editId="3FBB9348">
+              <wp:anchor distT="0" distB="0" distL="114300" distR="114300" simplePos="0" relativeHeight="251657216" behindDoc="0" locked="0" layoutInCell="1" allowOverlap="1" wp14:anchorId="240E4635" wp14:editId="72429C2E">
                 <wp:simplePos x="0" y="0"/>
                 <wp:positionH relativeFrom="column">
                   <wp:posOffset>4066329</wp:posOffset>
@@ -13922,7 +13948,7 @@
           </mc:Choice>
           <mc:Fallback>
             <w:pict>
-              <v:shape w14:anchorId="240E4635" id="_x0000_s1109" type="#_x0000_t202" style="position:absolute;margin-left:320.2pt;margin-top:342.4pt;width:62.45pt;height:27.8pt;z-index:251657216;visibility:visible;mso-wrap-style:square;mso-wrap-distance-left:9pt;mso-wrap-distance-top:0;mso-wrap-distance-right:9pt;mso-wrap-distance-bottom:0;mso-position-horizontal:absolute;mso-position-horizontal-relative:text;mso-position-vertical:absolute;mso-position-vertical-relative:text;v-text-anchor:top" o:gfxdata="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" filled="f" stroked="f">
+              <v:shape w14:anchorId="240E4635" id="_x0000_s1109" type="#_x0000_t202" style="position:absolute;margin-left:320.2pt;margin-top:342.4pt;width:62.45pt;height:27.8pt;z-index:251657216;visibility:visible;mso-wrap-style:square;mso-wrap-distance-left:9pt;mso-wrap-distance-top:0;mso-wrap-distance-right:9pt;mso-wrap-distance-bottom:0;mso-position-horizontal:absolute;mso-position-horizontal-relative:text;mso-position-vertical:absolute;mso-position-vertical-relative:text;v-text-anchor:top" o:gfxdata="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" filled="f" stroked="f">
                 <v:textbox>
                   <w:txbxContent>
                     <w:p>
@@ -13982,15 +14008,15 @@
         <mc:AlternateContent>
           <mc:Choice Requires="wps">
             <w:drawing>
-              <wp:anchor distT="0" distB="0" distL="114300" distR="114300" simplePos="0" relativeHeight="251659264" behindDoc="0" locked="0" layoutInCell="1" allowOverlap="1" wp14:anchorId="232AB68F" wp14:editId="5320491F">
+              <wp:anchor distT="0" distB="0" distL="114300" distR="114300" simplePos="0" relativeHeight="251659264" behindDoc="0" locked="0" layoutInCell="1" allowOverlap="1" wp14:anchorId="232AB68F" wp14:editId="47018029">
                 <wp:simplePos x="0" y="0"/>
                 <wp:positionH relativeFrom="column">
-                  <wp:posOffset>1128712</wp:posOffset>
+                  <wp:posOffset>1130300</wp:posOffset>
                 </wp:positionH>
                 <wp:positionV relativeFrom="paragraph">
-                  <wp:posOffset>4605338</wp:posOffset>
+                  <wp:posOffset>4603750</wp:posOffset>
                 </wp:positionV>
-                <wp:extent cx="1023937" cy="353120"/>
+                <wp:extent cx="2647950" cy="353120"/>
                 <wp:effectExtent l="0" t="0" r="0" b="0"/>
                 <wp:wrapNone/>
                 <wp:docPr id="858453790" name="Text Box 2"/>
@@ -14006,7 +14032,7 @@
                       <wps:spPr bwMode="auto">
                         <a:xfrm>
                           <a:off x="0" y="0"/>
-                          <a:ext cx="1023937" cy="353120"/>
+                          <a:ext cx="2647950" cy="353120"/>
                         </a:xfrm>
                         <a:prstGeom prst="rect">
                           <a:avLst/>
@@ -14088,7 +14114,7 @@
           </mc:Choice>
           <mc:Fallback>
             <w:pict>
-              <v:shape w14:anchorId="232AB68F" id="_x0000_s1110" type="#_x0000_t202" style="position:absolute;margin-left:88.85pt;margin-top:362.65pt;width:80.6pt;height:27.8pt;z-index:251659264;visibility:visible;mso-wrap-style:square;mso-width-percent:0;mso-wrap-distance-left:9pt;mso-wrap-distance-top:0;mso-wrap-distance-right:9pt;mso-wrap-distance-bottom:0;mso-position-horizontal:absolute;mso-position-horizontal-relative:text;mso-position-vertical:absolute;mso-position-vertical-relative:text;mso-width-percent:0;mso-width-relative:margin;v-text-anchor:top" o:gfxdata="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" filled="f" stroked="f">
+              <v:shape w14:anchorId="232AB68F" id="_x0000_s1110" type="#_x0000_t202" style="position:absolute;margin-left:89pt;margin-top:362.5pt;width:208.5pt;height:27.8pt;z-index:251659264;visibility:visible;mso-wrap-style:square;mso-width-percent:0;mso-wrap-distance-left:9pt;mso-wrap-distance-top:0;mso-wrap-distance-right:9pt;mso-wrap-distance-bottom:0;mso-position-horizontal:absolute;mso-position-horizontal-relative:text;mso-position-vertical:absolute;mso-position-vertical-relative:text;mso-width-percent:0;mso-width-relative:margin;v-text-anchor:top" o:gfxdata="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" filled="f" stroked="f">
                 <v:textbox>
                   <w:txbxContent>
                     <w:p>
@@ -14157,7 +14183,7 @@
         <mc:AlternateContent>
           <mc:Choice Requires="wps">
             <w:drawing>
-              <wp:anchor distT="0" distB="0" distL="114300" distR="114300" simplePos="0" relativeHeight="251661312" behindDoc="0" locked="0" layoutInCell="1" allowOverlap="1" wp14:anchorId="3677930C" wp14:editId="284164E1">
+              <wp:anchor distT="0" distB="0" distL="114300" distR="114300" simplePos="0" relativeHeight="251661312" behindDoc="0" locked="0" layoutInCell="1" allowOverlap="1" wp14:anchorId="3677930C" wp14:editId="2C4FD79E">
                 <wp:simplePos x="0" y="0"/>
                 <wp:positionH relativeFrom="column">
                   <wp:posOffset>4066329</wp:posOffset>
@@ -14251,7 +14277,7 @@
           </mc:Choice>
           <mc:Fallback>
             <w:pict>
-              <v:shape w14:anchorId="3677930C" id="_x0000_s1111" type="#_x0000_t202" style="position:absolute;margin-left:320.2pt;margin-top:362.65pt;width:62.45pt;height:27.8pt;z-index:251661312;visibility:visible;mso-wrap-style:square;mso-wrap-distance-left:9pt;mso-wrap-distance-top:0;mso-wrap-distance-right:9pt;mso-wrap-distance-bottom:0;mso-position-horizontal:absolute;mso-position-horizontal-relative:text;mso-position-vertical:absolute;mso-position-vertical-relative:text;v-text-anchor:top" o:gfxdata="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" filled="f" stroked="f">
+              <v:shape w14:anchorId="3677930C" id="_x0000_s1111" type="#_x0000_t202" style="position:absolute;margin-left:320.2pt;margin-top:362.65pt;width:62.45pt;height:27.8pt;z-index:251661312;visibility:visible;mso-wrap-style:square;mso-wrap-distance-left:9pt;mso-wrap-distance-top:0;mso-wrap-distance-right:9pt;mso-wrap-distance-bottom:0;mso-position-horizontal:absolute;mso-position-horizontal-relative:text;mso-position-vertical:absolute;mso-position-vertical-relative:text;v-text-anchor:top" o:gfxdata="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" filled="f" stroked="f">
                 <v:textbox>
                   <w:txbxContent>
                     <w:p>
@@ -14311,15 +14337,15 @@
         <mc:AlternateContent>
           <mc:Choice Requires="wps">
             <w:drawing>
-              <wp:anchor distT="0" distB="0" distL="114300" distR="114300" simplePos="0" relativeHeight="251665408" behindDoc="0" locked="0" layoutInCell="1" allowOverlap="1" wp14:anchorId="255267F7" wp14:editId="18A21CC1">
+              <wp:anchor distT="0" distB="0" distL="114300" distR="114300" simplePos="0" relativeHeight="251665408" behindDoc="0" locked="0" layoutInCell="1" allowOverlap="1" wp14:anchorId="255267F7" wp14:editId="1F9E7CDD">
                 <wp:simplePos x="0" y="0"/>
                 <wp:positionH relativeFrom="column">
-                  <wp:posOffset>1128712</wp:posOffset>
+                  <wp:posOffset>1130300</wp:posOffset>
                 </wp:positionH>
                 <wp:positionV relativeFrom="paragraph">
                   <wp:posOffset>4819650</wp:posOffset>
                 </wp:positionV>
-                <wp:extent cx="1023937" cy="353120"/>
+                <wp:extent cx="2647950" cy="353120"/>
                 <wp:effectExtent l="0" t="0" r="0" b="0"/>
                 <wp:wrapNone/>
                 <wp:docPr id="1472520464" name="Text Box 2"/>
@@ -14335,7 +14361,7 @@
                       <wps:spPr bwMode="auto">
                         <a:xfrm>
                           <a:off x="0" y="0"/>
-                          <a:ext cx="1023937" cy="353120"/>
+                          <a:ext cx="2647950" cy="353120"/>
                         </a:xfrm>
                         <a:prstGeom prst="rect">
                           <a:avLst/>
@@ -14417,7 +14443,7 @@
           </mc:Choice>
           <mc:Fallback>
             <w:pict>
-              <v:shape w14:anchorId="255267F7" id="_x0000_s1112" type="#_x0000_t202" style="position:absolute;margin-left:88.85pt;margin-top:379.5pt;width:80.6pt;height:27.8pt;z-index:251665408;visibility:visible;mso-wrap-style:square;mso-width-percent:0;mso-wrap-distance-left:9pt;mso-wrap-distance-top:0;mso-wrap-distance-right:9pt;mso-wrap-distance-bottom:0;mso-position-horizontal:absolute;mso-position-horizontal-relative:text;mso-position-vertical:absolute;mso-position-vertical-relative:text;mso-width-percent:0;mso-width-relative:margin;v-text-anchor:top" o:gfxdata="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" filled="f" stroked="f">
+              <v:shape w14:anchorId="255267F7" id="_x0000_s1112" type="#_x0000_t202" style="position:absolute;margin-left:89pt;margin-top:379.5pt;width:208.5pt;height:27.8pt;z-index:251665408;visibility:visible;mso-wrap-style:square;mso-width-percent:0;mso-wrap-distance-left:9pt;mso-wrap-distance-top:0;mso-wrap-distance-right:9pt;mso-wrap-distance-bottom:0;mso-position-horizontal:absolute;mso-position-horizontal-relative:text;mso-position-vertical:absolute;mso-position-vertical-relative:text;mso-width-percent:0;mso-width-relative:margin;v-text-anchor:top" o:gfxdata="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" filled="f" stroked="f">
                 <v:textbox>
                   <w:txbxContent>
                     <w:p>
@@ -14486,7 +14512,7 @@
         <mc:AlternateContent>
           <mc:Choice Requires="wps">
             <w:drawing>
-              <wp:anchor distT="0" distB="0" distL="114300" distR="114300" simplePos="0" relativeHeight="251667456" behindDoc="0" locked="0" layoutInCell="1" allowOverlap="1" wp14:anchorId="212DB965" wp14:editId="5FBCD318">
+              <wp:anchor distT="0" distB="0" distL="114300" distR="114300" simplePos="0" relativeHeight="251667456" behindDoc="0" locked="0" layoutInCell="1" allowOverlap="1" wp14:anchorId="212DB965" wp14:editId="04F027F4">
                 <wp:simplePos x="0" y="0"/>
                 <wp:positionH relativeFrom="column">
                   <wp:posOffset>4066329</wp:posOffset>
@@ -14580,7 +14606,7 @@
           </mc:Choice>
           <mc:Fallback>
             <w:pict>
-              <v:shape w14:anchorId="212DB965" id="_x0000_s1113" type="#_x0000_t202" style="position:absolute;margin-left:320.2pt;margin-top:379.5pt;width:62.45pt;height:27.8pt;z-index:251667456;visibility:visible;mso-wrap-style:square;mso-wrap-distance-left:9pt;mso-wrap-distance-top:0;mso-wrap-distance-right:9pt;mso-wrap-distance-bottom:0;mso-position-horizontal:absolute;mso-position-horizontal-relative:text;mso-position-vertical:absolute;mso-position-vertical-relative:text;v-text-anchor:top" o:gfxdata="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" filled="f" stroked="f">
+              <v:shape w14:anchorId="212DB965" id="_x0000_s1113" type="#_x0000_t202" style="position:absolute;margin-left:320.2pt;margin-top:379.5pt;width:62.45pt;height:27.8pt;z-index:251667456;visibility:visible;mso-wrap-style:square;mso-wrap-distance-left:9pt;mso-wrap-distance-top:0;mso-wrap-distance-right:9pt;mso-wrap-distance-bottom:0;mso-position-horizontal:absolute;mso-position-horizontal-relative:text;mso-position-vertical:absolute;mso-position-vertical-relative:text;v-text-anchor:top" o:gfxdata="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" filled="f" stroked="f">
                 <v:textbox>
                   <w:txbxContent>
                     <w:p>
@@ -14640,15 +14666,15 @@
         <mc:AlternateContent>
           <mc:Choice Requires="wps">
             <w:drawing>
-              <wp:anchor distT="0" distB="0" distL="114300" distR="114300" simplePos="0" relativeHeight="251669504" behindDoc="0" locked="0" layoutInCell="1" allowOverlap="1" wp14:anchorId="376E648E" wp14:editId="1E35E092">
+              <wp:anchor distT="0" distB="0" distL="114300" distR="114300" simplePos="0" relativeHeight="251669504" behindDoc="0" locked="0" layoutInCell="1" allowOverlap="1" wp14:anchorId="376E648E" wp14:editId="1E28E734">
                 <wp:simplePos x="0" y="0"/>
                 <wp:positionH relativeFrom="column">
-                  <wp:posOffset>1128712</wp:posOffset>
+                  <wp:posOffset>1130300</wp:posOffset>
                 </wp:positionH>
                 <wp:positionV relativeFrom="paragraph">
-                  <wp:posOffset>5072063</wp:posOffset>
+                  <wp:posOffset>5073650</wp:posOffset>
                 </wp:positionV>
-                <wp:extent cx="1023937" cy="353120"/>
+                <wp:extent cx="2647950" cy="353120"/>
                 <wp:effectExtent l="0" t="0" r="0" b="0"/>
                 <wp:wrapNone/>
                 <wp:docPr id="665179831" name="Text Box 2"/>
@@ -14664,7 +14690,7 @@
                       <wps:spPr bwMode="auto">
                         <a:xfrm>
                           <a:off x="0" y="0"/>
-                          <a:ext cx="1023937" cy="353120"/>
+                          <a:ext cx="2647950" cy="353120"/>
                         </a:xfrm>
                         <a:prstGeom prst="rect">
                           <a:avLst/>
@@ -14746,7 +14772,7 @@
           </mc:Choice>
           <mc:Fallback>
             <w:pict>
-              <v:shape w14:anchorId="376E648E" id="_x0000_s1114" type="#_x0000_t202" style="position:absolute;margin-left:88.85pt;margin-top:399.4pt;width:80.6pt;height:27.8pt;z-index:251669504;visibility:visible;mso-wrap-style:square;mso-width-percent:0;mso-wrap-distance-left:9pt;mso-wrap-distance-top:0;mso-wrap-distance-right:9pt;mso-wrap-distance-bottom:0;mso-position-horizontal:absolute;mso-position-horizontal-relative:text;mso-position-vertical:absolute;mso-position-vertical-relative:text;mso-width-percent:0;mso-width-relative:margin;v-text-anchor:top" o:gfxdata="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" filled="f" stroked="f">
+              <v:shape w14:anchorId="376E648E" id="_x0000_s1114" type="#_x0000_t202" style="position:absolute;margin-left:89pt;margin-top:399.5pt;width:208.5pt;height:27.8pt;z-index:251669504;visibility:visible;mso-wrap-style:square;mso-width-percent:0;mso-wrap-distance-left:9pt;mso-wrap-distance-top:0;mso-wrap-distance-right:9pt;mso-wrap-distance-bottom:0;mso-position-horizontal:absolute;mso-position-horizontal-relative:text;mso-position-vertical:absolute;mso-position-vertical-relative:text;mso-width-percent:0;mso-width-relative:margin;v-text-anchor:top" o:gfxdata="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" filled="f" stroked="f">
                 <v:textbox>
                   <w:txbxContent>
                     <w:p>
@@ -14815,7 +14841,7 @@
         <mc:AlternateContent>
           <mc:Choice Requires="wps">
             <w:drawing>
-              <wp:anchor distT="0" distB="0" distL="114300" distR="114300" simplePos="0" relativeHeight="251671552" behindDoc="0" locked="0" layoutInCell="1" allowOverlap="1" wp14:anchorId="6F10CFDE" wp14:editId="658E20E4">
+              <wp:anchor distT="0" distB="0" distL="114300" distR="114300" simplePos="0" relativeHeight="251671552" behindDoc="0" locked="0" layoutInCell="1" allowOverlap="1" wp14:anchorId="6F10CFDE" wp14:editId="14E2770F">
                 <wp:simplePos x="0" y="0"/>
                 <wp:positionH relativeFrom="column">
                   <wp:posOffset>4066329</wp:posOffset>
@@ -14909,7 +14935,7 @@
           </mc:Choice>
           <mc:Fallback>
             <w:pict>
-              <v:shape w14:anchorId="6F10CFDE" id="_x0000_s1115" type="#_x0000_t202" style="position:absolute;margin-left:320.2pt;margin-top:399.4pt;width:62.45pt;height:27.8pt;z-index:251671552;visibility:visible;mso-wrap-style:square;mso-wrap-distance-left:9pt;mso-wrap-distance-top:0;mso-wrap-distance-right:9pt;mso-wrap-distance-bottom:0;mso-position-horizontal:absolute;mso-position-horizontal-relative:text;mso-position-vertical:absolute;mso-position-vertical-relative:text;v-text-anchor:top" o:gfxdata="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" filled="f" stroked="f">
+              <v:shape w14:anchorId="6F10CFDE" id="_x0000_s1115" type="#_x0000_t202" style="position:absolute;margin-left:320.2pt;margin-top:399.4pt;width:62.45pt;height:27.8pt;z-index:251671552;visibility:visible;mso-wrap-style:square;mso-wrap-distance-left:9pt;mso-wrap-distance-top:0;mso-wrap-distance-right:9pt;mso-wrap-distance-bottom:0;mso-position-horizontal:absolute;mso-position-horizontal-relative:text;mso-position-vertical:absolute;mso-position-vertical-relative:text;v-text-anchor:top" o:gfxdata="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" filled="f" stroked="f">
                 <v:textbox>
                   <w:txbxContent>
                     <w:p>
@@ -14969,15 +14995,15 @@
         <mc:AlternateContent>
           <mc:Choice Requires="wps">
             <w:drawing>
-              <wp:anchor distT="0" distB="0" distL="114300" distR="114300" simplePos="0" relativeHeight="251673600" behindDoc="0" locked="0" layoutInCell="1" allowOverlap="1" wp14:anchorId="7E61D2C5" wp14:editId="13F50D52">
+              <wp:anchor distT="0" distB="0" distL="114300" distR="114300" simplePos="0" relativeHeight="251673600" behindDoc="0" locked="0" layoutInCell="1" allowOverlap="1" wp14:anchorId="7E61D2C5" wp14:editId="223A8338">
                 <wp:simplePos x="0" y="0"/>
                 <wp:positionH relativeFrom="column">
-                  <wp:posOffset>1128712</wp:posOffset>
+                  <wp:posOffset>1130300</wp:posOffset>
                 </wp:positionH>
                 <wp:positionV relativeFrom="paragraph">
-                  <wp:posOffset>5305425</wp:posOffset>
+                  <wp:posOffset>5308600</wp:posOffset>
                 </wp:positionV>
-                <wp:extent cx="1023937" cy="353120"/>
+                <wp:extent cx="2647950" cy="353120"/>
                 <wp:effectExtent l="0" t="0" r="0" b="0"/>
                 <wp:wrapNone/>
                 <wp:docPr id="1005379242" name="Text Box 2"/>
@@ -14993,7 +15019,7 @@
                       <wps:spPr bwMode="auto">
                         <a:xfrm>
                           <a:off x="0" y="0"/>
-                          <a:ext cx="1023937" cy="353120"/>
+                          <a:ext cx="2647950" cy="353120"/>
                         </a:xfrm>
                         <a:prstGeom prst="rect">
                           <a:avLst/>
@@ -15075,7 +15101,7 @@
           </mc:Choice>
           <mc:Fallback>
             <w:pict>
-              <v:shape w14:anchorId="7E61D2C5" id="_x0000_s1116" type="#_x0000_t202" style="position:absolute;margin-left:88.85pt;margin-top:417.75pt;width:80.6pt;height:27.8pt;z-index:251673600;visibility:visible;mso-wrap-style:square;mso-width-percent:0;mso-wrap-distance-left:9pt;mso-wrap-distance-top:0;mso-wrap-distance-right:9pt;mso-wrap-distance-bottom:0;mso-position-horizontal:absolute;mso-position-horizontal-relative:text;mso-position-vertical:absolute;mso-position-vertical-relative:text;mso-width-percent:0;mso-width-relative:margin;v-text-anchor:top" o:gfxdata="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" filled="f" stroked="f">
+              <v:shape w14:anchorId="7E61D2C5" id="_x0000_s1116" type="#_x0000_t202" style="position:absolute;margin-left:89pt;margin-top:418pt;width:208.5pt;height:27.8pt;z-index:251673600;visibility:visible;mso-wrap-style:square;mso-width-percent:0;mso-wrap-distance-left:9pt;mso-wrap-distance-top:0;mso-wrap-distance-right:9pt;mso-wrap-distance-bottom:0;mso-position-horizontal:absolute;mso-position-horizontal-relative:text;mso-position-vertical:absolute;mso-position-vertical-relative:text;mso-width-percent:0;mso-width-relative:margin;v-text-anchor:top" o:gfxdata="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" filled="f" stroked="f">
                 <v:textbox>
                   <w:txbxContent>
                     <w:p>
@@ -15144,7 +15170,7 @@
         <mc:AlternateContent>
           <mc:Choice Requires="wps">
             <w:drawing>
-              <wp:anchor distT="0" distB="0" distL="114300" distR="114300" simplePos="0" relativeHeight="251675648" behindDoc="0" locked="0" layoutInCell="1" allowOverlap="1" wp14:anchorId="223FE816" wp14:editId="0026C481">
+              <wp:anchor distT="0" distB="0" distL="114300" distR="114300" simplePos="0" relativeHeight="251675648" behindDoc="0" locked="0" layoutInCell="1" allowOverlap="1" wp14:anchorId="223FE816" wp14:editId="0710EBE6">
                 <wp:simplePos x="0" y="0"/>
                 <wp:positionH relativeFrom="column">
                   <wp:posOffset>4066329</wp:posOffset>
@@ -15238,7 +15264,7 @@
           </mc:Choice>
           <mc:Fallback>
             <w:pict>
-              <v:shape w14:anchorId="223FE816" id="_x0000_s1117" type="#_x0000_t202" style="position:absolute;margin-left:320.2pt;margin-top:417.75pt;width:62.45pt;height:27.8pt;z-index:251675648;visibility:visible;mso-wrap-style:square;mso-wrap-distance-left:9pt;mso-wrap-distance-top:0;mso-wrap-distance-right:9pt;mso-wrap-distance-bottom:0;mso-position-horizontal:absolute;mso-position-horizontal-relative:text;mso-position-vertical:absolute;mso-position-vertical-relative:text;v-text-anchor:top" o:gfxdata="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" filled="f" stroked="f">
+              <v:shape w14:anchorId="223FE816" id="_x0000_s1117" type="#_x0000_t202" style="position:absolute;margin-left:320.2pt;margin-top:417.75pt;width:62.45pt;height:27.8pt;z-index:251675648;visibility:visible;mso-wrap-style:square;mso-wrap-distance-left:9pt;mso-wrap-distance-top:0;mso-wrap-distance-right:9pt;mso-wrap-distance-bottom:0;mso-position-horizontal:absolute;mso-position-horizontal-relative:text;mso-position-vertical:absolute;mso-position-vertical-relative:text;v-text-anchor:top" o:gfxdata="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" filled="f" stroked="f">
                 <v:textbox>
                   <w:txbxContent>
                     <w:p>
@@ -15298,15 +15324,15 @@
         <mc:AlternateContent>
           <mc:Choice Requires="wps">
             <w:drawing>
-              <wp:anchor distT="0" distB="0" distL="114300" distR="114300" simplePos="0" relativeHeight="251677696" behindDoc="0" locked="0" layoutInCell="1" allowOverlap="1" wp14:anchorId="182D506B" wp14:editId="3B0CB2D2">
+              <wp:anchor distT="0" distB="0" distL="114300" distR="114300" simplePos="0" relativeHeight="251677696" behindDoc="0" locked="0" layoutInCell="1" allowOverlap="1" wp14:anchorId="182D506B" wp14:editId="39C8C034">
                 <wp:simplePos x="0" y="0"/>
                 <wp:positionH relativeFrom="column">
-                  <wp:posOffset>1128712</wp:posOffset>
+                  <wp:posOffset>1130300</wp:posOffset>
                 </wp:positionH>
                 <wp:positionV relativeFrom="paragraph">
-                  <wp:posOffset>5557838</wp:posOffset>
+                  <wp:posOffset>5556250</wp:posOffset>
                 </wp:positionV>
-                <wp:extent cx="1023937" cy="353120"/>
+                <wp:extent cx="2647950" cy="353120"/>
                 <wp:effectExtent l="0" t="0" r="0" b="0"/>
                 <wp:wrapNone/>
                 <wp:docPr id="2040860602" name="Text Box 2"/>
@@ -15322,7 +15348,7 @@
                       <wps:spPr bwMode="auto">
                         <a:xfrm>
                           <a:off x="0" y="0"/>
-                          <a:ext cx="1023937" cy="353120"/>
+                          <a:ext cx="2647950" cy="353120"/>
                         </a:xfrm>
                         <a:prstGeom prst="rect">
                           <a:avLst/>
@@ -15404,7 +15430,7 @@
           </mc:Choice>
           <mc:Fallback>
             <w:pict>
-              <v:shape w14:anchorId="182D506B" id="_x0000_s1118" type="#_x0000_t202" style="position:absolute;margin-left:88.85pt;margin-top:437.65pt;width:80.6pt;height:27.8pt;z-index:251677696;visibility:visible;mso-wrap-style:square;mso-width-percent:0;mso-wrap-distance-left:9pt;mso-wrap-distance-top:0;mso-wrap-distance-right:9pt;mso-wrap-distance-bottom:0;mso-position-horizontal:absolute;mso-position-horizontal-relative:text;mso-position-vertical:absolute;mso-position-vertical-relative:text;mso-width-percent:0;mso-width-relative:margin;v-text-anchor:top" o:gfxdata="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" filled="f" stroked="f">
+              <v:shape w14:anchorId="182D506B" id="_x0000_s1118" type="#_x0000_t202" style="position:absolute;margin-left:89pt;margin-top:437.5pt;width:208.5pt;height:27.8pt;z-index:251677696;visibility:visible;mso-wrap-style:square;mso-width-percent:0;mso-wrap-distance-left:9pt;mso-wrap-distance-top:0;mso-wrap-distance-right:9pt;mso-wrap-distance-bottom:0;mso-position-horizontal:absolute;mso-position-horizontal-relative:text;mso-position-vertical:absolute;mso-position-vertical-relative:text;mso-width-percent:0;mso-width-relative:margin;v-text-anchor:top" o:gfxdata="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" filled="f" stroked="f">
                 <v:textbox>
                   <w:txbxContent>
                     <w:p>
@@ -15473,7 +15499,7 @@
         <mc:AlternateContent>
           <mc:Choice Requires="wps">
             <w:drawing>
-              <wp:anchor distT="0" distB="0" distL="114300" distR="114300" simplePos="0" relativeHeight="251679744" behindDoc="0" locked="0" layoutInCell="1" allowOverlap="1" wp14:anchorId="15124733" wp14:editId="2F922CF8">
+              <wp:anchor distT="0" distB="0" distL="114300" distR="114300" simplePos="0" relativeHeight="251679744" behindDoc="0" locked="0" layoutInCell="1" allowOverlap="1" wp14:anchorId="15124733" wp14:editId="5C9BEC95">
                 <wp:simplePos x="0" y="0"/>
                 <wp:positionH relativeFrom="column">
                   <wp:posOffset>4066329</wp:posOffset>
@@ -15567,7 +15593,7 @@
           </mc:Choice>
           <mc:Fallback>
             <w:pict>
-              <v:shape w14:anchorId="15124733" id="_x0000_s1119" type="#_x0000_t202" style="position:absolute;margin-left:320.2pt;margin-top:437.65pt;width:62.45pt;height:27.8pt;z-index:251679744;visibility:visible;mso-wrap-style:square;mso-wrap-distance-left:9pt;mso-wrap-distance-top:0;mso-wrap-distance-right:9pt;mso-wrap-distance-bottom:0;mso-position-horizontal:absolute;mso-position-horizontal-relative:text;mso-position-vertical:absolute;mso-position-vertical-relative:text;v-text-anchor:top" o:gfxdata="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" filled="f" stroked="f">
+              <v:shape w14:anchorId="15124733" id="_x0000_s1119" type="#_x0000_t202" style="position:absolute;margin-left:320.2pt;margin-top:437.65pt;width:62.45pt;height:27.8pt;z-index:251679744;visibility:visible;mso-wrap-style:square;mso-wrap-distance-left:9pt;mso-wrap-distance-top:0;mso-wrap-distance-right:9pt;mso-wrap-distance-bottom:0;mso-position-horizontal:absolute;mso-position-horizontal-relative:text;mso-position-vertical:absolute;mso-position-vertical-relative:text;v-text-anchor:top" o:gfxdata="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" filled="f" stroked="f">
                 <v:textbox>
                   <w:txbxContent>
                     <w:p>
@@ -15627,15 +15653,15 @@
         <mc:AlternateContent>
           <mc:Choice Requires="wps">
             <w:drawing>
-              <wp:anchor distT="0" distB="0" distL="114300" distR="114300" simplePos="0" relativeHeight="251681792" behindDoc="0" locked="0" layoutInCell="1" allowOverlap="1" wp14:anchorId="3917BD46" wp14:editId="7134E652">
+              <wp:anchor distT="0" distB="0" distL="114300" distR="114300" simplePos="0" relativeHeight="251681792" behindDoc="0" locked="0" layoutInCell="1" allowOverlap="1" wp14:anchorId="3917BD46" wp14:editId="658261F5">
                 <wp:simplePos x="0" y="0"/>
                 <wp:positionH relativeFrom="column">
-                  <wp:posOffset>1128712</wp:posOffset>
+                  <wp:posOffset>1130300</wp:posOffset>
                 </wp:positionH>
                 <wp:positionV relativeFrom="paragraph">
-                  <wp:posOffset>5800725</wp:posOffset>
+                  <wp:posOffset>5803900</wp:posOffset>
                 </wp:positionV>
-                <wp:extent cx="1023937" cy="353120"/>
+                <wp:extent cx="2647950" cy="353120"/>
                 <wp:effectExtent l="0" t="0" r="0" b="0"/>
                 <wp:wrapNone/>
                 <wp:docPr id="1542318014" name="Text Box 2"/>
@@ -15651,7 +15677,7 @@
                       <wps:spPr bwMode="auto">
                         <a:xfrm>
                           <a:off x="0" y="0"/>
-                          <a:ext cx="1023937" cy="353120"/>
+                          <a:ext cx="2647950" cy="353120"/>
                         </a:xfrm>
                         <a:prstGeom prst="rect">
                           <a:avLst/>
@@ -15733,7 +15759,7 @@
           </mc:Choice>
           <mc:Fallback>
             <w:pict>
-              <v:shape w14:anchorId="3917BD46" id="_x0000_s1120" type="#_x0000_t202" style="position:absolute;margin-left:88.85pt;margin-top:456.75pt;width:80.6pt;height:27.8pt;z-index:251681792;visibility:visible;mso-wrap-style:square;mso-width-percent:0;mso-wrap-distance-left:9pt;mso-wrap-distance-top:0;mso-wrap-distance-right:9pt;mso-wrap-distance-bottom:0;mso-position-horizontal:absolute;mso-position-horizontal-relative:text;mso-position-vertical:absolute;mso-position-vertical-relative:text;mso-width-percent:0;mso-width-relative:margin;v-text-anchor:top" o:gfxdata="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" filled="f" stroked="f">
+              <v:shape w14:anchorId="3917BD46" id="_x0000_s1120" type="#_x0000_t202" style="position:absolute;margin-left:89pt;margin-top:457pt;width:208.5pt;height:27.8pt;z-index:251681792;visibility:visible;mso-wrap-style:square;mso-width-percent:0;mso-wrap-distance-left:9pt;mso-wrap-distance-top:0;mso-wrap-distance-right:9pt;mso-wrap-distance-bottom:0;mso-position-horizontal:absolute;mso-position-horizontal-relative:text;mso-position-vertical:absolute;mso-position-vertical-relative:text;mso-width-percent:0;mso-width-relative:margin;v-text-anchor:top" o:gfxdata="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" filled="f" stroked="f">
                 <v:textbox>
                   <w:txbxContent>
                     <w:p>
@@ -15802,7 +15828,7 @@
         <mc:AlternateContent>
           <mc:Choice Requires="wps">
             <w:drawing>
-              <wp:anchor distT="0" distB="0" distL="114300" distR="114300" simplePos="0" relativeHeight="251683840" behindDoc="0" locked="0" layoutInCell="1" allowOverlap="1" wp14:anchorId="7C0768F4" wp14:editId="01927F8D">
+              <wp:anchor distT="0" distB="0" distL="114300" distR="114300" simplePos="0" relativeHeight="251683840" behindDoc="0" locked="0" layoutInCell="1" allowOverlap="1" wp14:anchorId="7C0768F4" wp14:editId="19972684">
                 <wp:simplePos x="0" y="0"/>
                 <wp:positionH relativeFrom="column">
                   <wp:posOffset>4066329</wp:posOffset>
@@ -15896,7 +15922,7 @@
           </mc:Choice>
           <mc:Fallback>
             <w:pict>
-              <v:shape w14:anchorId="7C0768F4" id="_x0000_s1121" type="#_x0000_t202" style="position:absolute;margin-left:320.2pt;margin-top:456.75pt;width:62.45pt;height:27.8pt;z-index:251683840;visibility:visible;mso-wrap-style:square;mso-wrap-distance-left:9pt;mso-wrap-distance-top:0;mso-wrap-distance-right:9pt;mso-wrap-distance-bottom:0;mso-position-horizontal:absolute;mso-position-horizontal-relative:text;mso-position-vertical:absolute;mso-position-vertical-relative:text;v-text-anchor:top" o:gfxdata="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" filled="f" stroked="f">
+              <v:shape w14:anchorId="7C0768F4" id="_x0000_s1121" type="#_x0000_t202" style="position:absolute;margin-left:320.2pt;margin-top:456.75pt;width:62.45pt;height:27.8pt;z-index:251683840;visibility:visible;mso-wrap-style:square;mso-wrap-distance-left:9pt;mso-wrap-distance-top:0;mso-wrap-distance-right:9pt;mso-wrap-distance-bottom:0;mso-position-horizontal:absolute;mso-position-horizontal-relative:text;mso-position-vertical:absolute;mso-position-vertical-relative:text;v-text-anchor:top" o:gfxdata="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" filled="f" stroked="f">
                 <v:textbox>
                   <w:txbxContent>
                     <w:p>
@@ -15956,15 +15982,15 @@
         <mc:AlternateContent>
           <mc:Choice Requires="wps">
             <w:drawing>
-              <wp:anchor distT="0" distB="0" distL="114300" distR="114300" simplePos="0" relativeHeight="251685888" behindDoc="0" locked="0" layoutInCell="1" allowOverlap="1" wp14:anchorId="670466C4" wp14:editId="1574D54C">
+              <wp:anchor distT="0" distB="0" distL="114300" distR="114300" simplePos="0" relativeHeight="251685888" behindDoc="0" locked="0" layoutInCell="1" allowOverlap="1" wp14:anchorId="670466C4" wp14:editId="55F4D064">
                 <wp:simplePos x="0" y="0"/>
                 <wp:positionH relativeFrom="column">
-                  <wp:posOffset>1128712</wp:posOffset>
+                  <wp:posOffset>1130300</wp:posOffset>
                 </wp:positionH>
                 <wp:positionV relativeFrom="paragraph">
-                  <wp:posOffset>6053138</wp:posOffset>
+                  <wp:posOffset>6051550</wp:posOffset>
                 </wp:positionV>
-                <wp:extent cx="1023937" cy="353120"/>
+                <wp:extent cx="2647950" cy="353120"/>
                 <wp:effectExtent l="0" t="0" r="0" b="0"/>
                 <wp:wrapNone/>
                 <wp:docPr id="1217721410" name="Text Box 2"/>
@@ -15980,7 +16006,7 @@
                       <wps:spPr bwMode="auto">
                         <a:xfrm>
                           <a:off x="0" y="0"/>
-                          <a:ext cx="1023937" cy="353120"/>
+                          <a:ext cx="2647950" cy="353120"/>
                         </a:xfrm>
                         <a:prstGeom prst="rect">
                           <a:avLst/>
@@ -16062,7 +16088,7 @@
           </mc:Choice>
           <mc:Fallback>
             <w:pict>
-              <v:shape w14:anchorId="670466C4" id="_x0000_s1122" type="#_x0000_t202" style="position:absolute;margin-left:88.85pt;margin-top:476.65pt;width:80.6pt;height:27.8pt;z-index:251685888;visibility:visible;mso-wrap-style:square;mso-width-percent:0;mso-wrap-distance-left:9pt;mso-wrap-distance-top:0;mso-wrap-distance-right:9pt;mso-wrap-distance-bottom:0;mso-position-horizontal:absolute;mso-position-horizontal-relative:text;mso-position-vertical:absolute;mso-position-vertical-relative:text;mso-width-percent:0;mso-width-relative:margin;v-text-anchor:top" o:gfxdata="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" filled="f" stroked="f">
+              <v:shape w14:anchorId="670466C4" id="_x0000_s1122" type="#_x0000_t202" style="position:absolute;margin-left:89pt;margin-top:476.5pt;width:208.5pt;height:27.8pt;z-index:251685888;visibility:visible;mso-wrap-style:square;mso-width-percent:0;mso-wrap-distance-left:9pt;mso-wrap-distance-top:0;mso-wrap-distance-right:9pt;mso-wrap-distance-bottom:0;mso-position-horizontal:absolute;mso-position-horizontal-relative:text;mso-position-vertical:absolute;mso-position-vertical-relative:text;mso-width-percent:0;mso-width-relative:margin;v-text-anchor:top" o:gfxdata="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" filled="f" stroked="f">
                 <v:textbox>
                   <w:txbxContent>
                     <w:p>
@@ -16131,7 +16157,7 @@
         <mc:AlternateContent>
           <mc:Choice Requires="wps">
             <w:drawing>
-              <wp:anchor distT="0" distB="0" distL="114300" distR="114300" simplePos="0" relativeHeight="251687936" behindDoc="0" locked="0" layoutInCell="1" allowOverlap="1" wp14:anchorId="05C26613" wp14:editId="20F75C99">
+              <wp:anchor distT="0" distB="0" distL="114300" distR="114300" simplePos="0" relativeHeight="251687936" behindDoc="0" locked="0" layoutInCell="1" allowOverlap="1" wp14:anchorId="05C26613" wp14:editId="51F2269B">
                 <wp:simplePos x="0" y="0"/>
                 <wp:positionH relativeFrom="column">
                   <wp:posOffset>4066329</wp:posOffset>
@@ -16225,7 +16251,7 @@
           </mc:Choice>
           <mc:Fallback>
             <w:pict>
-              <v:shape w14:anchorId="05C26613" id="_x0000_s1123" type="#_x0000_t202" style="position:absolute;margin-left:320.2pt;margin-top:476.65pt;width:62.45pt;height:27.8pt;z-index:251687936;visibility:visible;mso-wrap-style:square;mso-wrap-distance-left:9pt;mso-wrap-distance-top:0;mso-wrap-distance-right:9pt;mso-wrap-distance-bottom:0;mso-position-horizontal:absolute;mso-position-horizontal-relative:text;mso-position-vertical:absolute;mso-position-vertical-relative:text;v-text-anchor:top" o:gfxdata="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" filled="f" stroked="f">
+              <v:shape w14:anchorId="05C26613" id="_x0000_s1123" type="#_x0000_t202" style="position:absolute;margin-left:320.2pt;margin-top:476.65pt;width:62.45pt;height:27.8pt;z-index:251687936;visibility:visible;mso-wrap-style:square;mso-wrap-distance-left:9pt;mso-wrap-distance-top:0;mso-wrap-distance-right:9pt;mso-wrap-distance-bottom:0;mso-position-horizontal:absolute;mso-position-horizontal-relative:text;mso-position-vertical:absolute;mso-position-vertical-relative:text;v-text-anchor:top" o:gfxdata="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" filled="f" stroked="f">
                 <v:textbox>
                   <w:txbxContent>
                     <w:p>
@@ -16285,15 +16311,15 @@
         <mc:AlternateContent>
           <mc:Choice Requires="wps">
             <w:drawing>
-              <wp:anchor distT="0" distB="0" distL="114300" distR="114300" simplePos="0" relativeHeight="251689984" behindDoc="0" locked="0" layoutInCell="1" allowOverlap="1" wp14:anchorId="282E08DD" wp14:editId="3E2781AD">
+              <wp:anchor distT="0" distB="0" distL="114300" distR="114300" simplePos="0" relativeHeight="251689984" behindDoc="0" locked="0" layoutInCell="1" allowOverlap="1" wp14:anchorId="282E08DD" wp14:editId="2BEB64BF">
                 <wp:simplePos x="0" y="0"/>
                 <wp:positionH relativeFrom="column">
-                  <wp:posOffset>1128712</wp:posOffset>
+                  <wp:posOffset>1130300</wp:posOffset>
                 </wp:positionH>
                 <wp:positionV relativeFrom="paragraph">
                   <wp:posOffset>6286500</wp:posOffset>
                 </wp:positionV>
-                <wp:extent cx="1023937" cy="353120"/>
+                <wp:extent cx="2647950" cy="353120"/>
                 <wp:effectExtent l="0" t="0" r="0" b="0"/>
                 <wp:wrapNone/>
                 <wp:docPr id="1622518967" name="Text Box 2"/>
@@ -16309,7 +16335,7 @@
                       <wps:spPr bwMode="auto">
                         <a:xfrm>
                           <a:off x="0" y="0"/>
-                          <a:ext cx="1023937" cy="353120"/>
+                          <a:ext cx="2647950" cy="353120"/>
                         </a:xfrm>
                         <a:prstGeom prst="rect">
                           <a:avLst/>
@@ -16391,7 +16417,7 @@
           </mc:Choice>
           <mc:Fallback>
             <w:pict>
-              <v:shape w14:anchorId="282E08DD" id="_x0000_s1124" type="#_x0000_t202" style="position:absolute;margin-left:88.85pt;margin-top:495pt;width:80.6pt;height:27.8pt;z-index:251689984;visibility:visible;mso-wrap-style:square;mso-width-percent:0;mso-wrap-distance-left:9pt;mso-wrap-distance-top:0;mso-wrap-distance-right:9pt;mso-wrap-distance-bottom:0;mso-position-horizontal:absolute;mso-position-horizontal-relative:text;mso-position-vertical:absolute;mso-position-vertical-relative:text;mso-width-percent:0;mso-width-relative:margin;v-text-anchor:top" o:gfxdata="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" filled="f" stroked="f">
+              <v:shape w14:anchorId="282E08DD" id="_x0000_s1124" type="#_x0000_t202" style="position:absolute;margin-left:89pt;margin-top:495pt;width:208.5pt;height:27.8pt;z-index:251689984;visibility:visible;mso-wrap-style:square;mso-width-percent:0;mso-wrap-distance-left:9pt;mso-wrap-distance-top:0;mso-wrap-distance-right:9pt;mso-wrap-distance-bottom:0;mso-position-horizontal:absolute;mso-position-horizontal-relative:text;mso-position-vertical:absolute;mso-position-vertical-relative:text;mso-width-percent:0;mso-width-relative:margin;v-text-anchor:top" o:gfxdata="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" filled="f" stroked="f">
                 <v:textbox>
                   <w:txbxContent>
                     <w:p>
@@ -16460,7 +16486,7 @@
         <mc:AlternateContent>
           <mc:Choice Requires="wps">
             <w:drawing>
-              <wp:anchor distT="0" distB="0" distL="114300" distR="114300" simplePos="0" relativeHeight="251692032" behindDoc="0" locked="0" layoutInCell="1" allowOverlap="1" wp14:anchorId="23D66E5F" wp14:editId="6A201B0B">
+              <wp:anchor distT="0" distB="0" distL="114300" distR="114300" simplePos="0" relativeHeight="251692032" behindDoc="0" locked="0" layoutInCell="1" allowOverlap="1" wp14:anchorId="23D66E5F" wp14:editId="4950BD9B">
                 <wp:simplePos x="0" y="0"/>
                 <wp:positionH relativeFrom="column">
                   <wp:posOffset>4066329</wp:posOffset>
@@ -16554,7 +16580,7 @@
           </mc:Choice>
           <mc:Fallback>
             <w:pict>
-              <v:shape w14:anchorId="23D66E5F" id="_x0000_s1125" type="#_x0000_t202" style="position:absolute;margin-left:320.2pt;margin-top:495pt;width:62.45pt;height:27.8pt;z-index:251692032;visibility:visible;mso-wrap-style:square;mso-wrap-distance-left:9pt;mso-wrap-distance-top:0;mso-wrap-distance-right:9pt;mso-wrap-distance-bottom:0;mso-position-horizontal:absolute;mso-position-horizontal-relative:text;mso-position-vertical:absolute;mso-position-vertical-relative:text;v-text-anchor:top" o:gfxdata="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" filled="f" stroked="f">
+              <v:shape w14:anchorId="23D66E5F" id="_x0000_s1125" type="#_x0000_t202" style="position:absolute;margin-left:320.2pt;margin-top:495pt;width:62.45pt;height:27.8pt;z-index:251692032;visibility:visible;mso-wrap-style:square;mso-wrap-distance-left:9pt;mso-wrap-distance-top:0;mso-wrap-distance-right:9pt;mso-wrap-distance-bottom:0;mso-position-horizontal:absolute;mso-position-horizontal-relative:text;mso-position-vertical:absolute;mso-position-vertical-relative:text;v-text-anchor:top" o:gfxdata="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" filled="f" stroked="f">
                 <v:textbox>
                   <w:txbxContent>
                     <w:p>
@@ -16614,15 +16640,15 @@
         <mc:AlternateContent>
           <mc:Choice Requires="wps">
             <w:drawing>
-              <wp:anchor distT="0" distB="0" distL="114300" distR="114300" simplePos="0" relativeHeight="251694080" behindDoc="0" locked="0" layoutInCell="1" allowOverlap="1" wp14:anchorId="3F6794F4" wp14:editId="0CA6A51D">
+              <wp:anchor distT="0" distB="0" distL="114300" distR="114300" simplePos="0" relativeHeight="251694080" behindDoc="0" locked="0" layoutInCell="1" allowOverlap="1" wp14:anchorId="3F6794F4" wp14:editId="0084B3C1">
                 <wp:simplePos x="0" y="0"/>
                 <wp:positionH relativeFrom="column">
-                  <wp:posOffset>1128712</wp:posOffset>
+                  <wp:posOffset>1130300</wp:posOffset>
                 </wp:positionH>
                 <wp:positionV relativeFrom="paragraph">
-                  <wp:posOffset>6538913</wp:posOffset>
+                  <wp:posOffset>6540500</wp:posOffset>
                 </wp:positionV>
-                <wp:extent cx="1023937" cy="353120"/>
+                <wp:extent cx="2647950" cy="353120"/>
                 <wp:effectExtent l="0" t="0" r="0" b="0"/>
                 <wp:wrapNone/>
                 <wp:docPr id="2098468414" name="Text Box 2"/>
@@ -16638,7 +16664,7 @@
                       <wps:spPr bwMode="auto">
                         <a:xfrm>
                           <a:off x="0" y="0"/>
-                          <a:ext cx="1023937" cy="353120"/>
+                          <a:ext cx="2647950" cy="353120"/>
                         </a:xfrm>
                         <a:prstGeom prst="rect">
                           <a:avLst/>
@@ -16720,7 +16746,7 @@
           </mc:Choice>
           <mc:Fallback>
             <w:pict>
-              <v:shape w14:anchorId="3F6794F4" id="_x0000_s1126" type="#_x0000_t202" style="position:absolute;margin-left:88.85pt;margin-top:514.9pt;width:80.6pt;height:27.8pt;z-index:251694080;visibility:visible;mso-wrap-style:square;mso-width-percent:0;mso-wrap-distance-left:9pt;mso-wrap-distance-top:0;mso-wrap-distance-right:9pt;mso-wrap-distance-bottom:0;mso-position-horizontal:absolute;mso-position-horizontal-relative:text;mso-position-vertical:absolute;mso-position-vertical-relative:text;mso-width-percent:0;mso-width-relative:margin;v-text-anchor:top" o:gfxdata="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" filled="f" stroked="f">
+              <v:shape w14:anchorId="3F6794F4" id="_x0000_s1126" type="#_x0000_t202" style="position:absolute;margin-left:89pt;margin-top:515pt;width:208.5pt;height:27.8pt;z-index:251694080;visibility:visible;mso-wrap-style:square;mso-width-percent:0;mso-wrap-distance-left:9pt;mso-wrap-distance-top:0;mso-wrap-distance-right:9pt;mso-wrap-distance-bottom:0;mso-position-horizontal:absolute;mso-position-horizontal-relative:text;mso-position-vertical:absolute;mso-position-vertical-relative:text;mso-width-percent:0;mso-width-relative:margin;v-text-anchor:top" o:gfxdata="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" filled="f" stroked="f">
                 <v:textbox>
                   <w:txbxContent>
                     <w:p>
@@ -16789,7 +16815,7 @@
         <mc:AlternateContent>
           <mc:Choice Requires="wps">
             <w:drawing>
-              <wp:anchor distT="0" distB="0" distL="114300" distR="114300" simplePos="0" relativeHeight="251696128" behindDoc="0" locked="0" layoutInCell="1" allowOverlap="1" wp14:anchorId="263D76CE" wp14:editId="47883EB3">
+              <wp:anchor distT="0" distB="0" distL="114300" distR="114300" simplePos="0" relativeHeight="251696128" behindDoc="0" locked="0" layoutInCell="1" allowOverlap="1" wp14:anchorId="263D76CE" wp14:editId="01A00625">
                 <wp:simplePos x="0" y="0"/>
                 <wp:positionH relativeFrom="column">
                   <wp:posOffset>4066329</wp:posOffset>
@@ -16883,7 +16909,7 @@
           </mc:Choice>
           <mc:Fallback>
             <w:pict>
-              <v:shape w14:anchorId="263D76CE" id="_x0000_s1127" type="#_x0000_t202" style="position:absolute;margin-left:320.2pt;margin-top:514.9pt;width:62.45pt;height:27.8pt;z-index:251696128;visibility:visible;mso-wrap-style:square;mso-wrap-distance-left:9pt;mso-wrap-distance-top:0;mso-wrap-distance-right:9pt;mso-wrap-distance-bottom:0;mso-position-horizontal:absolute;mso-position-horizontal-relative:text;mso-position-vertical:absolute;mso-position-vertical-relative:text;v-text-anchor:top" o:gfxdata="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" filled="f" stroked="f">
+              <v:shape w14:anchorId="263D76CE" id="_x0000_s1127" type="#_x0000_t202" style="position:absolute;margin-left:320.2pt;margin-top:514.9pt;width:62.45pt;height:27.8pt;z-index:251696128;visibility:visible;mso-wrap-style:square;mso-wrap-distance-left:9pt;mso-wrap-distance-top:0;mso-wrap-distance-right:9pt;mso-wrap-distance-bottom:0;mso-position-horizontal:absolute;mso-position-horizontal-relative:text;mso-position-vertical:absolute;mso-position-vertical-relative:text;v-text-anchor:top" o:gfxdata="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" filled="f" stroked="f">
                 <v:textbox>
                   <w:txbxContent>
                     <w:p>
@@ -16943,15 +16969,15 @@
         <mc:AlternateContent>
           <mc:Choice Requires="wps">
             <w:drawing>
-              <wp:anchor distT="0" distB="0" distL="114300" distR="114300" simplePos="0" relativeHeight="251698176" behindDoc="0" locked="0" layoutInCell="1" allowOverlap="1" wp14:anchorId="1CBDAA85" wp14:editId="70190626">
+              <wp:anchor distT="0" distB="0" distL="114300" distR="114300" simplePos="0" relativeHeight="251698176" behindDoc="0" locked="0" layoutInCell="1" allowOverlap="1" wp14:anchorId="1CBDAA85" wp14:editId="7DF0A7B6">
                 <wp:simplePos x="0" y="0"/>
                 <wp:positionH relativeFrom="column">
-                  <wp:posOffset>1128712</wp:posOffset>
+                  <wp:posOffset>1130300</wp:posOffset>
                 </wp:positionH>
                 <wp:positionV relativeFrom="paragraph">
-                  <wp:posOffset>6767513</wp:posOffset>
+                  <wp:posOffset>6769100</wp:posOffset>
                 </wp:positionV>
-                <wp:extent cx="1023937" cy="353120"/>
+                <wp:extent cx="2647950" cy="353120"/>
                 <wp:effectExtent l="0" t="0" r="0" b="0"/>
                 <wp:wrapNone/>
                 <wp:docPr id="491680864" name="Text Box 2"/>
@@ -16967,7 +16993,7 @@
                       <wps:spPr bwMode="auto">
                         <a:xfrm>
                           <a:off x="0" y="0"/>
-                          <a:ext cx="1023937" cy="353120"/>
+                          <a:ext cx="2647950" cy="353120"/>
                         </a:xfrm>
                         <a:prstGeom prst="rect">
                           <a:avLst/>
@@ -17049,7 +17075,7 @@
           </mc:Choice>
           <mc:Fallback>
             <w:pict>
-              <v:shape w14:anchorId="1CBDAA85" id="_x0000_s1128" type="#_x0000_t202" style="position:absolute;margin-left:88.85pt;margin-top:532.9pt;width:80.6pt;height:27.8pt;z-index:251698176;visibility:visible;mso-wrap-style:square;mso-width-percent:0;mso-wrap-distance-left:9pt;mso-wrap-distance-top:0;mso-wrap-distance-right:9pt;mso-wrap-distance-bottom:0;mso-position-horizontal:absolute;mso-position-horizontal-relative:text;mso-position-vertical:absolute;mso-position-vertical-relative:text;mso-width-percent:0;mso-width-relative:margin;v-text-anchor:top" o:gfxdata="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" filled="f" stroked="f">
+              <v:shape w14:anchorId="1CBDAA85" id="_x0000_s1128" type="#_x0000_t202" style="position:absolute;margin-left:89pt;margin-top:533pt;width:208.5pt;height:27.8pt;z-index:251698176;visibility:visible;mso-wrap-style:square;mso-width-percent:0;mso-wrap-distance-left:9pt;mso-wrap-distance-top:0;mso-wrap-distance-right:9pt;mso-wrap-distance-bottom:0;mso-position-horizontal:absolute;mso-position-horizontal-relative:text;mso-position-vertical:absolute;mso-position-vertical-relative:text;mso-width-percent:0;mso-width-relative:margin;v-text-anchor:top" o:gfxdata="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" filled="f" stroked="f">
                 <v:textbox>
                   <w:txbxContent>
                     <w:p>
@@ -17118,7 +17144,7 @@
         <mc:AlternateContent>
           <mc:Choice Requires="wps">
             <w:drawing>
-              <wp:anchor distT="0" distB="0" distL="114300" distR="114300" simplePos="0" relativeHeight="251700224" behindDoc="0" locked="0" layoutInCell="1" allowOverlap="1" wp14:anchorId="688C48EB" wp14:editId="5F2031D6">
+              <wp:anchor distT="0" distB="0" distL="114300" distR="114300" simplePos="0" relativeHeight="251700224" behindDoc="0" locked="0" layoutInCell="1" allowOverlap="1" wp14:anchorId="688C48EB" wp14:editId="0981F748">
                 <wp:simplePos x="0" y="0"/>
                 <wp:positionH relativeFrom="column">
                   <wp:posOffset>4066329</wp:posOffset>
@@ -17212,7 +17238,7 @@
           </mc:Choice>
           <mc:Fallback>
             <w:pict>
-              <v:shape w14:anchorId="688C48EB" id="_x0000_s1129" type="#_x0000_t202" style="position:absolute;margin-left:320.2pt;margin-top:532.9pt;width:62.45pt;height:27.8pt;z-index:251700224;visibility:visible;mso-wrap-style:square;mso-wrap-distance-left:9pt;mso-wrap-distance-top:0;mso-wrap-distance-right:9pt;mso-wrap-distance-bottom:0;mso-position-horizontal:absolute;mso-position-horizontal-relative:text;mso-position-vertical:absolute;mso-position-vertical-relative:text;v-text-anchor:top" o:gfxdata="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" filled="f" stroked="f">
+              <v:shape w14:anchorId="688C48EB" id="_x0000_s1129" type="#_x0000_t202" style="position:absolute;margin-left:320.2pt;margin-top:532.9pt;width:62.45pt;height:27.8pt;z-index:251700224;visibility:visible;mso-wrap-style:square;mso-wrap-distance-left:9pt;mso-wrap-distance-top:0;mso-wrap-distance-right:9pt;mso-wrap-distance-bottom:0;mso-position-horizontal:absolute;mso-position-horizontal-relative:text;mso-position-vertical:absolute;mso-position-vertical-relative:text;v-text-anchor:top" o:gfxdata="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" filled="f" stroked="f">
                 <v:textbox>
                   <w:txbxContent>
                     <w:p>
@@ -17272,15 +17298,15 @@
         <mc:AlternateContent>
           <mc:Choice Requires="wps">
             <w:drawing>
-              <wp:anchor distT="0" distB="0" distL="114300" distR="114300" simplePos="0" relativeHeight="251702272" behindDoc="0" locked="0" layoutInCell="1" allowOverlap="1" wp14:anchorId="0790DDE4" wp14:editId="0B0DDDFD">
+              <wp:anchor distT="0" distB="0" distL="114300" distR="114300" simplePos="0" relativeHeight="251702272" behindDoc="0" locked="0" layoutInCell="1" allowOverlap="1" wp14:anchorId="0790DDE4" wp14:editId="145EDE97">
                 <wp:simplePos x="0" y="0"/>
                 <wp:positionH relativeFrom="column">
-                  <wp:posOffset>1128712</wp:posOffset>
+                  <wp:posOffset>1130300</wp:posOffset>
                 </wp:positionH>
                 <wp:positionV relativeFrom="paragraph">
-                  <wp:posOffset>7024688</wp:posOffset>
+                  <wp:posOffset>7023100</wp:posOffset>
                 </wp:positionV>
-                <wp:extent cx="1023937" cy="353120"/>
+                <wp:extent cx="2647950" cy="353120"/>
                 <wp:effectExtent l="0" t="0" r="0" b="0"/>
                 <wp:wrapNone/>
                 <wp:docPr id="1965875819" name="Text Box 2"/>
@@ -17296,7 +17322,7 @@
                       <wps:spPr bwMode="auto">
                         <a:xfrm>
                           <a:off x="0" y="0"/>
-                          <a:ext cx="1023937" cy="353120"/>
+                          <a:ext cx="2647950" cy="353120"/>
                         </a:xfrm>
                         <a:prstGeom prst="rect">
                           <a:avLst/>
@@ -17378,7 +17404,7 @@
           </mc:Choice>
           <mc:Fallback>
             <w:pict>
-              <v:shape w14:anchorId="0790DDE4" id="_x0000_s1130" type="#_x0000_t202" style="position:absolute;margin-left:88.85pt;margin-top:553.15pt;width:80.6pt;height:27.8pt;z-index:251702272;visibility:visible;mso-wrap-style:square;mso-width-percent:0;mso-wrap-distance-left:9pt;mso-wrap-distance-top:0;mso-wrap-distance-right:9pt;mso-wrap-distance-bottom:0;mso-position-horizontal:absolute;mso-position-horizontal-relative:text;mso-position-vertical:absolute;mso-position-vertical-relative:text;mso-width-percent:0;mso-width-relative:margin;v-text-anchor:top" o:gfxdata="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" filled="f" stroked="f">
+              <v:shape w14:anchorId="0790DDE4" id="_x0000_s1130" type="#_x0000_t202" style="position:absolute;margin-left:89pt;margin-top:553pt;width:208.5pt;height:27.8pt;z-index:251702272;visibility:visible;mso-wrap-style:square;mso-width-percent:0;mso-wrap-distance-left:9pt;mso-wrap-distance-top:0;mso-wrap-distance-right:9pt;mso-wrap-distance-bottom:0;mso-position-horizontal:absolute;mso-position-horizontal-relative:text;mso-position-vertical:absolute;mso-position-vertical-relative:text;mso-width-percent:0;mso-width-relative:margin;v-text-anchor:top" o:gfxdata="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" filled="f" stroked="f">
                 <v:textbox>
                   <w:txbxContent>
                     <w:p>
@@ -17541,7 +17567,7 @@
           </mc:Choice>
           <mc:Fallback>
             <w:pict>
-              <v:shape w14:anchorId="6DFEACD7" id="_x0000_s1131" type="#_x0000_t202" style="position:absolute;margin-left:320.2pt;margin-top:553.15pt;width:62.45pt;height:27.8pt;z-index:251704320;visibility:visible;mso-wrap-style:square;mso-wrap-distance-left:9pt;mso-wrap-distance-top:0;mso-wrap-distance-right:9pt;mso-wrap-distance-bottom:0;mso-position-horizontal:absolute;mso-position-horizontal-relative:text;mso-position-vertical:absolute;mso-position-vertical-relative:text;v-text-anchor:top" o:gfxdata="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" filled="f" stroked="f">
+              <v:shape w14:anchorId="6DFEACD7" id="_x0000_s1131" type="#_x0000_t202" style="position:absolute;margin-left:320.2pt;margin-top:553.15pt;width:62.45pt;height:27.8pt;z-index:251704320;visibility:visible;mso-wrap-style:square;mso-wrap-distance-left:9pt;mso-wrap-distance-top:0;mso-wrap-distance-right:9pt;mso-wrap-distance-bottom:0;mso-position-horizontal:absolute;mso-position-horizontal-relative:text;mso-position-vertical:absolute;mso-position-vertical-relative:text;v-text-anchor:top" o:gfxdata="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" filled="f" stroked="f">
                 <v:textbox>
                   <w:txbxContent>
                     <w:p>
@@ -17721,7 +17747,7 @@
           </mc:Choice>
           <mc:Fallback>
             <w:pict>
-              <v:shape w14:anchorId="278457BC" id="_x0000_s1132" type="#_x0000_t202" style="position:absolute;margin-left:501.65pt;margin-top:775.85pt;width:106.5pt;height:27.75pt;z-index:251714560;visibility:visible;mso-wrap-style:square;mso-width-percent:0;mso-wrap-distance-left:9pt;mso-wrap-distance-top:0;mso-wrap-distance-right:9pt;mso-wrap-distance-bottom:0;mso-position-horizontal:absolute;mso-position-horizontal-relative:text;mso-position-vertical:absolute;mso-position-vertical-relative:text;mso-width-percent:0;mso-width-relative:margin;v-text-anchor:top" o:gfxdata="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" filled="f" stroked="f">
+              <v:shape w14:anchorId="278457BC" id="_x0000_s1132" type="#_x0000_t202" style="position:absolute;margin-left:501.65pt;margin-top:775.85pt;width:106.5pt;height:27.75pt;z-index:251714560;visibility:visible;mso-wrap-style:square;mso-width-percent:0;mso-wrap-distance-left:9pt;mso-wrap-distance-top:0;mso-wrap-distance-right:9pt;mso-wrap-distance-bottom:0;mso-position-horizontal:absolute;mso-position-horizontal-relative:text;mso-position-vertical:absolute;mso-position-vertical-relative:text;mso-width-percent:0;mso-width-relative:margin;v-text-anchor:top" o:gfxdata="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" filled="f" stroked="f">
                 <v:textbox>
                   <w:txbxContent>
                     <w:p>
@@ -17914,7 +17940,7 @@
           </mc:Choice>
           <mc:Fallback>
             <w:pict>
-              <v:shape w14:anchorId="336B141D" id="_x0000_s1133" type="#_x0000_t202" style="position:absolute;margin-left:230.6pt;margin-top:773.95pt;width:132.75pt;height:27.75pt;z-index:251710464;visibility:visible;mso-wrap-style:square;mso-width-percent:0;mso-wrap-distance-left:9pt;mso-wrap-distance-top:0;mso-wrap-distance-right:9pt;mso-wrap-distance-bottom:0;mso-position-horizontal:absolute;mso-position-horizontal-relative:text;mso-position-vertical:absolute;mso-position-vertical-relative:text;mso-width-percent:0;mso-width-relative:margin;v-text-anchor:top" o:gfxdata="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" filled="f" stroked="f">
+              <v:shape w14:anchorId="336B141D" id="_x0000_s1133" type="#_x0000_t202" style="position:absolute;margin-left:230.6pt;margin-top:773.95pt;width:132.75pt;height:27.75pt;z-index:251710464;visibility:visible;mso-wrap-style:square;mso-width-percent:0;mso-wrap-distance-left:9pt;mso-wrap-distance-top:0;mso-wrap-distance-right:9pt;mso-wrap-distance-bottom:0;mso-position-horizontal:absolute;mso-position-horizontal-relative:text;mso-position-vertical:absolute;mso-position-vertical-relative:text;mso-width-percent:0;mso-width-relative:margin;v-text-anchor:top" o:gfxdata="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" filled="f" stroked="f">
                 <v:textbox>
                   <w:txbxContent>
                     <w:p>
@@ -18097,7 +18123,7 @@
           </mc:Choice>
           <mc:Fallback>
             <w:pict>
-              <v:shape w14:anchorId="542A6EBD" id="_x0000_s1134" type="#_x0000_t202" style="position:absolute;margin-left:501.65pt;margin-top:748.75pt;width:106.5pt;height:27.75pt;z-index:251712512;visibility:visible;mso-wrap-style:square;mso-width-percent:0;mso-wrap-distance-left:9pt;mso-wrap-distance-top:0;mso-wrap-distance-right:9pt;mso-wrap-distance-bottom:0;mso-position-horizontal:absolute;mso-position-horizontal-relative:text;mso-position-vertical:absolute;mso-position-vertical-relative:text;mso-width-percent:0;mso-width-relative:margin;v-text-anchor:top" o:gfxdata="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" filled="f" stroked="f">
+              <v:shape w14:anchorId="542A6EBD" id="_x0000_s1134" type="#_x0000_t202" style="position:absolute;margin-left:501.65pt;margin-top:748.75pt;width:106.5pt;height:27.75pt;z-index:251712512;visibility:visible;mso-wrap-style:square;mso-width-percent:0;mso-wrap-distance-left:9pt;mso-wrap-distance-top:0;mso-wrap-distance-right:9pt;mso-wrap-distance-bottom:0;mso-position-horizontal:absolute;mso-position-horizontal-relative:text;mso-position-vertical:absolute;mso-position-vertical-relative:text;mso-width-percent:0;mso-width-relative:margin;v-text-anchor:top" o:gfxdata="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" filled="f" stroked="f">
                 <v:textbox>
                   <w:txbxContent>
                     <w:p>
@@ -18279,7 +18305,7 @@
           </mc:Choice>
           <mc:Fallback>
             <w:pict>
-              <v:shape w14:anchorId="12793F46" id="_x0000_s1135" type="#_x0000_t202" style="position:absolute;margin-left:230.9pt;margin-top:747.15pt;width:168.75pt;height:27.75pt;z-index:251708416;visibility:visible;mso-wrap-style:square;mso-width-percent:0;mso-wrap-distance-left:9pt;mso-wrap-distance-top:0;mso-wrap-distance-right:9pt;mso-wrap-distance-bottom:0;mso-position-horizontal:absolute;mso-position-horizontal-relative:text;mso-position-vertical:absolute;mso-position-vertical-relative:text;mso-width-percent:0;mso-width-relative:margin;v-text-anchor:top" o:gfxdata="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" filled="f" stroked="f">
+              <v:shape w14:anchorId="12793F46" id="_x0000_s1135" type="#_x0000_t202" style="position:absolute;margin-left:230.9pt;margin-top:747.15pt;width:168.75pt;height:27.75pt;z-index:251708416;visibility:visible;mso-wrap-style:square;mso-width-percent:0;mso-wrap-distance-left:9pt;mso-wrap-distance-top:0;mso-wrap-distance-right:9pt;mso-wrap-distance-bottom:0;mso-position-horizontal:absolute;mso-position-horizontal-relative:text;mso-position-vertical:absolute;mso-position-vertical-relative:text;mso-width-percent:0;mso-width-relative:margin;v-text-anchor:top" o:gfxdata="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" filled="f" stroked="f">
                 <v:textbox>
                   <w:txbxContent>
                     <w:p>
@@ -18429,7 +18455,7 @@
           </mc:Choice>
           <mc:Fallback>
             <w:pict>
-              <v:shape w14:anchorId="6D2BD204" id="_x0000_s1136" type="#_x0000_t202" style="position:absolute;margin-left:70.5pt;margin-top:592.4pt;width:492pt;height:27.75pt;z-index:251706368;visibility:visible;mso-wrap-style:square;mso-width-percent:0;mso-wrap-distance-left:9pt;mso-wrap-distance-top:0;mso-wrap-distance-right:9pt;mso-wrap-distance-bottom:0;mso-position-horizontal:absolute;mso-position-horizontal-relative:text;mso-position-vertical:absolute;mso-position-vertical-relative:text;mso-width-percent:0;mso-width-relative:margin;v-text-anchor:top" o:gfxdata="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" filled="f" stroked="f">
+              <v:shape w14:anchorId="6D2BD204" id="_x0000_s1136" type="#_x0000_t202" style="position:absolute;margin-left:70.5pt;margin-top:592.4pt;width:492pt;height:27.75pt;z-index:251706368;visibility:visible;mso-wrap-style:square;mso-width-percent:0;mso-wrap-distance-left:9pt;mso-wrap-distance-top:0;mso-wrap-distance-right:9pt;mso-wrap-distance-bottom:0;mso-position-horizontal:absolute;mso-position-horizontal-relative:text;mso-position-vertical:absolute;mso-position-vertical-relative:text;mso-width-percent:0;mso-width-relative:margin;v-text-anchor:top" o:gfxdata="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" filled="f" stroked="f">
                 <v:textbox>
                   <w:txbxContent>
                     <w:p>
@@ -18462,13 +18488,12 @@
           </mc:Fallback>
         </mc:AlternateContent>
       </w:r>
-      <w:bookmarkStart w:id="0" w:name="_GoBack"/>
       <w:r>
         <w:rPr>
           <w:noProof/>
         </w:rPr>
         <w:drawing>
-          <wp:inline distT="0" distB="0" distL="0" distR="0" wp14:anchorId="39969844" wp14:editId="38A9198D">
+          <wp:inline distT="0" distB="0" distL="0" distR="0" wp14:anchorId="39969844" wp14:editId="3645D66E">
             <wp:extent cx="7556500" cy="10693400"/>
             <wp:effectExtent l="0" t="0" r="6350" b="0"/>
             <wp:docPr id="2" name="Picture 2" descr="C:\Users\siripon.sri\AppData\Local\Temp\Rar$DRa4636.43458\siripon.sri_251215-135928-fa07_page-0002.jpg"/>
@@ -18516,7 +18541,6 @@
           </wp:inline>
         </w:drawing>
       </w:r>
-      <w:bookmarkEnd w:id="0"/>
     </w:p>
     <w:sectPr>
       <w:pgSz w:w="11906" w:h="16838"/>
@@ -18529,7 +18553,7 @@
 </file>
 
 <file path=word/styles.xml><?xml version="1.0" encoding="utf-8"?>
-<w:styles xmlns:mc="http://schemas.openxmlformats.org/markup-compatibility/2006" xmlns:r="http://schemas.openxmlformats.org/officeDocument/2006/relationships" xmlns:w="http://schemas.openxmlformats.org/wordprocessingml/2006/main" xmlns:w14="http://schemas.microsoft.com/office/word/2010/wordml" xmlns:w15="http://schemas.microsoft.com/office/word/2012/wordml" mc:Ignorable="w14 w15">
+<w:styles xmlns:mc="http://schemas.openxmlformats.org/markup-compatibility/2006" xmlns:r="http://schemas.openxmlformats.org/officeDocument/2006/relationships" xmlns:w="http://schemas.openxmlformats.org/wordprocessingml/2006/main" xmlns:w14="http://schemas.microsoft.com/office/word/2010/wordml" xmlns:w15="http://schemas.microsoft.com/office/word/2012/wordml" xmlns:w16cex="http://schemas.microsoft.com/office/word/2018/wordml/cex" xmlns:w16cid="http://schemas.microsoft.com/office/word/2016/wordml/cid" xmlns:w16="http://schemas.microsoft.com/office/word/2018/wordml" xmlns:w16sdtdh="http://schemas.microsoft.com/office/word/2020/wordml/sdtdatahash" xmlns:w16se="http://schemas.microsoft.com/office/word/2015/wordml/symex" mc:Ignorable="w14 w15 w16se w16cid w16 w16cex w16sdtdh">
   <w:docDefaults>
     <w:rPrDefault>
       <w:rPr>
@@ -18545,7 +18569,7 @@
       </w:pPr>
     </w:pPrDefault>
   </w:docDefaults>
-  <w:latentStyles w:defLockedState="0" w:defUIPriority="99" w:defSemiHidden="0" w:defUnhideWhenUsed="0" w:defQFormat="0" w:count="371">
+  <w:latentStyles w:defLockedState="0" w:defUIPriority="99" w:defSemiHidden="0" w:defUnhideWhenUsed="0" w:defQFormat="0" w:count="376">
     <w:lsdException w:name="Normal" w:uiPriority="0" w:qFormat="1"/>
     <w:lsdException w:name="heading 1" w:uiPriority="9" w:qFormat="1"/>
     <w:lsdException w:name="heading 2" w:semiHidden="1" w:uiPriority="9" w:unhideWhenUsed="1" w:qFormat="1"/>
@@ -18651,7 +18675,6 @@
     <w:lsdException w:name="HTML Sample" w:semiHidden="1" w:unhideWhenUsed="1"/>
     <w:lsdException w:name="HTML Typewriter" w:semiHidden="1" w:unhideWhenUsed="1"/>
     <w:lsdException w:name="HTML Variable" w:semiHidden="1" w:unhideWhenUsed="1"/>
-    <w:lsdException w:name="Normal Table" w:semiHidden="1" w:unhideWhenUsed="1"/>
     <w:lsdException w:name="annotation subject" w:semiHidden="1" w:unhideWhenUsed="1"/>
     <w:lsdException w:name="No List" w:semiHidden="1" w:unhideWhenUsed="1"/>
     <w:lsdException w:name="Outline List 1" w:semiHidden="1" w:unhideWhenUsed="1"/>
@@ -18694,11 +18717,8 @@
     <w:lsdException w:name="Table Contemporary" w:semiHidden="1" w:unhideWhenUsed="1"/>
     <w:lsdException w:name="Table Elegant" w:semiHidden="1" w:unhideWhenUsed="1"/>
     <w:lsdException w:name="Table Professional" w:semiHidden="1" w:unhideWhenUsed="1"/>
-    <w:lsdException w:name="Table Subtle 1" w:semiHidden="1" w:unhideWhenUsed="1"/>
     <w:lsdException w:name="Table Subtle 2" w:semiHidden="1" w:unhideWhenUsed="1"/>
     <w:lsdException w:name="Table Web 1" w:semiHidden="1" w:unhideWhenUsed="1"/>
-    <w:lsdException w:name="Table Web 2" w:semiHidden="1" w:unhideWhenUsed="1"/>
-    <w:lsdException w:name="Table Web 3" w:semiHidden="1" w:unhideWhenUsed="1"/>
     <w:lsdException w:name="Balloon Text" w:semiHidden="1" w:unhideWhenUsed="1"/>
     <w:lsdException w:name="Table Grid" w:uiPriority="39"/>
     <w:lsdException w:name="Table Theme" w:semiHidden="1" w:unhideWhenUsed="1"/>
@@ -18917,6 +18937,11 @@
     <w:lsdException w:name="List Table 5 Dark Accent 6" w:uiPriority="50"/>
     <w:lsdException w:name="List Table 6 Colorful Accent 6" w:uiPriority="51"/>
     <w:lsdException w:name="List Table 7 Colorful Accent 6" w:uiPriority="52"/>
+    <w:lsdException w:name="Mention" w:semiHidden="1" w:unhideWhenUsed="1"/>
+    <w:lsdException w:name="Smart Hyperlink" w:semiHidden="1" w:unhideWhenUsed="1"/>
+    <w:lsdException w:name="Hashtag" w:semiHidden="1" w:unhideWhenUsed="1"/>
+    <w:lsdException w:name="Unresolved Mention" w:semiHidden="1" w:unhideWhenUsed="1"/>
+    <w:lsdException w:name="Smart Link" w:semiHidden="1" w:unhideWhenUsed="1"/>
   </w:latentStyles>
   <w:style w:type="paragraph" w:default="1" w:styleId="Normal">
     <w:name w:val="Normal"/>

</xml_diff>